<commit_message>
feat: align W1-W18 assessment artifacts with v6
</commit_message>
<xml_diff>
--- a/worksheets/W1.docx
+++ b/worksheets/W1.docx
@@ -6,6 +6,7 @@
       <w:pPr>
         <w:keepNext/>
         <w:keepLines w:val="0"/>
+        <w:pageBreakBefore w:val="0"/>
         <w:spacing w:before="0" w:after="60" w:line="293" w:lineRule="auto"/>
       </w:pPr>
       <w:r>
@@ -154,7 +155,7 @@
           <w:color w:val="1A2340"/>
           <w:sz w:val="30"/>
         </w:rPr>
-        <w:t>評分與使用方式</w:t>
+        <w:t>作業、評量與使用方式</w:t>
       </w:r>
     </w:p>
     <w:p>
@@ -171,47 +172,7 @@
           <w:color w:val="5B6573"/>
           <w:sz w:val="22"/>
         </w:rPr>
-        <w:t xml:space="preserve">平時證據 </w:t>
-      </w:r>
-      <w:r>
-        <w:rPr>
-          <w:rFonts w:ascii="JetBrains Mono" w:hAnsi="JetBrains Mono" w:eastAsia="Heiti TC"/>
-          <w:b/>
-          <w:i w:val="0"/>
-          <w:color w:val="1D4ED8"/>
-          <w:sz w:val="22"/>
-        </w:rPr>
-        <w:t>40</w:t>
-      </w:r>
-      <w:r>
-        <w:rPr>
-          <w:rFonts w:ascii="Heiti TC" w:hAnsi="Heiti TC" w:eastAsia="Heiti TC"/>
-          <w:b w:val="0"/>
-          <w:i w:val="0"/>
-          <w:color w:val="5B6573"/>
-          <w:sz w:val="22"/>
-        </w:rPr>
-        <w:t xml:space="preserve">　｜　W5 重寫 </w:t>
-      </w:r>
-      <w:r>
-        <w:rPr>
-          <w:rFonts w:ascii="JetBrains Mono" w:hAnsi="JetBrains Mono" w:eastAsia="Heiti TC"/>
-          <w:b/>
-          <w:i w:val="0"/>
-          <w:color w:val="1D4ED8"/>
-          <w:sz w:val="22"/>
-        </w:rPr>
-        <w:t>15</w:t>
-      </w:r>
-      <w:r>
-        <w:rPr>
-          <w:rFonts w:ascii="Heiti TC" w:hAnsi="Heiti TC" w:eastAsia="Heiti TC"/>
-          <w:b w:val="0"/>
-          <w:i w:val="0"/>
-          <w:color w:val="5B6573"/>
-          <w:sz w:val="22"/>
-        </w:rPr>
-        <w:t xml:space="preserve">　｜　W12–16 專題 </w:t>
+        <w:t xml:space="preserve">歷程責任 </w:t>
       </w:r>
       <w:r>
         <w:rPr>
@@ -231,7 +192,7 @@
           <w:color w:val="5B6573"/>
           <w:sz w:val="22"/>
         </w:rPr>
-        <w:t xml:space="preserve">　｜　W17 實作 </w:t>
+        <w:t xml:space="preserve">　｜　工具支持表現 </w:t>
       </w:r>
       <w:r>
         <w:rPr>
@@ -241,7 +202,27 @@
           <w:color w:val="1D4ED8"/>
           <w:sz w:val="22"/>
         </w:rPr>
-        <w:t>25</w:t>
+        <w:t>30</w:t>
+      </w:r>
+      <w:r>
+        <w:rPr>
+          <w:rFonts w:ascii="Heiti TC" w:hAnsi="Heiti TC" w:eastAsia="Heiti TC"/>
+          <w:b w:val="0"/>
+          <w:i w:val="0"/>
+          <w:color w:val="5B6573"/>
+          <w:sz w:val="22"/>
+        </w:rPr>
+        <w:t xml:space="preserve">　｜　個人內化 </w:t>
+      </w:r>
+      <w:r>
+        <w:rPr>
+          <w:rFonts w:ascii="JetBrains Mono" w:hAnsi="JetBrains Mono" w:eastAsia="Heiti TC"/>
+          <w:b/>
+          <w:i w:val="0"/>
+          <w:color w:val="1D4ED8"/>
+          <w:sz w:val="22"/>
+        </w:rPr>
+        <w:t>50</w:t>
       </w:r>
     </w:p>
     <w:tbl>
@@ -288,7 +269,7 @@
                 <w:color w:val="1D4ED8"/>
                 <w:sz w:val="22"/>
               </w:rPr>
-              <w:t>平時怎麼拿</w:t>
+              <w:t>歷程 20</w:t>
             </w:r>
             <w:r>
               <w:rPr>
@@ -298,7 +279,7 @@
                 <w:color w:val="1A2340"/>
                 <w:sz w:val="22"/>
               </w:rPr>
-              <w:t xml:space="preserve">　13 個一般週各 3 點＝完成＋證據＋判斷，學期末等比例換算 40 分；總分 60 分及格。</w:t>
+              <w:t xml:space="preserve">　四個 Gate 各 5；一般週 0 分；期限內補正仍滿分。</w:t>
             </w:r>
           </w:p>
           <w:p>
@@ -315,7 +296,7 @@
                 <w:color w:val="1D4ED8"/>
                 <w:sz w:val="22"/>
               </w:rPr>
-              <w:t>三個節點</w:t>
+              <w:t>工具表現 30</w:t>
             </w:r>
             <w:r>
               <w:rPr>
@@ -325,7 +306,7 @@
                 <w:color w:val="1A2340"/>
                 <w:sz w:val="22"/>
               </w:rPr>
-              <w:t xml:space="preserve">　W5 15、W12–W16 專題 20、W17 實作 25；W18 不收件、不計分。節點用四項各 0–2 分，缺哪項補哪項，不整學期歸零。</w:t>
+              <w:t xml:space="preserve">　W5 個人重寫、W10 來源查核、W16 團隊成果，各 10。</w:t>
             </w:r>
           </w:p>
           <w:p>
@@ -342,7 +323,7 @@
                 <w:color w:val="1D4ED8"/>
                 <w:sz w:val="22"/>
               </w:rPr>
-              <w:t>兩種欄位</w:t>
+              <w:t>個人內化 50</w:t>
             </w:r>
             <w:r>
               <w:rPr>
@@ -352,7 +333,7 @@
                 <w:color w:val="1A2340"/>
                 <w:sz w:val="22"/>
               </w:rPr>
-              <w:t xml:space="preserve">　課堂必寫：老師讀、計分；自留札記：老師不讀、不計分，可留白、遮住或摺起。</w:t>
+              <w:t xml:space="preserve">　W9 10＋W16 個人 15＋W17 25；W1、W18 為 0。</w:t>
             </w:r>
           </w:p>
         </w:tc>
@@ -362,7 +343,7 @@
       <w:pPr>
         <w:keepNext/>
         <w:keepLines w:val="0"/>
-        <w:spacing w:before="140" w:after="100" w:line="293" w:lineRule="auto"/>
+        <w:spacing w:before="100" w:after="100" w:line="293" w:lineRule="auto"/>
       </w:pPr>
       <w:r>
         <w:rPr>
@@ -463,7 +444,7 @@
       <w:pPr>
         <w:keepNext/>
         <w:keepLines w:val="0"/>
-        <w:spacing w:before="140" w:after="100" w:line="293" w:lineRule="auto"/>
+        <w:spacing w:before="100" w:after="100" w:line="293" w:lineRule="auto"/>
       </w:pPr>
       <w:r>
         <w:rPr>
@@ -510,7 +491,7 @@
           <w:color w:val="5B6573"/>
           <w:sz w:val="22"/>
         </w:rPr>
-        <w:t>投票前先押把握％（50＝丟銅板／90＝敢賭一塊雞排），揭曉後回填 ✓／✗。不評分；W17 你會回來看這些數字。</w:t>
+        <w:t>投票前先押把握％（50＝像丟硬幣／90＝高度確定），揭曉後回填 ✓／✗。不評分；W17 你會回來看這些數字。</w:t>
       </w:r>
     </w:p>
     <w:tbl>
@@ -1386,36 +1367,6 @@
           </w:tcPr>
           <w:p>
             <w:pPr>
-              <w:spacing w:before="0" w:after="0" w:line="240" w:lineRule="auto"/>
-            </w:pPr>
-            <w:r>
-              <w:t xml:space="preserve"> </w:t>
-            </w:r>
-          </w:p>
-        </w:tc>
-      </w:tr>
-      <w:tr>
-        <w:trPr>
-          <w:trHeight w:val="510" w:hRule="atLeast"/>
-        </w:trPr>
-        <w:tc>
-          <w:tcPr>
-            <w:tcW w:type="dxa" w:w="9865"/>
-            <w:tcMar>
-              <w:top w:w="0" w:type="dxa"/>
-              <w:start w:w="0" w:type="dxa"/>
-              <w:bottom w:w="0" w:type="dxa"/>
-              <w:end w:w="0" w:type="dxa"/>
-            </w:tcMar>
-            <w:tcBorders>
-              <w:top w:val="nil"/>
-              <w:bottom w:val="single" w:sz="5" w:space="0" w:color="CBD5E1"/>
-              <w:start w:val="nil"/>
-              <w:end w:val="nil"/>
-            </w:tcBorders>
-          </w:tcPr>
-          <w:p>
-            <w:pPr>
               <w:spacing w:before="0" w:after="40" w:line="240" w:lineRule="auto"/>
             </w:pPr>
             <w:r>
@@ -1427,43 +1378,9 @@
     </w:tbl>
     <w:p>
       <w:pPr>
-        <w:keepNext w:val="0"/>
-        <w:keepLines w:val="0"/>
-        <w:spacing w:before="60" w:after="0" w:line="293" w:lineRule="auto"/>
-      </w:pPr>
-      <w:r>
-        <w:rPr>
-          <w:rFonts w:ascii="Heiti TC" w:hAnsi="Heiti TC" w:eastAsia="Heiti TC"/>
-          <w:b/>
-          <w:i w:val="0"/>
-          <w:color w:val="1D4ED8"/>
-          <w:sz w:val="22"/>
-        </w:rPr>
-        <w:t>這週的新版「讀懂」：</w:t>
-      </w:r>
-      <w:r>
-        <w:rPr>
-          <w:rFonts w:ascii="Heiti TC" w:hAnsi="Heiti TC" w:eastAsia="Heiti TC"/>
-          <w:b w:val="0"/>
-          <w:i w:val="0"/>
-          <w:color w:val="1A2340"/>
-          <w:sz w:val="22"/>
-        </w:rPr>
-        <w:t>讀文字，也追問「它怎麼來？根據什麼？誰願意負責？」</w:t>
-      </w:r>
-    </w:p>
-    <w:p>
-      <w:pPr>
-        <w:spacing w:after="0"/>
-      </w:pPr>
-      <w:r>
-        <w:br w:type="page"/>
-      </w:r>
-    </w:p>
-    <w:p>
-      <w:pPr>
         <w:keepNext/>
         <w:keepLines w:val="0"/>
+        <w:pageBreakBefore/>
         <w:spacing w:before="0" w:after="60" w:line="293" w:lineRule="auto"/>
       </w:pPr>
       <w:r>
@@ -1508,7 +1425,7 @@
           <w:color w:val="5B6573"/>
           <w:sz w:val="22"/>
         </w:rPr>
-        <w:t>先看 AI 能做什麼，再決定人必須怎麼判斷與驗收。</w:t>
+        <w:t>先看 AI 能做什麼，再決定哪些能力仍值得由自己理解、選擇與承擔。</w:t>
       </w:r>
     </w:p>
     <w:p>
@@ -2237,16 +2154,9 @@
     </w:p>
     <w:p>
       <w:pPr>
-        <w:spacing w:after="0"/>
-      </w:pPr>
-      <w:r>
-        <w:br w:type="page"/>
-      </w:r>
-    </w:p>
-    <w:p>
-      <w:pPr>
         <w:keepNext/>
         <w:keepLines w:val="0"/>
+        <w:pageBreakBefore/>
         <w:spacing w:before="0" w:after="60" w:line="293" w:lineRule="auto"/>
       </w:pPr>
       <w:r>
@@ -2365,7 +2275,7 @@
           <w:color w:val="1A2340"/>
           <w:sz w:val="22"/>
         </w:rPr>
-        <w:t>AI 可以幫你，但不能替你判斷、替你負責。</w:t>
+        <w:t>AI 可以提出判斷與理由；你要理解、選擇、查核，並為最後交付負責。</w:t>
       </w:r>
     </w:p>
     <w:p>
@@ -3013,16 +2923,9 @@
     </w:tbl>
     <w:p>
       <w:pPr>
-        <w:spacing w:after="0"/>
-      </w:pPr>
-      <w:r>
-        <w:br w:type="page"/>
-      </w:r>
-    </w:p>
-    <w:p>
-      <w:pPr>
         <w:keepNext/>
         <w:keepLines w:val="0"/>
+        <w:pageBreakBefore/>
         <w:spacing w:before="0" w:after="60" w:line="293" w:lineRule="auto"/>
       </w:pPr>
       <w:r>
@@ -3508,7 +3411,7 @@
           <w:color w:val="1A2340"/>
           <w:sz w:val="30"/>
         </w:rPr>
-        <w:t>入場作業｜下週上課前</w:t>
+        <w:t>W2 入場練習｜下週上課前</w:t>
       </w:r>
     </w:p>
     <w:p>
@@ -3764,7 +3667,7 @@
           <w:color w:val="5B6573"/>
           <w:sz w:val="22"/>
         </w:rPr>
-        <w:t>老師會閱讀這段；是否提供下週匿名分享，由你決定。</w:t>
+        <w:t>這段不另計分；老師會閱讀並回覆。是否提供下週匿名分享，由你決定。</w:t>
       </w:r>
     </w:p>
     <w:p>

</xml_diff>

<commit_message>
feat: activate v7 assessment materials
</commit_message>
<xml_diff>
--- a/worksheets/W1.docx
+++ b/worksheets/W1.docx
@@ -172,7 +172,7 @@
           <w:color w:val="5B6573"/>
           <w:sz w:val="22"/>
         </w:rPr>
-        <w:t xml:space="preserve">歷程責任 </w:t>
+        <w:t xml:space="preserve">七項正式取證 </w:t>
       </w:r>
       <w:r>
         <w:rPr>
@@ -182,7 +182,7 @@
           <w:color w:val="1D4ED8"/>
           <w:sz w:val="22"/>
         </w:rPr>
-        <w:t>20</w:t>
+        <w:t>100</w:t>
       </w:r>
       <w:r>
         <w:rPr>
@@ -192,7 +192,7 @@
           <w:color w:val="5B6573"/>
           <w:sz w:val="22"/>
         </w:rPr>
-        <w:t xml:space="preserve">　｜　工具支持表現 </w:t>
+        <w:t xml:space="preserve">　｜　Gate 1–4 </w:t>
       </w:r>
       <w:r>
         <w:rPr>
@@ -202,7 +202,7 @@
           <w:color w:val="1D4ED8"/>
           <w:sz w:val="22"/>
         </w:rPr>
-        <w:t>30</w:t>
+        <w:t>0</w:t>
       </w:r>
       <w:r>
         <w:rPr>
@@ -212,7 +212,7 @@
           <w:color w:val="5B6573"/>
           <w:sz w:val="22"/>
         </w:rPr>
-        <w:t xml:space="preserve">　｜　個人內化 </w:t>
+        <w:t xml:space="preserve">　｜　及格／核心 </w:t>
       </w:r>
       <w:r>
         <w:rPr>
@@ -222,7 +222,7 @@
           <w:color w:val="1D4ED8"/>
           <w:sz w:val="22"/>
         </w:rPr>
-        <w:t>50</w:t>
+        <w:t>60／25</w:t>
       </w:r>
     </w:p>
     <w:tbl>
@@ -269,7 +269,7 @@
                 <w:color w:val="1D4ED8"/>
                 <w:sz w:val="22"/>
               </w:rPr>
-              <w:t>歷程 20</w:t>
+              <w:t>正式取證 100</w:t>
             </w:r>
             <w:r>
               <w:rPr>
@@ -279,7 +279,7 @@
                 <w:color w:val="1A2340"/>
                 <w:sz w:val="22"/>
               </w:rPr>
-              <w:t xml:space="preserve">　四個 Gate 各 5；一般週 0 分；期限內補正仍滿分。</w:t>
+              <w:t xml:space="preserve">　W5 15、W9 10、W10 15、W11–W12 10、W16 團隊 10、W16 個人 15、W17 25。</w:t>
             </w:r>
           </w:p>
           <w:p>
@@ -296,7 +296,7 @@
                 <w:color w:val="1D4ED8"/>
                 <w:sz w:val="22"/>
               </w:rPr>
-              <w:t>工具表現 30</w:t>
+              <w:t>Gate 0</w:t>
             </w:r>
             <w:r>
               <w:rPr>
@@ -306,7 +306,7 @@
                 <w:color w:val="1A2340"/>
                 <w:sz w:val="22"/>
               </w:rPr>
-              <w:t xml:space="preserve">　W5 個人重寫、W10 來源查核、W16 團隊成果，各 10。</w:t>
+              <w:t xml:space="preserve">　只判未檢核／通過／需修正；一般週練習不逐份計分。</w:t>
             </w:r>
           </w:p>
           <w:p>
@@ -323,7 +323,7 @@
                 <w:color w:val="1D4ED8"/>
                 <w:sz w:val="22"/>
               </w:rPr>
-              <w:t>個人內化 50</w:t>
+              <w:t>兩種結果</w:t>
             </w:r>
             <w:r>
               <w:rPr>
@@ -333,7 +333,7 @@
                 <w:color w:val="1A2340"/>
                 <w:sz w:val="22"/>
               </w:rPr>
-              <w:t xml:space="preserve">　W9 10＋W16 個人 15＋W17 25；W1、W18 為 0。</w:t>
+              <w:t xml:space="preserve">　總分 60／100 為課程及格；個人受控 25／50 為分開呈現的核心認證。</w:t>
             </w:r>
           </w:p>
         </w:tc>

</xml_diff>

<commit_message>
feat: clarify W1 reading, assessment, and privacy
</commit_message>
<xml_diff>
--- a/worksheets/W1.docx
+++ b/worksheets/W1.docx
@@ -11,13 +11,13 @@
       </w:pPr>
       <w:r>
         <w:rPr>
-          <w:rFonts w:ascii="JetBrains Mono" w:hAnsi="JetBrains Mono" w:eastAsia="Heiti TC"/>
+          <w:rFonts w:ascii="JetBrains Mono" w:hAnsi="JetBrains Mono" w:eastAsia="Arial Unicode MS"/>
           <w:b/>
           <w:i w:val="0"/>
           <w:color w:val="1D4ED8"/>
           <w:sz w:val="22"/>
         </w:rPr>
-        <w:t>W1 / 01</w:t>
+        <w:t>第 1 週 / 第 1 頁</w:t>
       </w:r>
     </w:p>
     <w:p>
@@ -28,13 +28,13 @@
       </w:pPr>
       <w:r>
         <w:rPr>
-          <w:rFonts w:ascii="Heiti TC" w:hAnsi="Heiti TC" w:eastAsia="Heiti TC"/>
+          <w:rFonts w:ascii="Arial Unicode MS" w:hAnsi="Arial Unicode MS" w:eastAsia="Arial Unicode MS"/>
           <w:b/>
           <w:i w:val="0"/>
           <w:color w:val="1A2340"/>
           <w:sz w:val="44"/>
         </w:rPr>
-        <w:t>AI 時代，我們要學什麼？</w:t>
+        <w:t>AI（人工智慧）時代，我們要學什麼？</w:t>
       </w:r>
     </w:p>
     <w:p>
@@ -45,13 +45,13 @@
       </w:pPr>
       <w:r>
         <w:rPr>
-          <w:rFonts w:ascii="Heiti TC" w:hAnsi="Heiti TC" w:eastAsia="Heiti TC"/>
+          <w:rFonts w:ascii="Arial Unicode MS" w:hAnsi="Arial Unicode MS" w:eastAsia="Arial Unicode MS"/>
           <w:b w:val="0"/>
           <w:i w:val="0"/>
           <w:color w:val="5B6573"/>
           <w:sz w:val="22"/>
         </w:rPr>
-        <w:t>起點檢核收卷後才使用這一本；先留起點，再進入真假畫廊。</w:t>
+        <w:t>起點任務收卷後才使用這一本；先留下現在的想法，再進入真假畫廊。</w:t>
       </w:r>
     </w:p>
     <w:p>
@@ -62,7 +62,7 @@
       </w:pPr>
       <w:r>
         <w:rPr>
-          <w:rFonts w:ascii="Heiti TC" w:hAnsi="Heiti TC" w:eastAsia="Heiti TC"/>
+          <w:rFonts w:ascii="Arial Unicode MS" w:hAnsi="Arial Unicode MS" w:eastAsia="Arial Unicode MS"/>
           <w:b w:val="0"/>
           <w:i w:val="0"/>
           <w:color w:val="5B6573"/>
@@ -72,7 +72,7 @@
       </w:r>
       <w:r>
         <w:rPr>
-          <w:rFonts w:ascii="JetBrains Mono" w:hAnsi="JetBrains Mono" w:eastAsia="Heiti TC"/>
+          <w:rFonts w:ascii="JetBrains Mono" w:hAnsi="JetBrains Mono" w:eastAsia="Arial Unicode MS"/>
           <w:b w:val="0"/>
           <w:i w:val="0"/>
           <w:color w:val="1A2340"/>
@@ -82,7 +82,7 @@
       </w:r>
       <w:r>
         <w:rPr>
-          <w:rFonts w:ascii="Heiti TC" w:hAnsi="Heiti TC" w:eastAsia="Heiti TC"/>
+          <w:rFonts w:ascii="Arial Unicode MS" w:hAnsi="Arial Unicode MS" w:eastAsia="Arial Unicode MS"/>
           <w:b w:val="0"/>
           <w:i w:val="0"/>
           <w:color w:val="5B6573"/>
@@ -92,7 +92,7 @@
       </w:r>
       <w:r>
         <w:rPr>
-          <w:rFonts w:ascii="JetBrains Mono" w:hAnsi="JetBrains Mono" w:eastAsia="Heiti TC"/>
+          <w:rFonts w:ascii="JetBrains Mono" w:hAnsi="JetBrains Mono" w:eastAsia="Arial Unicode MS"/>
           <w:b w:val="0"/>
           <w:i w:val="0"/>
           <w:color w:val="1A2340"/>
@@ -102,7 +102,7 @@
       </w:r>
       <w:r>
         <w:rPr>
-          <w:rFonts w:ascii="Heiti TC" w:hAnsi="Heiti TC" w:eastAsia="Heiti TC"/>
+          <w:rFonts w:ascii="Arial Unicode MS" w:hAnsi="Arial Unicode MS" w:eastAsia="Arial Unicode MS"/>
           <w:b w:val="0"/>
           <w:i w:val="0"/>
           <w:color w:val="5B6573"/>
@@ -112,7 +112,7 @@
       </w:r>
       <w:r>
         <w:rPr>
-          <w:rFonts w:ascii="JetBrains Mono" w:hAnsi="JetBrains Mono" w:eastAsia="Heiti TC"/>
+          <w:rFonts w:ascii="JetBrains Mono" w:hAnsi="JetBrains Mono" w:eastAsia="Arial Unicode MS"/>
           <w:b w:val="0"/>
           <w:i w:val="0"/>
           <w:color w:val="1A2340"/>
@@ -122,7 +122,7 @@
       </w:r>
       <w:r>
         <w:rPr>
-          <w:rFonts w:ascii="Heiti TC" w:hAnsi="Heiti TC" w:eastAsia="Heiti TC"/>
+          <w:rFonts w:ascii="Arial Unicode MS" w:hAnsi="Arial Unicode MS" w:eastAsia="Arial Unicode MS"/>
           <w:b w:val="0"/>
           <w:i w:val="0"/>
           <w:color w:val="5B6573"/>
@@ -132,7 +132,7 @@
       </w:r>
       <w:r>
         <w:rPr>
-          <w:rFonts w:ascii="JetBrains Mono" w:hAnsi="JetBrains Mono" w:eastAsia="Heiti TC"/>
+          <w:rFonts w:ascii="JetBrains Mono" w:hAnsi="JetBrains Mono" w:eastAsia="Arial Unicode MS"/>
           <w:b w:val="0"/>
           <w:i w:val="0"/>
           <w:color w:val="1A2340"/>
@@ -149,7 +149,7 @@
       </w:pPr>
       <w:r>
         <w:rPr>
-          <w:rFonts w:ascii="Heiti TC" w:hAnsi="Heiti TC" w:eastAsia="Heiti TC"/>
+          <w:rFonts w:ascii="Arial Unicode MS" w:hAnsi="Arial Unicode MS" w:eastAsia="Arial Unicode MS"/>
           <w:b/>
           <w:i w:val="0"/>
           <w:color w:val="1A2340"/>
@@ -166,63 +166,13 @@
       </w:pPr>
       <w:r>
         <w:rPr>
-          <w:rFonts w:ascii="Heiti TC" w:hAnsi="Heiti TC" w:eastAsia="Heiti TC"/>
+          <w:rFonts w:ascii="Arial Unicode MS" w:hAnsi="Arial Unicode MS" w:eastAsia="Arial Unicode MS"/>
           <w:b w:val="0"/>
           <w:i w:val="0"/>
           <w:color w:val="5B6573"/>
           <w:sz w:val="22"/>
         </w:rPr>
-        <w:t xml:space="preserve">七項正式取證 </w:t>
-      </w:r>
-      <w:r>
-        <w:rPr>
-          <w:rFonts w:ascii="JetBrains Mono" w:hAnsi="JetBrains Mono" w:eastAsia="Heiti TC"/>
-          <w:b/>
-          <w:i w:val="0"/>
-          <w:color w:val="1D4ED8"/>
-          <w:sz w:val="22"/>
-        </w:rPr>
-        <w:t>100</w:t>
-      </w:r>
-      <w:r>
-        <w:rPr>
-          <w:rFonts w:ascii="Heiti TC" w:hAnsi="Heiti TC" w:eastAsia="Heiti TC"/>
-          <w:b w:val="0"/>
-          <w:i w:val="0"/>
-          <w:color w:val="5B6573"/>
-          <w:sz w:val="22"/>
-        </w:rPr>
-        <w:t xml:space="preserve">　｜　Gate 1–4 </w:t>
-      </w:r>
-      <w:r>
-        <w:rPr>
-          <w:rFonts w:ascii="JetBrains Mono" w:hAnsi="JetBrains Mono" w:eastAsia="Heiti TC"/>
-          <w:b/>
-          <w:i w:val="0"/>
-          <w:color w:val="1D4ED8"/>
-          <w:sz w:val="22"/>
-        </w:rPr>
-        <w:t>0</w:t>
-      </w:r>
-      <w:r>
-        <w:rPr>
-          <w:rFonts w:ascii="Heiti TC" w:hAnsi="Heiti TC" w:eastAsia="Heiti TC"/>
-          <w:b w:val="0"/>
-          <w:i w:val="0"/>
-          <w:color w:val="5B6573"/>
-          <w:sz w:val="22"/>
-        </w:rPr>
-        <w:t xml:space="preserve">　｜　及格／核心 </w:t>
-      </w:r>
-      <w:r>
-        <w:rPr>
-          <w:rFonts w:ascii="JetBrains Mono" w:hAnsi="JetBrains Mono" w:eastAsia="Heiti TC"/>
-          <w:b/>
-          <w:i w:val="0"/>
-          <w:color w:val="1D4ED8"/>
-          <w:sz w:val="22"/>
-        </w:rPr>
-        <w:t>60／25</w:t>
+        <w:t>先懂概念：平時留下學習過程，指定週次才做正式評量。</w:t>
       </w:r>
     </w:p>
     <w:tbl>
@@ -263,23 +213,23 @@
             </w:pPr>
             <w:r>
               <w:rPr>
-                <w:rFonts w:ascii="Heiti TC" w:hAnsi="Heiti TC" w:eastAsia="Heiti TC"/>
+                <w:rFonts w:ascii="Arial Unicode MS" w:hAnsi="Arial Unicode MS" w:eastAsia="Arial Unicode MS"/>
                 <w:b/>
                 <w:i w:val="0"/>
                 <w:color w:val="1D4ED8"/>
                 <w:sz w:val="22"/>
               </w:rPr>
-              <w:t>正式取證 100</w:t>
+              <w:t>正式評量</w:t>
             </w:r>
             <w:r>
               <w:rPr>
-                <w:rFonts w:ascii="Heiti TC" w:hAnsi="Heiti TC" w:eastAsia="Heiti TC"/>
+                <w:rFonts w:ascii="Arial Unicode MS" w:hAnsi="Arial Unicode MS" w:eastAsia="Arial Unicode MS"/>
                 <w:b w:val="0"/>
                 <w:i w:val="0"/>
                 <w:color w:val="1A2340"/>
                 <w:sz w:val="22"/>
               </w:rPr>
-              <w:t xml:space="preserve">　W5 15、W9 10、W10 15、W11–W12 10、W16 團隊 10、W16 個人 15、W17 25。</w:t>
+              <w:t xml:space="preserve">　全學期有七次，合計 100 分；每次都會先說清楚要求。</w:t>
             </w:r>
           </w:p>
           <w:p>
@@ -290,23 +240,23 @@
             </w:pPr>
             <w:r>
               <w:rPr>
-                <w:rFonts w:ascii="Heiti TC" w:hAnsi="Heiti TC" w:eastAsia="Heiti TC"/>
+                <w:rFonts w:ascii="Arial Unicode MS" w:hAnsi="Arial Unicode MS" w:eastAsia="Arial Unicode MS"/>
                 <w:b/>
                 <w:i w:val="0"/>
                 <w:color w:val="1D4ED8"/>
                 <w:sz w:val="22"/>
               </w:rPr>
-              <w:t>Gate 0</w:t>
+              <w:t>學習關卡</w:t>
             </w:r>
             <w:r>
               <w:rPr>
-                <w:rFonts w:ascii="Heiti TC" w:hAnsi="Heiti TC" w:eastAsia="Heiti TC"/>
+                <w:rFonts w:ascii="Arial Unicode MS" w:hAnsi="Arial Unicode MS" w:eastAsia="Arial Unicode MS"/>
                 <w:b w:val="0"/>
                 <w:i w:val="0"/>
                 <w:color w:val="1A2340"/>
                 <w:sz w:val="22"/>
               </w:rPr>
-              <w:t xml:space="preserve">　只判未檢核／通過／需修正；一般週練習不逐份計分。</w:t>
+              <w:t xml:space="preserve">　只檢查紀錄齊不齊；需要補充就補，不直接扣分。</w:t>
             </w:r>
           </w:p>
           <w:p>
@@ -317,23 +267,23 @@
             </w:pPr>
             <w:r>
               <w:rPr>
-                <w:rFonts w:ascii="Heiti TC" w:hAnsi="Heiti TC" w:eastAsia="Heiti TC"/>
+                <w:rFonts w:ascii="Arial Unicode MS" w:hAnsi="Arial Unicode MS" w:eastAsia="Arial Unicode MS"/>
                 <w:b/>
                 <w:i w:val="0"/>
                 <w:color w:val="1D4ED8"/>
                 <w:sz w:val="22"/>
               </w:rPr>
-              <w:t>兩種結果</w:t>
+              <w:t>個人限時任務</w:t>
             </w:r>
             <w:r>
               <w:rPr>
-                <w:rFonts w:ascii="Heiti TC" w:hAnsi="Heiti TC" w:eastAsia="Heiti TC"/>
+                <w:rFonts w:ascii="Arial Unicode MS" w:hAnsi="Arial Unicode MS" w:eastAsia="Arial Unicode MS"/>
                 <w:b w:val="0"/>
                 <w:i w:val="0"/>
                 <w:color w:val="1A2340"/>
                 <w:sz w:val="22"/>
               </w:rPr>
-              <w:t xml:space="preserve">　總分 60／100 為課程及格；個人受控 25／50 為分開呈現的核心認證。</w:t>
+              <w:t xml:space="preserve">　三次不用 AI、不討論的任務，另外看你能否獨立完成；不改寫已取得的總分。</w:t>
             </w:r>
           </w:p>
         </w:tc>
@@ -347,7 +297,7 @@
       </w:pPr>
       <w:r>
         <w:rPr>
-          <w:rFonts w:ascii="JetBrains Mono" w:hAnsi="JetBrains Mono" w:eastAsia="Heiti TC"/>
+          <w:rFonts w:ascii="JetBrains Mono" w:hAnsi="JetBrains Mono" w:eastAsia="Arial Unicode MS"/>
           <w:b/>
           <w:i w:val="0"/>
           <w:color w:val="1D4ED8"/>
@@ -357,7 +307,7 @@
       </w:r>
       <w:r>
         <w:rPr>
-          <w:rFonts w:ascii="Heiti TC" w:hAnsi="Heiti TC" w:eastAsia="Heiti TC"/>
+          <w:rFonts w:ascii="Arial Unicode MS" w:hAnsi="Arial Unicode MS" w:eastAsia="Arial Unicode MS"/>
           <w:b w:val="0"/>
           <w:i w:val="0"/>
           <w:color w:val="1D4ED8"/>
@@ -367,13 +317,13 @@
       </w:r>
       <w:r>
         <w:rPr>
-          <w:rFonts w:ascii="Heiti TC" w:hAnsi="Heiti TC" w:eastAsia="Heiti TC"/>
+          <w:rFonts w:ascii="Arial Unicode MS" w:hAnsi="Arial Unicode MS" w:eastAsia="Arial Unicode MS"/>
           <w:b/>
           <w:i w:val="0"/>
           <w:color w:val="1A2340"/>
           <w:sz w:val="30"/>
         </w:rPr>
-        <w:t>起點檢核（已繳）</w:t>
+        <w:t>起點任務（已繳）</w:t>
       </w:r>
     </w:p>
     <w:p>
@@ -384,13 +334,13 @@
       </w:pPr>
       <w:r>
         <w:rPr>
-          <w:rFonts w:ascii="Heiti TC" w:hAnsi="Heiti TC" w:eastAsia="Heiti TC"/>
+          <w:rFonts w:ascii="Arial Unicode MS" w:hAnsi="Arial Unicode MS" w:eastAsia="Arial Unicode MS"/>
           <w:b w:val="0"/>
           <w:i w:val="0"/>
           <w:color w:val="5B6573"/>
           <w:sz w:val="22"/>
         </w:rPr>
-        <w:t>題本已收齊，老師密封保存到 W17 才發還。不計分；今天寫不出來不扣分，那正是要保存的起點。</w:t>
+        <w:t>題本已收齊，老師密封保存到第 17 週才發還。今天寫不出來很正常，那正是要保存的起點。</w:t>
       </w:r>
     </w:p>
     <w:p>
@@ -401,17 +351,17 @@
       </w:pPr>
       <w:r>
         <w:rPr>
-          <w:rFonts w:ascii="Heiti TC" w:hAnsi="Heiti TC" w:eastAsia="Heiti TC"/>
+          <w:rFonts w:ascii="Arial Unicode MS" w:hAnsi="Arial Unicode MS" w:eastAsia="Arial Unicode MS"/>
           <w:b/>
           <w:i w:val="0"/>
           <w:color w:val="5B6573"/>
           <w:sz w:val="22"/>
         </w:rPr>
-        <w:t>自留札記</w:t>
+        <w:t>起點備忘</w:t>
       </w:r>
       <w:r>
         <w:rPr>
-          <w:rFonts w:ascii="Heiti TC" w:hAnsi="Heiti TC" w:eastAsia="Heiti TC"/>
+          <w:rFonts w:ascii="Arial Unicode MS" w:hAnsi="Arial Unicode MS" w:eastAsia="Arial Unicode MS"/>
           <w:b w:val="0"/>
           <w:i w:val="0"/>
           <w:color w:val="7B8491"/>
@@ -421,7 +371,7 @@
       </w:r>
       <w:r>
         <w:rPr>
-          <w:rFonts w:ascii="Heiti TC" w:hAnsi="Heiti TC" w:eastAsia="Heiti TC"/>
+          <w:rFonts w:ascii="Arial Unicode MS" w:hAnsi="Arial Unicode MS" w:eastAsia="Arial Unicode MS"/>
           <w:b w:val="0"/>
           <w:i w:val="0"/>
           <w:color w:val="1A2340"/>
@@ -431,7 +381,7 @@
       </w:r>
       <w:r>
         <w:rPr>
-          <w:rFonts w:ascii="JetBrains Mono" w:hAnsi="JetBrains Mono" w:eastAsia="Heiti TC"/>
+          <w:rFonts w:ascii="JetBrains Mono" w:hAnsi="JetBrains Mono" w:eastAsia="Arial Unicode MS"/>
           <w:b w:val="0"/>
           <w:i w:val="0"/>
           <w:color w:val="5B6573"/>
@@ -448,7 +398,7 @@
       </w:pPr>
       <w:r>
         <w:rPr>
-          <w:rFonts w:ascii="JetBrains Mono" w:hAnsi="JetBrains Mono" w:eastAsia="Heiti TC"/>
+          <w:rFonts w:ascii="JetBrains Mono" w:hAnsi="JetBrains Mono" w:eastAsia="Arial Unicode MS"/>
           <w:b/>
           <w:i w:val="0"/>
           <w:color w:val="1D4ED8"/>
@@ -458,7 +408,7 @@
       </w:r>
       <w:r>
         <w:rPr>
-          <w:rFonts w:ascii="Heiti TC" w:hAnsi="Heiti TC" w:eastAsia="Heiti TC"/>
+          <w:rFonts w:ascii="Arial Unicode MS" w:hAnsi="Arial Unicode MS" w:eastAsia="Arial Unicode MS"/>
           <w:b w:val="0"/>
           <w:i w:val="0"/>
           <w:color w:val="1D4ED8"/>
@@ -468,7 +418,7 @@
       </w:r>
       <w:r>
         <w:rPr>
-          <w:rFonts w:ascii="Heiti TC" w:hAnsi="Heiti TC" w:eastAsia="Heiti TC"/>
+          <w:rFonts w:ascii="Arial Unicode MS" w:hAnsi="Arial Unicode MS" w:eastAsia="Arial Unicode MS"/>
           <w:b/>
           <w:i w:val="0"/>
           <w:color w:val="1A2340"/>
@@ -485,13 +435,13 @@
       </w:pPr>
       <w:r>
         <w:rPr>
-          <w:rFonts w:ascii="Heiti TC" w:hAnsi="Heiti TC" w:eastAsia="Heiti TC"/>
+          <w:rFonts w:ascii="Arial Unicode MS" w:hAnsi="Arial Unicode MS" w:eastAsia="Arial Unicode MS"/>
           <w:b w:val="0"/>
           <w:i w:val="0"/>
           <w:color w:val="5B6573"/>
           <w:sz w:val="22"/>
         </w:rPr>
-        <w:t>投票前先押把握％（50＝像丟硬幣／90＝高度確定），揭曉後回填 ✓／✗。不評分；W17 你會回來看這些數字。</w:t>
+        <w:t>投票前先押把握％（50＝像丟硬幣／90＝高度確定），揭曉後回填 ✓／✗。第 17 週你會回來看這些數字。</w:t>
       </w:r>
     </w:p>
     <w:tbl>
@@ -535,7 +485,7 @@
             </w:pPr>
             <w:r>
               <w:rPr>
-                <w:rFonts w:ascii="Heiti TC" w:hAnsi="Heiti TC" w:eastAsia="Heiti TC"/>
+                <w:rFonts w:ascii="Arial Unicode MS" w:hAnsi="Arial Unicode MS" w:eastAsia="Arial Unicode MS"/>
                 <w:b/>
                 <w:i w:val="0"/>
                 <w:color w:val="1D4ED8"/>
@@ -568,7 +518,7 @@
             </w:pPr>
             <w:r>
               <w:rPr>
-                <w:rFonts w:ascii="Heiti TC" w:hAnsi="Heiti TC" w:eastAsia="Heiti TC"/>
+                <w:rFonts w:ascii="Arial Unicode MS" w:hAnsi="Arial Unicode MS" w:eastAsia="Arial Unicode MS"/>
                 <w:b/>
                 <w:i w:val="0"/>
                 <w:color w:val="1D4ED8"/>
@@ -601,7 +551,7 @@
             </w:pPr>
             <w:r>
               <w:rPr>
-                <w:rFonts w:ascii="Heiti TC" w:hAnsi="Heiti TC" w:eastAsia="Heiti TC"/>
+                <w:rFonts w:ascii="Arial Unicode MS" w:hAnsi="Arial Unicode MS" w:eastAsia="Arial Unicode MS"/>
                 <w:b/>
                 <w:i w:val="0"/>
                 <w:color w:val="1D4ED8"/>
@@ -634,7 +584,7 @@
             </w:pPr>
             <w:r>
               <w:rPr>
-                <w:rFonts w:ascii="Heiti TC" w:hAnsi="Heiti TC" w:eastAsia="Heiti TC"/>
+                <w:rFonts w:ascii="Arial Unicode MS" w:hAnsi="Arial Unicode MS" w:eastAsia="Arial Unicode MS"/>
                 <w:b/>
                 <w:i w:val="0"/>
                 <w:color w:val="1D4ED8"/>
@@ -672,7 +622,7 @@
             </w:pPr>
             <w:r>
               <w:rPr>
-                <w:rFonts w:ascii="Heiti TC" w:hAnsi="Heiti TC" w:eastAsia="Heiti TC"/>
+                <w:rFonts w:ascii="Arial Unicode MS" w:hAnsi="Arial Unicode MS" w:eastAsia="Arial Unicode MS"/>
                 <w:b/>
                 <w:i w:val="0"/>
                 <w:color w:val="1A2340"/>
@@ -779,7 +729,7 @@
             </w:pPr>
             <w:r>
               <w:rPr>
-                <w:rFonts w:ascii="Heiti TC" w:hAnsi="Heiti TC" w:eastAsia="Heiti TC"/>
+                <w:rFonts w:ascii="Arial Unicode MS" w:hAnsi="Arial Unicode MS" w:eastAsia="Arial Unicode MS"/>
                 <w:b/>
                 <w:i w:val="0"/>
                 <w:color w:val="1A2340"/>
@@ -886,7 +836,7 @@
             </w:pPr>
             <w:r>
               <w:rPr>
-                <w:rFonts w:ascii="Heiti TC" w:hAnsi="Heiti TC" w:eastAsia="Heiti TC"/>
+                <w:rFonts w:ascii="Arial Unicode MS" w:hAnsi="Arial Unicode MS" w:eastAsia="Arial Unicode MS"/>
                 <w:b/>
                 <w:i w:val="0"/>
                 <w:color w:val="1A2340"/>
@@ -993,7 +943,7 @@
             </w:pPr>
             <w:r>
               <w:rPr>
-                <w:rFonts w:ascii="Heiti TC" w:hAnsi="Heiti TC" w:eastAsia="Heiti TC"/>
+                <w:rFonts w:ascii="Arial Unicode MS" w:hAnsi="Arial Unicode MS" w:eastAsia="Arial Unicode MS"/>
                 <w:b/>
                 <w:i w:val="0"/>
                 <w:color w:val="1A2340"/>
@@ -1082,7 +1032,7 @@
       </w:pPr>
       <w:r>
         <w:rPr>
-          <w:rFonts w:ascii="Heiti TC" w:hAnsi="Heiti TC" w:eastAsia="Heiti TC"/>
+          <w:rFonts w:ascii="Arial Unicode MS" w:hAnsi="Arial Unicode MS" w:eastAsia="Arial Unicode MS"/>
           <w:b w:val="0"/>
           <w:i w:val="0"/>
           <w:color w:val="1A2340"/>
@@ -1092,7 +1042,7 @@
       </w:r>
       <w:r>
         <w:rPr>
-          <w:rFonts w:ascii="JetBrains Mono" w:hAnsi="JetBrains Mono" w:eastAsia="Heiti TC"/>
+          <w:rFonts w:ascii="JetBrains Mono" w:hAnsi="JetBrains Mono" w:eastAsia="Arial Unicode MS"/>
           <w:b/>
           <w:i w:val="0"/>
           <w:color w:val="1A2340"/>
@@ -1102,7 +1052,7 @@
       </w:r>
       <w:r>
         <w:rPr>
-          <w:rFonts w:ascii="Heiti TC" w:hAnsi="Heiti TC" w:eastAsia="Heiti TC"/>
+          <w:rFonts w:ascii="Arial Unicode MS" w:hAnsi="Arial Unicode MS" w:eastAsia="Arial Unicode MS"/>
           <w:b w:val="0"/>
           <w:i w:val="0"/>
           <w:color w:val="1A2340"/>
@@ -1149,7 +1099,7 @@
             </w:pPr>
             <w:r>
               <w:rPr>
-                <w:rFonts w:ascii="Heiti TC" w:hAnsi="Heiti TC" w:eastAsia="Heiti TC"/>
+                <w:rFonts w:ascii="Arial Unicode MS" w:hAnsi="Arial Unicode MS" w:eastAsia="Arial Unicode MS"/>
                 <w:b/>
                 <w:i w:val="0"/>
                 <w:color w:val="1D4ED8"/>
@@ -1159,13 +1109,13 @@
             </w:r>
             <w:r>
               <w:rPr>
-                <w:rFonts w:ascii="Heiti TC" w:hAnsi="Heiti TC" w:eastAsia="Heiti TC"/>
+                <w:rFonts w:ascii="Arial Unicode MS" w:hAnsi="Arial Unicode MS" w:eastAsia="Arial Unicode MS"/>
                 <w:b/>
                 <w:i w:val="0"/>
                 <w:color w:val="1A2340"/>
                 <w:sz w:val="22"/>
               </w:rPr>
-              <w:t>知道來源後，我會怎麼讀這段文字？</w:t>
+              <w:t>知道來源後，我還能確定什麼？要相信或使用它，還缺什麼？</w:t>
             </w:r>
           </w:p>
         </w:tc>
@@ -1179,7 +1129,7 @@
       </w:pPr>
       <w:r>
         <w:rPr>
-          <w:rFonts w:ascii="Heiti TC" w:hAnsi="Heiti TC" w:eastAsia="Heiti TC"/>
+          <w:rFonts w:ascii="Arial Unicode MS" w:hAnsi="Arial Unicode MS" w:eastAsia="Arial Unicode MS"/>
           <w:b/>
           <w:i w:val="0"/>
           <w:color w:val="1D4ED8"/>
@@ -1189,7 +1139,7 @@
       </w:r>
       <w:r>
         <w:rPr>
-          <w:rFonts w:ascii="Heiti TC" w:hAnsi="Heiti TC" w:eastAsia="Heiti TC"/>
+          <w:rFonts w:ascii="Arial Unicode MS" w:hAnsi="Arial Unicode MS" w:eastAsia="Arial Unicode MS"/>
           <w:b w:val="0"/>
           <w:i w:val="0"/>
           <w:color w:val="7B8491"/>
@@ -1199,13 +1149,13 @@
       </w:r>
       <w:r>
         <w:rPr>
-          <w:rFonts w:ascii="Heiti TC" w:hAnsi="Heiti TC" w:eastAsia="Heiti TC"/>
+          <w:rFonts w:ascii="Arial Unicode MS" w:hAnsi="Arial Unicode MS" w:eastAsia="Arial Unicode MS"/>
           <w:b w:val="0"/>
           <w:i w:val="0"/>
           <w:color w:val="1A2340"/>
           <w:sz w:val="22"/>
         </w:rPr>
-        <w:t>抄下一句最值得追問的文字</w:t>
+        <w:t>抄下一句「目前還不能讓我確定」的文字</w:t>
       </w:r>
     </w:p>
     <w:tbl>
@@ -1288,7 +1238,7 @@
       </w:pPr>
       <w:r>
         <w:rPr>
-          <w:rFonts w:ascii="Heiti TC" w:hAnsi="Heiti TC" w:eastAsia="Heiti TC"/>
+          <w:rFonts w:ascii="Arial Unicode MS" w:hAnsi="Arial Unicode MS" w:eastAsia="Arial Unicode MS"/>
           <w:b/>
           <w:i w:val="0"/>
           <w:color w:val="1D4ED8"/>
@@ -1298,7 +1248,7 @@
       </w:r>
       <w:r>
         <w:rPr>
-          <w:rFonts w:ascii="Heiti TC" w:hAnsi="Heiti TC" w:eastAsia="Heiti TC"/>
+          <w:rFonts w:ascii="Arial Unicode MS" w:hAnsi="Arial Unicode MS" w:eastAsia="Arial Unicode MS"/>
           <w:b w:val="0"/>
           <w:i w:val="0"/>
           <w:color w:val="7B8491"/>
@@ -1308,7 +1258,7 @@
       </w:r>
       <w:r>
         <w:rPr>
-          <w:rFonts w:ascii="Heiti TC" w:hAnsi="Heiti TC" w:eastAsia="Heiti TC"/>
+          <w:rFonts w:ascii="Arial Unicode MS" w:hAnsi="Arial Unicode MS" w:eastAsia="Arial Unicode MS"/>
           <w:b w:val="0"/>
           <w:i w:val="0"/>
           <w:color w:val="1A2340"/>
@@ -1325,13 +1275,13 @@
       </w:pPr>
       <w:r>
         <w:rPr>
-          <w:rFonts w:ascii="Heiti TC" w:hAnsi="Heiti TC" w:eastAsia="Heiti TC"/>
+          <w:rFonts w:ascii="Arial Unicode MS" w:hAnsi="Arial Unicode MS" w:eastAsia="Arial Unicode MS"/>
           <w:b w:val="0"/>
           <w:i w:val="0"/>
           <w:color w:val="5B6573"/>
           <w:sz w:val="22"/>
         </w:rPr>
-        <w:t>方向：□ 具體細節　□ 作者經歷　□ 可信根據　□ 其他</w:t>
+        <w:t>挑一個方向：□ 哪個細節要確認　□ 作者可能從哪個角度寫　□ 還要查什麼資料</w:t>
       </w:r>
     </w:p>
     <w:tbl>
@@ -1385,13 +1335,13 @@
       </w:pPr>
       <w:r>
         <w:rPr>
-          <w:rFonts w:ascii="JetBrains Mono" w:hAnsi="JetBrains Mono" w:eastAsia="Heiti TC"/>
+          <w:rFonts w:ascii="JetBrains Mono" w:hAnsi="JetBrains Mono" w:eastAsia="Arial Unicode MS"/>
           <w:b/>
           <w:i w:val="0"/>
           <w:color w:val="1D4ED8"/>
           <w:sz w:val="22"/>
         </w:rPr>
-        <w:t>W1 / 02</w:t>
+        <w:t>第 1 週 / 第 2 頁</w:t>
       </w:r>
     </w:p>
     <w:p>
@@ -1402,13 +1352,13 @@
       </w:pPr>
       <w:r>
         <w:rPr>
-          <w:rFonts w:ascii="Heiti TC" w:hAnsi="Heiti TC" w:eastAsia="Heiti TC"/>
+          <w:rFonts w:ascii="Arial Unicode MS" w:hAnsi="Arial Unicode MS" w:eastAsia="Arial Unicode MS"/>
           <w:b/>
           <w:i w:val="0"/>
           <w:color w:val="1A2340"/>
           <w:sz w:val="44"/>
         </w:rPr>
-        <w:t>三個技術與課程使命</w:t>
+        <w:t>閱讀、理解、表達</w:t>
       </w:r>
     </w:p>
     <w:p>
@@ -1419,13 +1369,13 @@
       </w:pPr>
       <w:r>
         <w:rPr>
-          <w:rFonts w:ascii="Heiti TC" w:hAnsi="Heiti TC" w:eastAsia="Heiti TC"/>
+          <w:rFonts w:ascii="Arial Unicode MS" w:hAnsi="Arial Unicode MS" w:eastAsia="Arial Unicode MS"/>
           <w:b w:val="0"/>
           <w:i w:val="0"/>
           <w:color w:val="5B6573"/>
           <w:sz w:val="22"/>
         </w:rPr>
-        <w:t>先看 AI 能做什麼，再決定哪些能力仍值得由自己理解、選擇與承擔。</w:t>
+        <w:t>先看 AI 在這三個學習動作上能做什麼，再決定哪些事仍要由自己判斷與負責。</w:t>
       </w:r>
     </w:p>
     <w:p>
@@ -1436,7 +1386,7 @@
       </w:pPr>
       <w:r>
         <w:rPr>
-          <w:rFonts w:ascii="JetBrains Mono" w:hAnsi="JetBrains Mono" w:eastAsia="Heiti TC"/>
+          <w:rFonts w:ascii="JetBrains Mono" w:hAnsi="JetBrains Mono" w:eastAsia="Arial Unicode MS"/>
           <w:b/>
           <w:i w:val="0"/>
           <w:color w:val="1D4ED8"/>
@@ -1446,7 +1396,7 @@
       </w:r>
       <w:r>
         <w:rPr>
-          <w:rFonts w:ascii="Heiti TC" w:hAnsi="Heiti TC" w:eastAsia="Heiti TC"/>
+          <w:rFonts w:ascii="Arial Unicode MS" w:hAnsi="Arial Unicode MS" w:eastAsia="Arial Unicode MS"/>
           <w:b w:val="0"/>
           <w:i w:val="0"/>
           <w:color w:val="1D4ED8"/>
@@ -1456,13 +1406,13 @@
       </w:r>
       <w:r>
         <w:rPr>
-          <w:rFonts w:ascii="Heiti TC" w:hAnsi="Heiti TC" w:eastAsia="Heiti TC"/>
+          <w:rFonts w:ascii="Arial Unicode MS" w:hAnsi="Arial Unicode MS" w:eastAsia="Arial Unicode MS"/>
           <w:b/>
           <w:i w:val="0"/>
           <w:color w:val="1A2340"/>
           <w:sz w:val="30"/>
         </w:rPr>
-        <w:t>三個技術</w:t>
+        <w:t>三個學習動作</w:t>
       </w:r>
     </w:p>
     <w:p>
@@ -1473,7 +1423,7 @@
       </w:pPr>
       <w:r>
         <w:rPr>
-          <w:rFonts w:ascii="Heiti TC" w:hAnsi="Heiti TC" w:eastAsia="Heiti TC"/>
+          <w:rFonts w:ascii="Arial Unicode MS" w:hAnsi="Arial Unicode MS" w:eastAsia="Arial Unicode MS"/>
           <w:b w:val="0"/>
           <w:i w:val="0"/>
           <w:color w:val="1A2340"/>
@@ -1490,7 +1440,7 @@
       </w:pPr>
       <w:r>
         <w:rPr>
-          <w:rFonts w:ascii="Heiti TC" w:hAnsi="Heiti TC" w:eastAsia="Heiti TC"/>
+          <w:rFonts w:ascii="Arial Unicode MS" w:hAnsi="Arial Unicode MS" w:eastAsia="Arial Unicode MS"/>
           <w:b/>
           <w:i w:val="0"/>
           <w:color w:val="5B6573"/>
@@ -1500,7 +1450,7 @@
       </w:r>
       <w:r>
         <w:rPr>
-          <w:rFonts w:ascii="Heiti TC" w:hAnsi="Heiti TC" w:eastAsia="Heiti TC"/>
+          <w:rFonts w:ascii="Arial Unicode MS" w:hAnsi="Arial Unicode MS" w:eastAsia="Arial Unicode MS"/>
           <w:b w:val="0"/>
           <w:i w:val="0"/>
           <w:color w:val="7B8491"/>
@@ -1510,7 +1460,7 @@
       </w:r>
       <w:r>
         <w:rPr>
-          <w:rFonts w:ascii="Heiti TC" w:hAnsi="Heiti TC" w:eastAsia="Heiti TC"/>
+          <w:rFonts w:ascii="Arial Unicode MS" w:hAnsi="Arial Unicode MS" w:eastAsia="Arial Unicode MS"/>
           <w:b w:val="0"/>
           <w:i w:val="0"/>
           <w:color w:val="1A2340"/>
@@ -1558,13 +1508,13 @@
             </w:pPr>
             <w:r>
               <w:rPr>
-                <w:rFonts w:ascii="Heiti TC" w:hAnsi="Heiti TC" w:eastAsia="Heiti TC"/>
+                <w:rFonts w:ascii="Arial Unicode MS" w:hAnsi="Arial Unicode MS" w:eastAsia="Arial Unicode MS"/>
                 <w:b/>
                 <w:i w:val="0"/>
                 <w:color w:val="1D4ED8"/>
                 <w:sz w:val="22"/>
               </w:rPr>
-              <w:t>技術</w:t>
+              <w:t>學習動作</w:t>
             </w:r>
           </w:p>
         </w:tc>
@@ -1591,7 +1541,7 @@
             </w:pPr>
             <w:r>
               <w:rPr>
-                <w:rFonts w:ascii="Heiti TC" w:hAnsi="Heiti TC" w:eastAsia="Heiti TC"/>
+                <w:rFonts w:ascii="Arial Unicode MS" w:hAnsi="Arial Unicode MS" w:eastAsia="Arial Unicode MS"/>
                 <w:b/>
                 <w:i w:val="0"/>
                 <w:color w:val="1D4ED8"/>
@@ -1629,7 +1579,7 @@
             </w:pPr>
             <w:r>
               <w:rPr>
-                <w:rFonts w:ascii="Heiti TC" w:hAnsi="Heiti TC" w:eastAsia="Heiti TC"/>
+                <w:rFonts w:ascii="Arial Unicode MS" w:hAnsi="Arial Unicode MS" w:eastAsia="Arial Unicode MS"/>
                 <w:b/>
                 <w:i w:val="0"/>
                 <w:color w:val="1A2340"/>
@@ -1690,7 +1640,7 @@
             </w:pPr>
             <w:r>
               <w:rPr>
-                <w:rFonts w:ascii="Heiti TC" w:hAnsi="Heiti TC" w:eastAsia="Heiti TC"/>
+                <w:rFonts w:ascii="Arial Unicode MS" w:hAnsi="Arial Unicode MS" w:eastAsia="Arial Unicode MS"/>
                 <w:b/>
                 <w:i w:val="0"/>
                 <w:color w:val="1A2340"/>
@@ -1751,7 +1701,7 @@
             </w:pPr>
             <w:r>
               <w:rPr>
-                <w:rFonts w:ascii="Heiti TC" w:hAnsi="Heiti TC" w:eastAsia="Heiti TC"/>
+                <w:rFonts w:ascii="Arial Unicode MS" w:hAnsi="Arial Unicode MS" w:eastAsia="Arial Unicode MS"/>
                 <w:b/>
                 <w:i w:val="0"/>
                 <w:color w:val="1A2340"/>
@@ -1794,7 +1744,7 @@
       </w:pPr>
       <w:r>
         <w:rPr>
-          <w:rFonts w:ascii="Heiti TC" w:hAnsi="Heiti TC" w:eastAsia="Heiti TC"/>
+          <w:rFonts w:ascii="Arial Unicode MS" w:hAnsi="Arial Unicode MS" w:eastAsia="Arial Unicode MS"/>
           <w:b w:val="0"/>
           <w:i w:val="0"/>
           <w:color w:val="5B6573"/>
@@ -1877,13 +1827,30 @@
     </w:tbl>
     <w:p>
       <w:pPr>
+        <w:keepNext w:val="0"/>
+        <w:keepLines w:val="0"/>
+        <w:spacing w:before="60" w:after="0" w:line="293" w:lineRule="auto"/>
+      </w:pPr>
+      <w:r>
+        <w:rPr>
+          <w:rFonts w:ascii="Arial Unicode MS" w:hAnsi="Arial Unicode MS" w:eastAsia="Arial Unicode MS"/>
+          <w:b w:val="0"/>
+          <w:i w:val="0"/>
+          <w:color w:val="5B6573"/>
+          <w:sz w:val="22"/>
+        </w:rPr>
+        <w:t>負責＝說得出內容怎麼來、重要說法查過根據、發現問題願意修正；交出去前由自己確認。</w:t>
+      </w:r>
+    </w:p>
+    <w:p>
+      <w:pPr>
         <w:keepNext/>
         <w:keepLines w:val="0"/>
         <w:spacing w:before="140" w:after="100" w:line="293" w:lineRule="auto"/>
       </w:pPr>
       <w:r>
         <w:rPr>
-          <w:rFonts w:ascii="JetBrains Mono" w:hAnsi="JetBrains Mono" w:eastAsia="Heiti TC"/>
+          <w:rFonts w:ascii="JetBrains Mono" w:hAnsi="JetBrains Mono" w:eastAsia="Arial Unicode MS"/>
           <w:b/>
           <w:i w:val="0"/>
           <w:color w:val="1D4ED8"/>
@@ -1893,7 +1860,7 @@
       </w:r>
       <w:r>
         <w:rPr>
-          <w:rFonts w:ascii="Heiti TC" w:hAnsi="Heiti TC" w:eastAsia="Heiti TC"/>
+          <w:rFonts w:ascii="Arial Unicode MS" w:hAnsi="Arial Unicode MS" w:eastAsia="Arial Unicode MS"/>
           <w:b w:val="0"/>
           <w:i w:val="0"/>
           <w:color w:val="1D4ED8"/>
@@ -1903,7 +1870,7 @@
       </w:r>
       <w:r>
         <w:rPr>
-          <w:rFonts w:ascii="Heiti TC" w:hAnsi="Heiti TC" w:eastAsia="Heiti TC"/>
+          <w:rFonts w:ascii="Arial Unicode MS" w:hAnsi="Arial Unicode MS" w:eastAsia="Arial Unicode MS"/>
           <w:b/>
           <w:i w:val="0"/>
           <w:color w:val="1A2340"/>
@@ -1920,7 +1887,7 @@
       </w:pPr>
       <w:r>
         <w:rPr>
-          <w:rFonts w:ascii="Heiti TC" w:hAnsi="Heiti TC" w:eastAsia="Heiti TC"/>
+          <w:rFonts w:ascii="Arial Unicode MS" w:hAnsi="Arial Unicode MS" w:eastAsia="Arial Unicode MS"/>
           <w:b/>
           <w:i w:val="0"/>
           <w:color w:val="5B6573"/>
@@ -1930,7 +1897,7 @@
       </w:r>
       <w:r>
         <w:rPr>
-          <w:rFonts w:ascii="Heiti TC" w:hAnsi="Heiti TC" w:eastAsia="Heiti TC"/>
+          <w:rFonts w:ascii="Arial Unicode MS" w:hAnsi="Arial Unicode MS" w:eastAsia="Arial Unicode MS"/>
           <w:b w:val="0"/>
           <w:i w:val="0"/>
           <w:color w:val="7B8491"/>
@@ -1940,7 +1907,7 @@
       </w:r>
       <w:r>
         <w:rPr>
-          <w:rFonts w:ascii="Heiti TC" w:hAnsi="Heiti TC" w:eastAsia="Heiti TC"/>
+          <w:rFonts w:ascii="Arial Unicode MS" w:hAnsi="Arial Unicode MS" w:eastAsia="Arial Unicode MS"/>
           <w:b w:val="0"/>
           <w:i w:val="0"/>
           <w:color w:val="1A2340"/>
@@ -1960,36 +1927,6 @@
       <w:tblGrid>
         <w:gridCol w:w="9865"/>
       </w:tblGrid>
-      <w:tr>
-        <w:trPr>
-          <w:trHeight w:val="510" w:hRule="atLeast"/>
-        </w:trPr>
-        <w:tc>
-          <w:tcPr>
-            <w:tcW w:type="dxa" w:w="9865"/>
-            <w:tcMar>
-              <w:top w:w="0" w:type="dxa"/>
-              <w:start w:w="0" w:type="dxa"/>
-              <w:bottom w:w="0" w:type="dxa"/>
-              <w:end w:w="0" w:type="dxa"/>
-            </w:tcMar>
-            <w:tcBorders>
-              <w:top w:val="nil"/>
-              <w:bottom w:val="single" w:sz="5" w:space="0" w:color="CBD5E1"/>
-              <w:start w:val="nil"/>
-              <w:end w:val="nil"/>
-            </w:tcBorders>
-          </w:tcPr>
-          <w:p>
-            <w:pPr>
-              <w:spacing w:before="0" w:after="0" w:line="240" w:lineRule="auto"/>
-            </w:pPr>
-            <w:r>
-              <w:t xml:space="preserve"> </w:t>
-            </w:r>
-          </w:p>
-        </w:tc>
-      </w:tr>
       <w:tr>
         <w:trPr>
           <w:trHeight w:val="510" w:hRule="atLeast"/>
@@ -2059,7 +1996,7 @@
             </w:pPr>
             <w:r>
               <w:rPr>
-                <w:rFonts w:ascii="Heiti TC" w:hAnsi="Heiti TC" w:eastAsia="Heiti TC"/>
+                <w:rFonts w:ascii="Arial Unicode MS" w:hAnsi="Arial Unicode MS" w:eastAsia="Arial Unicode MS"/>
                 <w:b/>
                 <w:i w:val="0"/>
                 <w:color w:val="1D4ED8"/>
@@ -2069,13 +2006,13 @@
             </w:r>
             <w:r>
               <w:rPr>
-                <w:rFonts w:ascii="Heiti TC" w:hAnsi="Heiti TC" w:eastAsia="Heiti TC"/>
+                <w:rFonts w:ascii="Arial Unicode MS" w:hAnsi="Arial Unicode MS" w:eastAsia="Arial Unicode MS"/>
                 <w:b w:val="0"/>
                 <w:i w:val="0"/>
                 <w:color w:val="1A2340"/>
                 <w:sz w:val="22"/>
               </w:rPr>
-              <w:t xml:space="preserve">　追來源與生成過程</w:t>
+              <w:t xml:space="preserve">　找來源，看這段內容怎麼做出來</w:t>
             </w:r>
           </w:p>
           <w:p>
@@ -2086,7 +2023,7 @@
             </w:pPr>
             <w:r>
               <w:rPr>
-                <w:rFonts w:ascii="Heiti TC" w:hAnsi="Heiti TC" w:eastAsia="Heiti TC"/>
+                <w:rFonts w:ascii="Arial Unicode MS" w:hAnsi="Arial Unicode MS" w:eastAsia="Arial Unicode MS"/>
                 <w:b/>
                 <w:i w:val="0"/>
                 <w:color w:val="1D4ED8"/>
@@ -2096,13 +2033,13 @@
             </w:r>
             <w:r>
               <w:rPr>
-                <w:rFonts w:ascii="Heiti TC" w:hAnsi="Heiti TC" w:eastAsia="Heiti TC"/>
+                <w:rFonts w:ascii="Arial Unicode MS" w:hAnsi="Arial Unicode MS" w:eastAsia="Arial Unicode MS"/>
                 <w:b w:val="0"/>
                 <w:i w:val="0"/>
                 <w:color w:val="1A2340"/>
                 <w:sz w:val="22"/>
               </w:rPr>
-              <w:t xml:space="preserve">　找證據、拆推論</w:t>
+              <w:t xml:space="preserve">　找證據，看理由有沒有跳太快</w:t>
             </w:r>
           </w:p>
           <w:p>
@@ -2113,7 +2050,7 @@
             </w:pPr>
             <w:r>
               <w:rPr>
-                <w:rFonts w:ascii="Heiti TC" w:hAnsi="Heiti TC" w:eastAsia="Heiti TC"/>
+                <w:rFonts w:ascii="Arial Unicode MS" w:hAnsi="Arial Unicode MS" w:eastAsia="Arial Unicode MS"/>
                 <w:b/>
                 <w:i w:val="0"/>
                 <w:color w:val="1D4ED8"/>
@@ -2123,13 +2060,13 @@
             </w:r>
             <w:r>
               <w:rPr>
-                <w:rFonts w:ascii="Heiti TC" w:hAnsi="Heiti TC" w:eastAsia="Heiti TC"/>
+                <w:rFonts w:ascii="Arial Unicode MS" w:hAnsi="Arial Unicode MS" w:eastAsia="Arial Unicode MS"/>
                 <w:b w:val="0"/>
                 <w:i w:val="0"/>
                 <w:color w:val="1A2340"/>
                 <w:sz w:val="22"/>
               </w:rPr>
-              <w:t xml:space="preserve">　確認交付者與影響</w:t>
+              <w:t xml:space="preserve">　找出最後交出去的人與可能影響</w:t>
             </w:r>
           </w:p>
         </w:tc>
@@ -2139,17 +2076,17 @@
       <w:pPr>
         <w:keepNext w:val="0"/>
         <w:keepLines w:val="0"/>
-        <w:spacing w:before="100" w:after="0" w:line="293" w:lineRule="auto"/>
+        <w:spacing w:before="60" w:after="0" w:line="293" w:lineRule="auto"/>
       </w:pPr>
       <w:r>
         <w:rPr>
-          <w:rFonts w:ascii="Heiti TC" w:hAnsi="Heiti TC" w:eastAsia="Heiti TC"/>
+          <w:rFonts w:ascii="Arial Unicode MS" w:hAnsi="Arial Unicode MS" w:eastAsia="Arial Unicode MS"/>
           <w:b w:val="0"/>
           <w:i w:val="0"/>
           <w:color w:val="5B6573"/>
-          <w:sz w:val="22"/>
+          <w:sz w:val="20"/>
         </w:rPr>
-        <w:t>提醒：真人寫不等於可信，AI 生成也不等於必然錯。人／AI 是來源特徵，不是可信度分數。</w:t>
+        <w:t>例：『延長圖書館開放能提高學習成效。』若只有使用人數，還不能證明學習成效；應補查資料，或把說法縮小。</w:t>
       </w:r>
     </w:p>
     <w:p>
@@ -2161,13 +2098,13 @@
       </w:pPr>
       <w:r>
         <w:rPr>
-          <w:rFonts w:ascii="JetBrains Mono" w:hAnsi="JetBrains Mono" w:eastAsia="Heiti TC"/>
+          <w:rFonts w:ascii="JetBrains Mono" w:hAnsi="JetBrains Mono" w:eastAsia="Arial Unicode MS"/>
           <w:b/>
           <w:i w:val="0"/>
           <w:color w:val="1D4ED8"/>
           <w:sz w:val="22"/>
         </w:rPr>
-        <w:t>W1 / 03</w:t>
+        <w:t>第 1 週 / 第 3 頁</w:t>
       </w:r>
     </w:p>
     <w:p>
@@ -2178,13 +2115,13 @@
       </w:pPr>
       <w:r>
         <w:rPr>
-          <w:rFonts w:ascii="Heiti TC" w:hAnsi="Heiti TC" w:eastAsia="Heiti TC"/>
+          <w:rFonts w:ascii="Arial Unicode MS" w:hAnsi="Arial Unicode MS" w:eastAsia="Arial Unicode MS"/>
           <w:b/>
           <w:i w:val="0"/>
           <w:color w:val="1A2340"/>
           <w:sz w:val="44"/>
         </w:rPr>
-        <w:t>三個原則與課程共創</w:t>
+        <w:t>完成課程任務的三個原則</w:t>
       </w:r>
     </w:p>
     <w:p>
@@ -2195,13 +2132,13 @@
       </w:pPr>
       <w:r>
         <w:rPr>
-          <w:rFonts w:ascii="Heiti TC" w:hAnsi="Heiti TC" w:eastAsia="Heiti TC"/>
+          <w:rFonts w:ascii="Arial Unicode MS" w:hAnsi="Arial Unicode MS" w:eastAsia="Arial Unicode MS"/>
           <w:b w:val="0"/>
           <w:i w:val="0"/>
           <w:color w:val="5B6573"/>
           <w:sz w:val="22"/>
         </w:rPr>
-        <w:t>先修改老師的版本，再用你們的提案決定這門課怎麼練。</w:t>
+        <w:t>尤其使用 AI 時，先修改老師的版本，再一起設計這門課怎麼練。</w:t>
       </w:r>
     </w:p>
     <w:p>
@@ -2212,7 +2149,7 @@
       </w:pPr>
       <w:r>
         <w:rPr>
-          <w:rFonts w:ascii="JetBrains Mono" w:hAnsi="JetBrains Mono" w:eastAsia="Heiti TC"/>
+          <w:rFonts w:ascii="JetBrains Mono" w:hAnsi="JetBrains Mono" w:eastAsia="Arial Unicode MS"/>
           <w:b/>
           <w:i w:val="0"/>
           <w:color w:val="1D4ED8"/>
@@ -2222,7 +2159,7 @@
       </w:r>
       <w:r>
         <w:rPr>
-          <w:rFonts w:ascii="Heiti TC" w:hAnsi="Heiti TC" w:eastAsia="Heiti TC"/>
+          <w:rFonts w:ascii="Arial Unicode MS" w:hAnsi="Arial Unicode MS" w:eastAsia="Arial Unicode MS"/>
           <w:b w:val="0"/>
           <w:i w:val="0"/>
           <w:color w:val="1D4ED8"/>
@@ -2232,7 +2169,7 @@
       </w:r>
       <w:r>
         <w:rPr>
-          <w:rFonts w:ascii="Heiti TC" w:hAnsi="Heiti TC" w:eastAsia="Heiti TC"/>
+          <w:rFonts w:ascii="Arial Unicode MS" w:hAnsi="Arial Unicode MS" w:eastAsia="Arial Unicode MS"/>
           <w:b/>
           <w:i w:val="0"/>
           <w:color w:val="1A2340"/>
@@ -2249,7 +2186,7 @@
       </w:pPr>
       <w:r>
         <w:rPr>
-          <w:rFonts w:ascii="JetBrains Mono" w:hAnsi="JetBrains Mono" w:eastAsia="Heiti TC"/>
+          <w:rFonts w:ascii="JetBrains Mono" w:hAnsi="JetBrains Mono" w:eastAsia="Arial Unicode MS"/>
           <w:b/>
           <w:i w:val="0"/>
           <w:color w:val="1D4ED8"/>
@@ -2259,7 +2196,7 @@
       </w:r>
       <w:r>
         <w:rPr>
-          <w:rFonts w:ascii="Heiti TC" w:hAnsi="Heiti TC" w:eastAsia="Heiti TC"/>
+          <w:rFonts w:ascii="Arial Unicode MS" w:hAnsi="Arial Unicode MS" w:eastAsia="Arial Unicode MS"/>
           <w:b w:val="0"/>
           <w:i w:val="0"/>
           <w:color w:val="1A2340"/>
@@ -2269,13 +2206,13 @@
       </w:r>
       <w:r>
         <w:rPr>
-          <w:rFonts w:ascii="Heiti TC" w:hAnsi="Heiti TC" w:eastAsia="Heiti TC"/>
+          <w:rFonts w:ascii="Arial Unicode MS" w:hAnsi="Arial Unicode MS" w:eastAsia="Arial Unicode MS"/>
           <w:b w:val="0"/>
           <w:i w:val="0"/>
           <w:color w:val="1A2340"/>
           <w:sz w:val="22"/>
         </w:rPr>
-        <w:t>AI 可以提出判斷與理由；你要理解、選擇、查核，並為最後交付負責。</w:t>
+        <w:t>AI 可以給建議；你要看懂、選擇、查證，最後由你負責。</w:t>
       </w:r>
     </w:p>
     <w:p>
@@ -2286,7 +2223,7 @@
       </w:pPr>
       <w:r>
         <w:rPr>
-          <w:rFonts w:ascii="JetBrains Mono" w:hAnsi="JetBrains Mono" w:eastAsia="Heiti TC"/>
+          <w:rFonts w:ascii="JetBrains Mono" w:hAnsi="JetBrains Mono" w:eastAsia="Arial Unicode MS"/>
           <w:b/>
           <w:i w:val="0"/>
           <w:color w:val="1D4ED8"/>
@@ -2296,7 +2233,7 @@
       </w:r>
       <w:r>
         <w:rPr>
-          <w:rFonts w:ascii="Heiti TC" w:hAnsi="Heiti TC" w:eastAsia="Heiti TC"/>
+          <w:rFonts w:ascii="Arial Unicode MS" w:hAnsi="Arial Unicode MS" w:eastAsia="Arial Unicode MS"/>
           <w:b w:val="0"/>
           <w:i w:val="0"/>
           <w:color w:val="1A2340"/>
@@ -2306,13 +2243,13 @@
       </w:r>
       <w:r>
         <w:rPr>
-          <w:rFonts w:ascii="Heiti TC" w:hAnsi="Heiti TC" w:eastAsia="Heiti TC"/>
+          <w:rFonts w:ascii="Arial Unicode MS" w:hAnsi="Arial Unicode MS" w:eastAsia="Arial Unicode MS"/>
           <w:b w:val="0"/>
           <w:i w:val="0"/>
           <w:color w:val="1A2340"/>
           <w:sz w:val="22"/>
         </w:rPr>
-        <w:t>文字流暢不等於真實；主張要能回到來源與證據。</w:t>
+        <w:t>寫得順不一定是真的；重要說法要找得到來源和證據。</w:t>
       </w:r>
     </w:p>
     <w:p>
@@ -2323,7 +2260,7 @@
       </w:pPr>
       <w:r>
         <w:rPr>
-          <w:rFonts w:ascii="JetBrains Mono" w:hAnsi="JetBrains Mono" w:eastAsia="Heiti TC"/>
+          <w:rFonts w:ascii="JetBrains Mono" w:hAnsi="JetBrains Mono" w:eastAsia="Arial Unicode MS"/>
           <w:b/>
           <w:i w:val="0"/>
           <w:color w:val="1D4ED8"/>
@@ -2333,7 +2270,7 @@
       </w:r>
       <w:r>
         <w:rPr>
-          <w:rFonts w:ascii="Heiti TC" w:hAnsi="Heiti TC" w:eastAsia="Heiti TC"/>
+          <w:rFonts w:ascii="Arial Unicode MS" w:hAnsi="Arial Unicode MS" w:eastAsia="Arial Unicode MS"/>
           <w:b w:val="0"/>
           <w:i w:val="0"/>
           <w:color w:val="1A2340"/>
@@ -2343,13 +2280,13 @@
       </w:r>
       <w:r>
         <w:rPr>
-          <w:rFonts w:ascii="Heiti TC" w:hAnsi="Heiti TC" w:eastAsia="Heiti TC"/>
+          <w:rFonts w:ascii="Arial Unicode MS" w:hAnsi="Arial Unicode MS" w:eastAsia="Arial Unicode MS"/>
           <w:b w:val="0"/>
           <w:i w:val="0"/>
           <w:color w:val="1A2340"/>
           <w:sz w:val="22"/>
         </w:rPr>
-        <w:t>表達是交付給真實讀者，也要能接受追問與修正。</w:t>
+        <w:t>把作品交給別人看，就要能回答追問，也願意修改。</w:t>
       </w:r>
     </w:p>
     <w:p>
@@ -2360,7 +2297,7 @@
       </w:pPr>
       <w:r>
         <w:rPr>
-          <w:rFonts w:ascii="Heiti TC" w:hAnsi="Heiti TC" w:eastAsia="Heiti TC"/>
+          <w:rFonts w:ascii="Arial Unicode MS" w:hAnsi="Arial Unicode MS" w:eastAsia="Arial Unicode MS"/>
           <w:b/>
           <w:i w:val="0"/>
           <w:color w:val="1D4ED8"/>
@@ -2370,7 +2307,7 @@
       </w:r>
       <w:r>
         <w:rPr>
-          <w:rFonts w:ascii="Heiti TC" w:hAnsi="Heiti TC" w:eastAsia="Heiti TC"/>
+          <w:rFonts w:ascii="Arial Unicode MS" w:hAnsi="Arial Unicode MS" w:eastAsia="Arial Unicode MS"/>
           <w:b w:val="0"/>
           <w:i w:val="0"/>
           <w:color w:val="7B8491"/>
@@ -2380,7 +2317,7 @@
       </w:r>
       <w:r>
         <w:rPr>
-          <w:rFonts w:ascii="Heiti TC" w:hAnsi="Heiti TC" w:eastAsia="Heiti TC"/>
+          <w:rFonts w:ascii="Arial Unicode MS" w:hAnsi="Arial Unicode MS" w:eastAsia="Arial Unicode MS"/>
           <w:b w:val="0"/>
           <w:i w:val="0"/>
           <w:color w:val="1A2340"/>
@@ -2397,7 +2334,7 @@
       </w:pPr>
       <w:r>
         <w:rPr>
-          <w:rFonts w:ascii="Heiti TC" w:hAnsi="Heiti TC" w:eastAsia="Heiti TC"/>
+          <w:rFonts w:ascii="Arial Unicode MS" w:hAnsi="Arial Unicode MS" w:eastAsia="Arial Unicode MS"/>
           <w:b w:val="0"/>
           <w:i w:val="0"/>
           <w:color w:val="5B6573"/>
@@ -2407,7 +2344,7 @@
       </w:r>
       <w:r>
         <w:rPr>
-          <w:rFonts w:ascii="JetBrains Mono" w:hAnsi="JetBrains Mono" w:eastAsia="Heiti TC"/>
+          <w:rFonts w:ascii="JetBrains Mono" w:hAnsi="JetBrains Mono" w:eastAsia="Arial Unicode MS"/>
           <w:b w:val="0"/>
           <w:i w:val="0"/>
           <w:color w:val="1A2340"/>
@@ -2417,7 +2354,7 @@
       </w:r>
       <w:r>
         <w:rPr>
-          <w:rFonts w:ascii="Heiti TC" w:hAnsi="Heiti TC" w:eastAsia="Heiti TC"/>
+          <w:rFonts w:ascii="Arial Unicode MS" w:hAnsi="Arial Unicode MS" w:eastAsia="Arial Unicode MS"/>
           <w:b w:val="0"/>
           <w:i w:val="0"/>
           <w:color w:val="5B6573"/>
@@ -2506,7 +2443,7 @@
       </w:pPr>
       <w:r>
         <w:rPr>
-          <w:rFonts w:ascii="Heiti TC" w:hAnsi="Heiti TC" w:eastAsia="Heiti TC"/>
+          <w:rFonts w:ascii="Arial Unicode MS" w:hAnsi="Arial Unicode MS" w:eastAsia="Arial Unicode MS"/>
           <w:b w:val="0"/>
           <w:i w:val="0"/>
           <w:color w:val="5B6573"/>
@@ -2595,7 +2532,7 @@
       </w:pPr>
       <w:r>
         <w:rPr>
-          <w:rFonts w:ascii="JetBrains Mono" w:hAnsi="JetBrains Mono" w:eastAsia="Heiti TC"/>
+          <w:rFonts w:ascii="JetBrains Mono" w:hAnsi="JetBrains Mono" w:eastAsia="Arial Unicode MS"/>
           <w:b/>
           <w:i w:val="0"/>
           <w:color w:val="1D4ED8"/>
@@ -2605,7 +2542,7 @@
       </w:r>
       <w:r>
         <w:rPr>
-          <w:rFonts w:ascii="Heiti TC" w:hAnsi="Heiti TC" w:eastAsia="Heiti TC"/>
+          <w:rFonts w:ascii="Arial Unicode MS" w:hAnsi="Arial Unicode MS" w:eastAsia="Arial Unicode MS"/>
           <w:b w:val="0"/>
           <w:i w:val="0"/>
           <w:color w:val="1D4ED8"/>
@@ -2615,13 +2552,13 @@
       </w:r>
       <w:r>
         <w:rPr>
-          <w:rFonts w:ascii="Heiti TC" w:hAnsi="Heiti TC" w:eastAsia="Heiti TC"/>
+          <w:rFonts w:ascii="Arial Unicode MS" w:hAnsi="Arial Unicode MS" w:eastAsia="Arial Unicode MS"/>
           <w:b/>
           <w:i w:val="0"/>
           <w:color w:val="1A2340"/>
           <w:sz w:val="30"/>
         </w:rPr>
-        <w:t>課程共創</w:t>
+        <w:t>一起設計課程活動</w:t>
       </w:r>
     </w:p>
     <w:p>
@@ -2632,13 +2569,13 @@
       </w:pPr>
       <w:r>
         <w:rPr>
-          <w:rFonts w:ascii="Heiti TC" w:hAnsi="Heiti TC" w:eastAsia="Heiti TC"/>
+          <w:rFonts w:ascii="Arial Unicode MS" w:hAnsi="Arial Unicode MS" w:eastAsia="Arial Unicode MS"/>
           <w:b w:val="0"/>
           <w:i w:val="0"/>
           <w:color w:val="5B6573"/>
           <w:sz w:val="22"/>
         </w:rPr>
-        <w:t>每組提出 1–2 個活動，勾選它在練哪個問題，並寫出可見產物。</w:t>
+        <w:t>每組提出 1–2 個活動，勾選它在練哪個問題，並寫出要留下的作品或紀錄。</w:t>
       </w:r>
     </w:p>
     <w:p>
@@ -2649,7 +2586,7 @@
       </w:pPr>
       <w:r>
         <w:rPr>
-          <w:rFonts w:ascii="Heiti TC" w:hAnsi="Heiti TC" w:eastAsia="Heiti TC"/>
+          <w:rFonts w:ascii="Arial Unicode MS" w:hAnsi="Arial Unicode MS" w:eastAsia="Arial Unicode MS"/>
           <w:b/>
           <w:i w:val="0"/>
           <w:color w:val="1D4ED8"/>
@@ -2659,7 +2596,7 @@
       </w:r>
       <w:r>
         <w:rPr>
-          <w:rFonts w:ascii="Heiti TC" w:hAnsi="Heiti TC" w:eastAsia="Heiti TC"/>
+          <w:rFonts w:ascii="Arial Unicode MS" w:hAnsi="Arial Unicode MS" w:eastAsia="Arial Unicode MS"/>
           <w:b w:val="0"/>
           <w:i w:val="0"/>
           <w:color w:val="7B8491"/>
@@ -2669,7 +2606,7 @@
       </w:r>
       <w:r>
         <w:rPr>
-          <w:rFonts w:ascii="Heiti TC" w:hAnsi="Heiti TC" w:eastAsia="Heiti TC"/>
+          <w:rFonts w:ascii="Arial Unicode MS" w:hAnsi="Arial Unicode MS" w:eastAsia="Arial Unicode MS"/>
           <w:b w:val="0"/>
           <w:i w:val="0"/>
           <w:color w:val="1A2340"/>
@@ -2686,7 +2623,7 @@
       </w:pPr>
       <w:r>
         <w:rPr>
-          <w:rFonts w:ascii="Heiti TC" w:hAnsi="Heiti TC" w:eastAsia="Heiti TC"/>
+          <w:rFonts w:ascii="Arial Unicode MS" w:hAnsi="Arial Unicode MS" w:eastAsia="Arial Unicode MS"/>
           <w:b/>
           <w:i w:val="0"/>
           <w:color w:val="1A2340"/>
@@ -2696,7 +2633,7 @@
       </w:r>
       <w:r>
         <w:rPr>
-          <w:rFonts w:ascii="JetBrains Mono" w:hAnsi="JetBrains Mono" w:eastAsia="Heiti TC"/>
+          <w:rFonts w:ascii="JetBrains Mono" w:hAnsi="JetBrains Mono" w:eastAsia="Arial Unicode MS"/>
           <w:b w:val="0"/>
           <w:i w:val="0"/>
           <w:color w:val="5B6573"/>
@@ -2713,7 +2650,7 @@
       </w:pPr>
       <w:r>
         <w:rPr>
-          <w:rFonts w:ascii="Heiti TC" w:hAnsi="Heiti TC" w:eastAsia="Heiti TC"/>
+          <w:rFonts w:ascii="Arial Unicode MS" w:hAnsi="Arial Unicode MS" w:eastAsia="Arial Unicode MS"/>
           <w:b w:val="0"/>
           <w:i w:val="0"/>
           <w:color w:val="5B6573"/>
@@ -2730,13 +2667,13 @@
       </w:pPr>
       <w:r>
         <w:rPr>
-          <w:rFonts w:ascii="Heiti TC" w:hAnsi="Heiti TC" w:eastAsia="Heiti TC"/>
+          <w:rFonts w:ascii="Arial Unicode MS" w:hAnsi="Arial Unicode MS" w:eastAsia="Arial Unicode MS"/>
           <w:b w:val="0"/>
           <w:i w:val="0"/>
           <w:color w:val="5B6573"/>
           <w:sz w:val="22"/>
         </w:rPr>
-        <w:t>做完要留下的證據：</w:t>
+        <w:t>做完要留下的作品或紀錄：</w:t>
       </w:r>
     </w:p>
     <w:tbl>
@@ -2789,7 +2726,7 @@
       </w:pPr>
       <w:r>
         <w:rPr>
-          <w:rFonts w:ascii="Heiti TC" w:hAnsi="Heiti TC" w:eastAsia="Heiti TC"/>
+          <w:rFonts w:ascii="Arial Unicode MS" w:hAnsi="Arial Unicode MS" w:eastAsia="Arial Unicode MS"/>
           <w:b/>
           <w:i w:val="0"/>
           <w:color w:val="1D4ED8"/>
@@ -2799,7 +2736,7 @@
       </w:r>
       <w:r>
         <w:rPr>
-          <w:rFonts w:ascii="Heiti TC" w:hAnsi="Heiti TC" w:eastAsia="Heiti TC"/>
+          <w:rFonts w:ascii="Arial Unicode MS" w:hAnsi="Arial Unicode MS" w:eastAsia="Arial Unicode MS"/>
           <w:b w:val="0"/>
           <w:i w:val="0"/>
           <w:color w:val="7B8491"/>
@@ -2809,7 +2746,7 @@
       </w:r>
       <w:r>
         <w:rPr>
-          <w:rFonts w:ascii="Heiti TC" w:hAnsi="Heiti TC" w:eastAsia="Heiti TC"/>
+          <w:rFonts w:ascii="Arial Unicode MS" w:hAnsi="Arial Unicode MS" w:eastAsia="Arial Unicode MS"/>
           <w:b w:val="0"/>
           <w:i w:val="0"/>
           <w:color w:val="1A2340"/>
@@ -2826,7 +2763,7 @@
       </w:pPr>
       <w:r>
         <w:rPr>
-          <w:rFonts w:ascii="Heiti TC" w:hAnsi="Heiti TC" w:eastAsia="Heiti TC"/>
+          <w:rFonts w:ascii="Arial Unicode MS" w:hAnsi="Arial Unicode MS" w:eastAsia="Arial Unicode MS"/>
           <w:b/>
           <w:i w:val="0"/>
           <w:color w:val="1A2340"/>
@@ -2836,7 +2773,7 @@
       </w:r>
       <w:r>
         <w:rPr>
-          <w:rFonts w:ascii="JetBrains Mono" w:hAnsi="JetBrains Mono" w:eastAsia="Heiti TC"/>
+          <w:rFonts w:ascii="JetBrains Mono" w:hAnsi="JetBrains Mono" w:eastAsia="Arial Unicode MS"/>
           <w:b w:val="0"/>
           <w:i w:val="0"/>
           <w:color w:val="5B6573"/>
@@ -2853,7 +2790,7 @@
       </w:pPr>
       <w:r>
         <w:rPr>
-          <w:rFonts w:ascii="Heiti TC" w:hAnsi="Heiti TC" w:eastAsia="Heiti TC"/>
+          <w:rFonts w:ascii="Arial Unicode MS" w:hAnsi="Arial Unicode MS" w:eastAsia="Arial Unicode MS"/>
           <w:b w:val="0"/>
           <w:i w:val="0"/>
           <w:color w:val="5B6573"/>
@@ -2870,13 +2807,13 @@
       </w:pPr>
       <w:r>
         <w:rPr>
-          <w:rFonts w:ascii="Heiti TC" w:hAnsi="Heiti TC" w:eastAsia="Heiti TC"/>
+          <w:rFonts w:ascii="Arial Unicode MS" w:hAnsi="Arial Unicode MS" w:eastAsia="Arial Unicode MS"/>
           <w:b w:val="0"/>
           <w:i w:val="0"/>
           <w:color w:val="5B6573"/>
           <w:sz w:val="22"/>
         </w:rPr>
-        <w:t>做完要留下的證據：</w:t>
+        <w:t>做完要留下的作品或紀錄：</w:t>
       </w:r>
     </w:p>
     <w:tbl>
@@ -2930,13 +2867,13 @@
       </w:pPr>
       <w:r>
         <w:rPr>
-          <w:rFonts w:ascii="JetBrains Mono" w:hAnsi="JetBrains Mono" w:eastAsia="Heiti TC"/>
+          <w:rFonts w:ascii="JetBrains Mono" w:hAnsi="JetBrains Mono" w:eastAsia="Arial Unicode MS"/>
           <w:b/>
           <w:i w:val="0"/>
           <w:color w:val="1D4ED8"/>
           <w:sz w:val="22"/>
         </w:rPr>
-        <w:t>W1 / 04</w:t>
+        <w:t>第 1 週 / 第 4 頁</w:t>
       </w:r>
     </w:p>
     <w:p>
@@ -2947,13 +2884,13 @@
       </w:pPr>
       <w:r>
         <w:rPr>
-          <w:rFonts w:ascii="Heiti TC" w:hAnsi="Heiti TC" w:eastAsia="Heiti TC"/>
+          <w:rFonts w:ascii="Arial Unicode MS" w:hAnsi="Arial Unicode MS" w:eastAsia="Arial Unicode MS"/>
           <w:b/>
           <w:i w:val="0"/>
           <w:color w:val="1A2340"/>
           <w:sz w:val="44"/>
         </w:rPr>
-        <w:t>隱私、Q3 與 W2 入場</w:t>
+        <w:t>隱私、留給未來的自己、下週準備</w:t>
       </w:r>
     </w:p>
     <w:p>
@@ -2964,13 +2901,13 @@
       </w:pPr>
       <w:r>
         <w:rPr>
-          <w:rFonts w:ascii="Heiti TC" w:hAnsi="Heiti TC" w:eastAsia="Heiti TC"/>
+          <w:rFonts w:ascii="Arial Unicode MS" w:hAnsi="Arial Unicode MS" w:eastAsia="Arial Unicode MS"/>
           <w:b w:val="0"/>
           <w:i w:val="0"/>
           <w:color w:val="5B6573"/>
           <w:sz w:val="22"/>
         </w:rPr>
-        <w:t>先畫安全邊界，再留下現在真正的答案。</w:t>
+        <w:t>這一頁也會收回保管並拍照上傳；不要寫不能交出的隱私。</w:t>
       </w:r>
     </w:p>
     <w:p>
@@ -2981,7 +2918,7 @@
       </w:pPr>
       <w:r>
         <w:rPr>
-          <w:rFonts w:ascii="JetBrains Mono" w:hAnsi="JetBrains Mono" w:eastAsia="Heiti TC"/>
+          <w:rFonts w:ascii="JetBrains Mono" w:hAnsi="JetBrains Mono" w:eastAsia="Arial Unicode MS"/>
           <w:b/>
           <w:i w:val="0"/>
           <w:color w:val="1D4ED8"/>
@@ -2991,7 +2928,7 @@
       </w:r>
       <w:r>
         <w:rPr>
-          <w:rFonts w:ascii="Heiti TC" w:hAnsi="Heiti TC" w:eastAsia="Heiti TC"/>
+          <w:rFonts w:ascii="Arial Unicode MS" w:hAnsi="Arial Unicode MS" w:eastAsia="Arial Unicode MS"/>
           <w:b w:val="0"/>
           <w:i w:val="0"/>
           <w:color w:val="1D4ED8"/>
@@ -3001,13 +2938,13 @@
       </w:r>
       <w:r>
         <w:rPr>
-          <w:rFonts w:ascii="Heiti TC" w:hAnsi="Heiti TC" w:eastAsia="Heiti TC"/>
+          <w:rFonts w:ascii="Arial Unicode MS" w:hAnsi="Arial Unicode MS" w:eastAsia="Arial Unicode MS"/>
           <w:b/>
           <w:i w:val="0"/>
           <w:color w:val="1A2340"/>
           <w:sz w:val="30"/>
         </w:rPr>
-        <w:t>安全邊界</w:t>
+        <w:t>安全規則</w:t>
       </w:r>
     </w:p>
     <w:tbl>
@@ -3048,7 +2985,7 @@
             </w:pPr>
             <w:r>
               <w:rPr>
-                <w:rFonts w:ascii="Heiti TC" w:hAnsi="Heiti TC" w:eastAsia="Heiti TC"/>
+                <w:rFonts w:ascii="Arial Unicode MS" w:hAnsi="Arial Unicode MS" w:eastAsia="Arial Unicode MS"/>
                 <w:b/>
                 <w:i w:val="0"/>
                 <w:color w:val="1D4ED8"/>
@@ -3058,13 +2995,13 @@
             </w:r>
             <w:r>
               <w:rPr>
-                <w:rFonts w:ascii="Heiti TC" w:hAnsi="Heiti TC" w:eastAsia="Heiti TC"/>
+                <w:rFonts w:ascii="Arial Unicode MS" w:hAnsi="Arial Unicode MS" w:eastAsia="Arial Unicode MS"/>
                 <w:b w:val="0"/>
                 <w:i w:val="0"/>
                 <w:color w:val="1A2340"/>
                 <w:sz w:val="22"/>
               </w:rPr>
-              <w:t>個人經驗可改寫、跳過或留白；不因不公開私事扣分。</w:t>
+              <w:t>個人經驗可改寫、跳過或留白；會收回的頁面不寫不能交出的隱私。</w:t>
             </w:r>
           </w:p>
           <w:p>
@@ -3075,7 +3012,7 @@
             </w:pPr>
             <w:r>
               <w:rPr>
-                <w:rFonts w:ascii="Heiti TC" w:hAnsi="Heiti TC" w:eastAsia="Heiti TC"/>
+                <w:rFonts w:ascii="Arial Unicode MS" w:hAnsi="Arial Unicode MS" w:eastAsia="Arial Unicode MS"/>
                 <w:b/>
                 <w:i w:val="0"/>
                 <w:color w:val="1D4ED8"/>
@@ -3085,7 +3022,7 @@
             </w:r>
             <w:r>
               <w:rPr>
-                <w:rFonts w:ascii="Heiti TC" w:hAnsi="Heiti TC" w:eastAsia="Heiti TC"/>
+                <w:rFonts w:ascii="Arial Unicode MS" w:hAnsi="Arial Unicode MS" w:eastAsia="Arial Unicode MS"/>
                 <w:b w:val="0"/>
                 <w:i w:val="0"/>
                 <w:color w:val="1A2340"/>
@@ -3102,7 +3039,7 @@
             </w:pPr>
             <w:r>
               <w:rPr>
-                <w:rFonts w:ascii="Heiti TC" w:hAnsi="Heiti TC" w:eastAsia="Heiti TC"/>
+                <w:rFonts w:ascii="Arial Unicode MS" w:hAnsi="Arial Unicode MS" w:eastAsia="Arial Unicode MS"/>
                 <w:b/>
                 <w:i w:val="0"/>
                 <w:color w:val="1D4ED8"/>
@@ -3112,7 +3049,7 @@
             </w:r>
             <w:r>
               <w:rPr>
-                <w:rFonts w:ascii="Heiti TC" w:hAnsi="Heiti TC" w:eastAsia="Heiti TC"/>
+                <w:rFonts w:ascii="Arial Unicode MS" w:hAnsi="Arial Unicode MS" w:eastAsia="Arial Unicode MS"/>
                 <w:b w:val="0"/>
                 <w:i w:val="0"/>
                 <w:color w:val="1A2340"/>
@@ -3132,7 +3069,7 @@
       </w:pPr>
       <w:r>
         <w:rPr>
-          <w:rFonts w:ascii="JetBrains Mono" w:hAnsi="JetBrains Mono" w:eastAsia="Heiti TC"/>
+          <w:rFonts w:ascii="JetBrains Mono" w:hAnsi="JetBrains Mono" w:eastAsia="Arial Unicode MS"/>
           <w:b/>
           <w:i w:val="0"/>
           <w:color w:val="1D4ED8"/>
@@ -3142,7 +3079,7 @@
       </w:r>
       <w:r>
         <w:rPr>
-          <w:rFonts w:ascii="Heiti TC" w:hAnsi="Heiti TC" w:eastAsia="Heiti TC"/>
+          <w:rFonts w:ascii="Arial Unicode MS" w:hAnsi="Arial Unicode MS" w:eastAsia="Arial Unicode MS"/>
           <w:b w:val="0"/>
           <w:i w:val="0"/>
           <w:color w:val="1D4ED8"/>
@@ -3152,13 +3089,13 @@
       </w:r>
       <w:r>
         <w:rPr>
-          <w:rFonts w:ascii="Heiti TC" w:hAnsi="Heiti TC" w:eastAsia="Heiti TC"/>
+          <w:rFonts w:ascii="Arial Unicode MS" w:hAnsi="Arial Unicode MS" w:eastAsia="Arial Unicode MS"/>
           <w:b/>
           <w:i w:val="0"/>
           <w:color w:val="1A2340"/>
           <w:sz w:val="30"/>
         </w:rPr>
-        <w:t>Q3｜留給未來的自己</w:t>
+        <w:t>留給未來的自己</w:t>
       </w:r>
     </w:p>
     <w:p>
@@ -3169,13 +3106,13 @@
       </w:pPr>
       <w:r>
         <w:rPr>
-          <w:rFonts w:ascii="Heiti TC" w:hAnsi="Heiti TC" w:eastAsia="Heiti TC"/>
+          <w:rFonts w:ascii="Arial Unicode MS" w:hAnsi="Arial Unicode MS" w:eastAsia="Arial Unicode MS"/>
           <w:b w:val="0"/>
           <w:i w:val="0"/>
           <w:color w:val="5B6573"/>
           <w:sz w:val="22"/>
         </w:rPr>
-        <w:t>不計分、不必深刻，也不用假裝完整。寫完保留原樣；想修改時在旁邊補日期。</w:t>
+        <w:t>沒有標準答案，不必深刻，也不用假裝完整。寫完保留原樣；想修改時在旁邊補日期。</w:t>
       </w:r>
     </w:p>
     <w:p>
@@ -3186,17 +3123,17 @@
       </w:pPr>
       <w:r>
         <w:rPr>
-          <w:rFonts w:ascii="Heiti TC" w:hAnsi="Heiti TC" w:eastAsia="Heiti TC"/>
+          <w:rFonts w:ascii="Arial Unicode MS" w:hAnsi="Arial Unicode MS" w:eastAsia="Arial Unicode MS"/>
           <w:b/>
           <w:i w:val="0"/>
           <w:color w:val="5B6573"/>
           <w:sz w:val="22"/>
         </w:rPr>
-        <w:t>自留札記</w:t>
+        <w:t>個人反思</w:t>
       </w:r>
       <w:r>
         <w:rPr>
-          <w:rFonts w:ascii="Heiti TC" w:hAnsi="Heiti TC" w:eastAsia="Heiti TC"/>
+          <w:rFonts w:ascii="Arial Unicode MS" w:hAnsi="Arial Unicode MS" w:eastAsia="Arial Unicode MS"/>
           <w:b w:val="0"/>
           <w:i w:val="0"/>
           <w:color w:val="7B8491"/>
@@ -3206,7 +3143,7 @@
       </w:r>
       <w:r>
         <w:rPr>
-          <w:rFonts w:ascii="Heiti TC" w:hAnsi="Heiti TC" w:eastAsia="Heiti TC"/>
+          <w:rFonts w:ascii="Arial Unicode MS" w:hAnsi="Arial Unicode MS" w:eastAsia="Arial Unicode MS"/>
           <w:b w:val="0"/>
           <w:i w:val="0"/>
           <w:color w:val="1A2340"/>
@@ -3385,7 +3322,7 @@
       </w:pPr>
       <w:r>
         <w:rPr>
-          <w:rFonts w:ascii="JetBrains Mono" w:hAnsi="JetBrains Mono" w:eastAsia="Heiti TC"/>
+          <w:rFonts w:ascii="JetBrains Mono" w:hAnsi="JetBrains Mono" w:eastAsia="Arial Unicode MS"/>
           <w:b/>
           <w:i w:val="0"/>
           <w:color w:val="1D4ED8"/>
@@ -3395,7 +3332,7 @@
       </w:r>
       <w:r>
         <w:rPr>
-          <w:rFonts w:ascii="Heiti TC" w:hAnsi="Heiti TC" w:eastAsia="Heiti TC"/>
+          <w:rFonts w:ascii="Arial Unicode MS" w:hAnsi="Arial Unicode MS" w:eastAsia="Arial Unicode MS"/>
           <w:b w:val="0"/>
           <w:i w:val="0"/>
           <w:color w:val="1D4ED8"/>
@@ -3405,13 +3342,13 @@
       </w:r>
       <w:r>
         <w:rPr>
-          <w:rFonts w:ascii="Heiti TC" w:hAnsi="Heiti TC" w:eastAsia="Heiti TC"/>
+          <w:rFonts w:ascii="Arial Unicode MS" w:hAnsi="Arial Unicode MS" w:eastAsia="Arial Unicode MS"/>
           <w:b/>
           <w:i w:val="0"/>
           <w:color w:val="1A2340"/>
           <w:sz w:val="30"/>
         </w:rPr>
-        <w:t>W2 入場練習｜下週上課前</w:t>
+        <w:t>第 2 週上課前準備</w:t>
       </w:r>
     </w:p>
     <w:p>
@@ -3422,7 +3359,7 @@
       </w:pPr>
       <w:r>
         <w:rPr>
-          <w:rFonts w:ascii="Heiti TC" w:hAnsi="Heiti TC" w:eastAsia="Heiti TC"/>
+          <w:rFonts w:ascii="Arial Unicode MS" w:hAnsi="Arial Unicode MS" w:eastAsia="Arial Unicode MS"/>
           <w:b w:val="0"/>
           <w:i w:val="0"/>
           <w:color w:val="5B6573"/>
@@ -3469,7 +3406,7 @@
             </w:pPr>
             <w:r>
               <w:rPr>
-                <w:rFonts w:ascii="Heiti TC" w:hAnsi="Heiti TC" w:eastAsia="Heiti TC"/>
+                <w:rFonts w:ascii="Arial Unicode MS" w:hAnsi="Arial Unicode MS" w:eastAsia="Arial Unicode MS"/>
                 <w:b w:val="0"/>
                 <w:i w:val="0"/>
                 <w:color w:val="1A2340"/>
@@ -3479,7 +3416,7 @@
             </w:r>
             <w:r>
               <w:rPr>
-                <w:rFonts w:ascii="JetBrains Mono" w:hAnsi="JetBrains Mono" w:eastAsia="Heiti TC"/>
+                <w:rFonts w:ascii="JetBrains Mono" w:hAnsi="JetBrains Mono" w:eastAsia="Arial Unicode MS"/>
                 <w:b/>
                 <w:i w:val="0"/>
                 <w:color w:val="1D4ED8"/>
@@ -3489,7 +3426,7 @@
             </w:r>
             <w:r>
               <w:rPr>
-                <w:rFonts w:ascii="Heiti TC" w:hAnsi="Heiti TC" w:eastAsia="Heiti TC"/>
+                <w:rFonts w:ascii="Arial Unicode MS" w:hAnsi="Arial Unicode MS" w:eastAsia="Arial Unicode MS"/>
                 <w:b w:val="0"/>
                 <w:i w:val="0"/>
                 <w:color w:val="1A2340"/>
@@ -3499,7 +3436,7 @@
             </w:r>
             <w:r>
               <w:rPr>
-                <w:rFonts w:ascii="JetBrains Mono" w:hAnsi="JetBrains Mono" w:eastAsia="Heiti TC"/>
+                <w:rFonts w:ascii="JetBrains Mono" w:hAnsi="JetBrains Mono" w:eastAsia="Arial Unicode MS"/>
                 <w:b/>
                 <w:i w:val="0"/>
                 <w:color w:val="1D4ED8"/>
@@ -3509,7 +3446,7 @@
             </w:r>
             <w:r>
               <w:rPr>
-                <w:rFonts w:ascii="Heiti TC" w:hAnsi="Heiti TC" w:eastAsia="Heiti TC"/>
+                <w:rFonts w:ascii="Arial Unicode MS" w:hAnsi="Arial Unicode MS" w:eastAsia="Arial Unicode MS"/>
                 <w:b w:val="0"/>
                 <w:i w:val="0"/>
                 <w:color w:val="1A2340"/>
@@ -3661,13 +3598,13 @@
       </w:pPr>
       <w:r>
         <w:rPr>
-          <w:rFonts w:ascii="Heiti TC" w:hAnsi="Heiti TC" w:eastAsia="Heiti TC"/>
+          <w:rFonts w:ascii="Arial Unicode MS" w:hAnsi="Arial Unicode MS" w:eastAsia="Arial Unicode MS"/>
           <w:b w:val="0"/>
           <w:i w:val="0"/>
           <w:color w:val="5B6573"/>
           <w:sz w:val="22"/>
         </w:rPr>
-        <w:t>這段不另計分；老師會閱讀並回覆。是否提供下週匿名分享，由你決定。</w:t>
+        <w:t>老師會閱讀並回覆。是否提供下週匿名分享，由你決定。</w:t>
       </w:r>
     </w:p>
     <w:p>
@@ -3678,7 +3615,7 @@
       </w:pPr>
       <w:r>
         <w:rPr>
-          <w:rFonts w:ascii="Heiti TC" w:hAnsi="Heiti TC" w:eastAsia="Heiti TC"/>
+          <w:rFonts w:ascii="Arial Unicode MS" w:hAnsi="Arial Unicode MS" w:eastAsia="Arial Unicode MS"/>
           <w:b/>
           <w:i w:val="0"/>
           <w:color w:val="1A2340"/>
@@ -3698,23 +3635,23 @@
       </w:pPr>
       <w:r>
         <w:rPr>
-          <w:rFonts w:ascii="Heiti TC" w:hAnsi="Heiti TC" w:eastAsia="Heiti TC"/>
+          <w:rFonts w:ascii="Arial Unicode MS" w:hAnsi="Arial Unicode MS" w:eastAsia="Arial Unicode MS"/>
           <w:b/>
           <w:i w:val="0"/>
           <w:color w:val="1D4ED8"/>
           <w:sz w:val="22"/>
         </w:rPr>
-        <w:t xml:space="preserve">保存方式　</w:t>
+        <w:t xml:space="preserve">下課前後　</w:t>
       </w:r>
       <w:r>
         <w:rPr>
-          <w:rFonts w:ascii="Heiti TC" w:hAnsi="Heiti TC" w:eastAsia="Heiti TC"/>
+          <w:rFonts w:ascii="Arial Unicode MS" w:hAnsi="Arial Unicode MS" w:eastAsia="Arial Unicode MS"/>
           <w:b w:val="0"/>
           <w:i w:val="0"/>
           <w:color w:val="5B6573"/>
           <w:sz w:val="22"/>
         </w:rPr>
-        <w:t>Q3 由你保管；老師預設不拍照、不建立具名數位副本。W17／W18 回看時，保留原始答案並補日期。</w:t>
+        <w:t>歷程本交回老師保管，避免遺失；拍自己的頁面上傳 Classroom，作為學習紀錄。第 17／18 週回看時，保留原始答案並補日期。</w:t>
       </w:r>
     </w:p>
     <w:sectPr>
@@ -3739,17 +3676,17 @@
     </w:pPr>
     <w:r>
       <w:rPr>
-        <w:rFonts w:ascii="JetBrains Mono" w:hAnsi="JetBrains Mono" w:eastAsia="Heiti TC"/>
+        <w:rFonts w:ascii="Arial Unicode MS" w:hAnsi="Arial Unicode MS" w:eastAsia="Arial Unicode MS"/>
         <w:b w:val="0"/>
         <w:i w:val="0"/>
         <w:color w:val="7B8491"/>
         <w:sz w:val="18"/>
       </w:rPr>
-      <w:t xml:space="preserve">W1 · FILE-001 · 第 </w:t>
+      <w:t xml:space="preserve">第 1 週 · 學習歷程本 · 第 </w:t>
     </w:r>
     <w:r>
       <w:rPr>
-        <w:rFonts w:ascii="JetBrains Mono" w:hAnsi="JetBrains Mono" w:eastAsia="Heiti TC"/>
+        <w:rFonts w:ascii="JetBrains Mono" w:hAnsi="JetBrains Mono" w:eastAsia="Arial Unicode MS"/>
         <w:b w:val="0"/>
         <w:i w:val="0"/>
         <w:color w:val="7B8491"/>
@@ -3763,7 +3700,7 @@
     </w:r>
     <w:r>
       <w:rPr>
-        <w:rFonts w:ascii="JetBrains Mono" w:hAnsi="JetBrains Mono" w:eastAsia="Heiti TC"/>
+        <w:rFonts w:ascii="JetBrains Mono" w:hAnsi="JetBrains Mono" w:eastAsia="Arial Unicode MS"/>
         <w:b w:val="0"/>
         <w:i w:val="0"/>
         <w:color w:val="7B8491"/>
@@ -3787,24 +3724,24 @@
     </w:pPr>
     <w:r>
       <w:rPr>
-        <w:rFonts w:ascii="JetBrains Mono" w:hAnsi="JetBrains Mono" w:eastAsia="Heiti TC"/>
+        <w:rFonts w:ascii="Arial Unicode MS" w:hAnsi="Arial Unicode MS" w:eastAsia="Arial Unicode MS"/>
         <w:b/>
         <w:i w:val="0"/>
         <w:color w:val="7B8491"/>
         <w:sz w:val="18"/>
       </w:rPr>
-      <w:t>R.I.B. / W1 / FILE-001</w:t>
+      <w:t>閱讀理解與表達 / 第 1 週</w:t>
     </w:r>
     <w:r>
       <w:rPr>
-        <w:rFonts w:ascii="Heiti TC" w:hAnsi="Heiti TC" w:eastAsia="Heiti TC"/>
+        <w:rFonts w:ascii="Arial Unicode MS" w:hAnsi="Arial Unicode MS" w:eastAsia="Arial Unicode MS"/>
         <w:b w:val="0"/>
         <w:i w:val="0"/>
         <w:color w:val="7B8491"/>
         <w:sz w:val="18"/>
       </w:rPr>
       <w:tab/>
-      <w:t>閱讀理解與表達 · 歷程本</w:t>
+      <w:t>學習歷程本</w:t>
     </w:r>
   </w:p>
 </w:hdr>
@@ -4177,7 +4114,7 @@
       <w:spacing w:after="100" w:line="293" w:lineRule="auto"/>
     </w:pPr>
     <w:rPr>
-      <w:rFonts w:ascii="Heiti TC" w:hAnsi="Heiti TC" w:eastAsia="Heiti TC"/>
+      <w:rFonts w:ascii="Arial Unicode MS" w:hAnsi="Arial Unicode MS" w:eastAsia="Arial Unicode MS"/>
       <w:color w:val="1A2340"/>
       <w:sz w:val="22"/>
     </w:rPr>

</xml_diff>

<commit_message>
feat: simplify W1 assessment and evidence flow
</commit_message>
<xml_diff>
--- a/worksheets/W1.docx
+++ b/worksheets/W1.docx
@@ -146,154 +146,6 @@
         <w:keepNext/>
         <w:keepLines w:val="0"/>
         <w:spacing w:before="40" w:after="100" w:line="293" w:lineRule="auto"/>
-      </w:pPr>
-      <w:r>
-        <w:rPr>
-          <w:rFonts w:ascii="Arial Unicode MS" w:hAnsi="Arial Unicode MS" w:eastAsia="Arial Unicode MS"/>
-          <w:b/>
-          <w:i w:val="0"/>
-          <w:color w:val="1A2340"/>
-          <w:sz w:val="30"/>
-        </w:rPr>
-        <w:t>作業、評量與使用方式</w:t>
-      </w:r>
-    </w:p>
-    <w:p>
-      <w:pPr>
-        <w:keepNext w:val="0"/>
-        <w:keepLines w:val="0"/>
-        <w:spacing w:before="0" w:after="100" w:line="293" w:lineRule="auto"/>
-      </w:pPr>
-      <w:r>
-        <w:rPr>
-          <w:rFonts w:ascii="Arial Unicode MS" w:hAnsi="Arial Unicode MS" w:eastAsia="Arial Unicode MS"/>
-          <w:b w:val="0"/>
-          <w:i w:val="0"/>
-          <w:color w:val="5B6573"/>
-          <w:sz w:val="22"/>
-        </w:rPr>
-        <w:t>先懂概念：平時留下學習過程，指定週次才做正式評量。</w:t>
-      </w:r>
-    </w:p>
-    <w:tbl>
-      <w:tblPr>
-        <w:tblW w:type="dxa" w:w="9865"/>
-        <w:jc w:val="left"/>
-        <w:tblLayout w:type="fixed"/>
-        <w:tblLook w:firstColumn="1" w:firstRow="1" w:lastColumn="0" w:lastRow="0" w:noHBand="0" w:noVBand="1" w:val="04A0"/>
-        <w:tblInd w:type="dxa" w:w="0"/>
-      </w:tblPr>
-      <w:tblGrid>
-        <w:gridCol w:w="9865"/>
-      </w:tblGrid>
-      <w:tr>
-        <w:tc>
-          <w:tcPr>
-            <w:tcW w:type="dxa" w:w="9865"/>
-            <w:tcMar>
-              <w:top w:w="100" w:type="dxa"/>
-              <w:start w:w="150" w:type="dxa"/>
-              <w:bottom w:w="100" w:type="dxa"/>
-              <w:end w:w="150" w:type="dxa"/>
-            </w:tcMar>
-            <w:tcBorders>
-              <w:top w:val="nil"/>
-              <w:bottom w:val="nil"/>
-              <w:start w:val="single" w:sz="14" w:space="0" w:color="1D4ED8"/>
-              <w:end w:val="nil"/>
-            </w:tcBorders>
-            <w:shd w:val="clear" w:color="auto" w:fill="F5F7FA"/>
-            <w:vAlign w:val="center"/>
-          </w:tcPr>
-          <w:p>
-            <w:pPr>
-              <w:keepNext w:val="0"/>
-              <w:keepLines w:val="0"/>
-              <w:spacing w:before="0" w:after="80" w:line="293" w:lineRule="auto"/>
-            </w:pPr>
-            <w:r>
-              <w:rPr>
-                <w:rFonts w:ascii="Arial Unicode MS" w:hAnsi="Arial Unicode MS" w:eastAsia="Arial Unicode MS"/>
-                <w:b/>
-                <w:i w:val="0"/>
-                <w:color w:val="1D4ED8"/>
-                <w:sz w:val="22"/>
-              </w:rPr>
-              <w:t>正式評量</w:t>
-            </w:r>
-            <w:r>
-              <w:rPr>
-                <w:rFonts w:ascii="Arial Unicode MS" w:hAnsi="Arial Unicode MS" w:eastAsia="Arial Unicode MS"/>
-                <w:b w:val="0"/>
-                <w:i w:val="0"/>
-                <w:color w:val="1A2340"/>
-                <w:sz w:val="22"/>
-              </w:rPr>
-              <w:t xml:space="preserve">　全學期有七次，合計 100 分；每次都會先說清楚要求。</w:t>
-            </w:r>
-          </w:p>
-          <w:p>
-            <w:pPr>
-              <w:keepNext w:val="0"/>
-              <w:keepLines w:val="0"/>
-              <w:spacing w:before="0" w:after="80" w:line="293" w:lineRule="auto"/>
-            </w:pPr>
-            <w:r>
-              <w:rPr>
-                <w:rFonts w:ascii="Arial Unicode MS" w:hAnsi="Arial Unicode MS" w:eastAsia="Arial Unicode MS"/>
-                <w:b/>
-                <w:i w:val="0"/>
-                <w:color w:val="1D4ED8"/>
-                <w:sz w:val="22"/>
-              </w:rPr>
-              <w:t>學習關卡</w:t>
-            </w:r>
-            <w:r>
-              <w:rPr>
-                <w:rFonts w:ascii="Arial Unicode MS" w:hAnsi="Arial Unicode MS" w:eastAsia="Arial Unicode MS"/>
-                <w:b w:val="0"/>
-                <w:i w:val="0"/>
-                <w:color w:val="1A2340"/>
-                <w:sz w:val="22"/>
-              </w:rPr>
-              <w:t xml:space="preserve">　只檢查紀錄齊不齊；需要補充就補，不直接扣分。</w:t>
-            </w:r>
-          </w:p>
-          <w:p>
-            <w:pPr>
-              <w:keepNext w:val="0"/>
-              <w:keepLines w:val="0"/>
-              <w:spacing w:before="0" w:after="0" w:line="293" w:lineRule="auto"/>
-            </w:pPr>
-            <w:r>
-              <w:rPr>
-                <w:rFonts w:ascii="Arial Unicode MS" w:hAnsi="Arial Unicode MS" w:eastAsia="Arial Unicode MS"/>
-                <w:b/>
-                <w:i w:val="0"/>
-                <w:color w:val="1D4ED8"/>
-                <w:sz w:val="22"/>
-              </w:rPr>
-              <w:t>個人限時任務</w:t>
-            </w:r>
-            <w:r>
-              <w:rPr>
-                <w:rFonts w:ascii="Arial Unicode MS" w:hAnsi="Arial Unicode MS" w:eastAsia="Arial Unicode MS"/>
-                <w:b w:val="0"/>
-                <w:i w:val="0"/>
-                <w:color w:val="1A2340"/>
-                <w:sz w:val="22"/>
-              </w:rPr>
-              <w:t xml:space="preserve">　三次不用 AI、不討論的任務，另外看你能否獨立完成；不改寫已取得的總分。</w:t>
-            </w:r>
-          </w:p>
-        </w:tc>
-      </w:tr>
-    </w:tbl>
-    <w:p>
-      <w:pPr>
-        <w:keepNext/>
-        <w:keepLines w:val="0"/>
-        <w:spacing w:before="100" w:after="100" w:line="293" w:lineRule="auto"/>
       </w:pPr>
       <w:r>
         <w:rPr>
@@ -1191,36 +1043,6 @@
           </w:tcPr>
           <w:p>
             <w:pPr>
-              <w:spacing w:before="0" w:after="0" w:line="240" w:lineRule="auto"/>
-            </w:pPr>
-            <w:r>
-              <w:t xml:space="preserve"> </w:t>
-            </w:r>
-          </w:p>
-        </w:tc>
-      </w:tr>
-      <w:tr>
-        <w:trPr>
-          <w:trHeight w:val="510" w:hRule="atLeast"/>
-        </w:trPr>
-        <w:tc>
-          <w:tcPr>
-            <w:tcW w:type="dxa" w:w="9865"/>
-            <w:tcMar>
-              <w:top w:w="0" w:type="dxa"/>
-              <w:start w:w="0" w:type="dxa"/>
-              <w:bottom w:w="0" w:type="dxa"/>
-              <w:end w:w="0" w:type="dxa"/>
-            </w:tcMar>
-            <w:tcBorders>
-              <w:top w:val="nil"/>
-              <w:bottom w:val="single" w:sz="5" w:space="0" w:color="CBD5E1"/>
-              <w:start w:val="nil"/>
-              <w:end w:val="nil"/>
-            </w:tcBorders>
-          </w:tcPr>
-          <w:p>
-            <w:pPr>
               <w:spacing w:before="0" w:after="60" w:line="240" w:lineRule="auto"/>
             </w:pPr>
             <w:r>
@@ -1330,7 +1152,7 @@
       <w:pPr>
         <w:keepNext/>
         <w:keepLines w:val="0"/>
-        <w:pageBreakBefore w:val="0"/>
+        <w:pageBreakBefore/>
         <w:spacing w:before="0" w:after="60" w:line="293" w:lineRule="auto"/>
       </w:pPr>
       <w:r>
@@ -1554,7 +1376,7 @@
       </w:tr>
       <w:tr>
         <w:trPr>
-          <w:trHeight w:val="794" w:hRule="atLeast"/>
+          <w:trHeight w:val="680" w:hRule="atLeast"/>
         </w:trPr>
         <w:tc>
           <w:tcPr>
@@ -1615,7 +1437,7 @@
       </w:tr>
       <w:tr>
         <w:trPr>
-          <w:trHeight w:val="794" w:hRule="atLeast"/>
+          <w:trHeight w:val="680" w:hRule="atLeast"/>
         </w:trPr>
         <w:tc>
           <w:tcPr>
@@ -1676,7 +1498,7 @@
       </w:tr>
       <w:tr>
         <w:trPr>
-          <w:trHeight w:val="794" w:hRule="atLeast"/>
+          <w:trHeight w:val="680" w:hRule="atLeast"/>
         </w:trPr>
         <w:tc>
           <w:tcPr>
@@ -1764,36 +1586,6 @@
       <w:tblGrid>
         <w:gridCol w:w="9865"/>
       </w:tblGrid>
-      <w:tr>
-        <w:trPr>
-          <w:trHeight w:val="482" w:hRule="atLeast"/>
-        </w:trPr>
-        <w:tc>
-          <w:tcPr>
-            <w:tcW w:type="dxa" w:w="9865"/>
-            <w:tcMar>
-              <w:top w:w="0" w:type="dxa"/>
-              <w:start w:w="0" w:type="dxa"/>
-              <w:bottom w:w="0" w:type="dxa"/>
-              <w:end w:w="0" w:type="dxa"/>
-            </w:tcMar>
-            <w:tcBorders>
-              <w:top w:val="nil"/>
-              <w:bottom w:val="single" w:sz="5" w:space="0" w:color="CBD5E1"/>
-              <w:start w:val="nil"/>
-              <w:end w:val="nil"/>
-            </w:tcBorders>
-          </w:tcPr>
-          <w:p>
-            <w:pPr>
-              <w:spacing w:before="0" w:after="0" w:line="240" w:lineRule="auto"/>
-            </w:pPr>
-            <w:r>
-              <w:t xml:space="preserve"> </w:t>
-            </w:r>
-          </w:p>
-        </w:tc>
-      </w:tr>
       <w:tr>
         <w:trPr>
           <w:trHeight w:val="482" w:hRule="atLeast"/>
@@ -2907,7 +2699,7 @@
           <w:color w:val="5B6573"/>
           <w:sz w:val="22"/>
         </w:rPr>
-        <w:t>這一頁也會收回保管並拍照上傳；不要寫不能交出的隱私。</w:t>
+        <w:t>這一頁會收回保管並拍照上傳；碰到私人內容時，先看安全規則。</w:t>
       </w:r>
     </w:p>
     <w:p>
@@ -2945,6 +2737,23 @@
           <w:sz w:val="30"/>
         </w:rPr>
         <w:t>安全規則</w:t>
+      </w:r>
+    </w:p>
+    <w:p>
+      <w:pPr>
+        <w:keepNext w:val="0"/>
+        <w:keepLines w:val="0"/>
+        <w:spacing w:before="0" w:after="40" w:line="293" w:lineRule="auto"/>
+      </w:pPr>
+      <w:r>
+        <w:rPr>
+          <w:rFonts w:ascii="Arial Unicode MS" w:hAnsi="Arial Unicode MS" w:eastAsia="Arial Unicode MS"/>
+          <w:b w:val="0"/>
+          <w:i w:val="0"/>
+          <w:color w:val="5B6573"/>
+          <w:sz w:val="20"/>
+        </w:rPr>
+        <w:t>適用於：寫個人經驗、輸入 AI、拍照上傳、交換或公開。</w:t>
       </w:r>
     </w:p>
     <w:tbl>
@@ -2991,7 +2800,7 @@
                 <w:color w:val="1D4ED8"/>
                 <w:sz w:val="22"/>
               </w:rPr>
-              <w:t xml:space="preserve">可以選擇　</w:t>
+              <w:t xml:space="preserve">可改寫或留白　</w:t>
             </w:r>
             <w:r>
               <w:rPr>
@@ -3001,7 +2810,7 @@
                 <w:color w:val="1A2340"/>
                 <w:sz w:val="22"/>
               </w:rPr>
-              <w:t>個人經驗可改寫、跳過或留白；會收回的頁面不寫不能交出的隱私。</w:t>
+              <w:t>不想寫的經驗，可換例子、用代稱或留白。</w:t>
             </w:r>
           </w:p>
           <w:p>
@@ -3018,7 +2827,7 @@
                 <w:color w:val="1D4ED8"/>
                 <w:sz w:val="22"/>
               </w:rPr>
-              <w:t xml:space="preserve">不要輸入　</w:t>
+              <w:t xml:space="preserve">不貼進 AI　</w:t>
             </w:r>
             <w:r>
               <w:rPr>
@@ -3028,7 +2837,34 @@
                 <w:color w:val="1A2340"/>
                 <w:sz w:val="22"/>
               </w:rPr>
-              <w:t>家庭、感情、身心、同學私事與別人的姓名不要交給 AI。</w:t>
+              <w:t>家庭、感情、身心、同學私事與真實姓名不貼進 AI。</w:t>
+            </w:r>
+          </w:p>
+          <w:p>
+            <w:pPr>
+              <w:keepNext w:val="0"/>
+              <w:keepLines w:val="0"/>
+              <w:spacing w:before="0" w:after="80" w:line="293" w:lineRule="auto"/>
+            </w:pPr>
+            <w:r>
+              <w:rPr>
+                <w:rFonts w:ascii="Arial Unicode MS" w:hAnsi="Arial Unicode MS" w:eastAsia="Arial Unicode MS"/>
+                <w:b/>
+                <w:i w:val="0"/>
+                <w:color w:val="1D4ED8"/>
+                <w:sz w:val="22"/>
+              </w:rPr>
+              <w:t xml:space="preserve">分享再問一次　</w:t>
+            </w:r>
+            <w:r>
+              <w:rPr>
+                <w:rFonts w:ascii="Arial Unicode MS" w:hAnsi="Arial Unicode MS" w:eastAsia="Arial Unicode MS"/>
+                <w:b w:val="0"/>
+                <w:i w:val="0"/>
+                <w:color w:val="1A2340"/>
+                <w:sz w:val="22"/>
+              </w:rPr>
+              <w:t>交作業不等於同意公開；交換或公開前再問本人。</w:t>
             </w:r>
           </w:p>
           <w:p>
@@ -3045,7 +2881,7 @@
                 <w:color w:val="1D4ED8"/>
                 <w:sz w:val="22"/>
               </w:rPr>
-              <w:t xml:space="preserve">分享另問　</w:t>
+              <w:t xml:space="preserve">只談內容　</w:t>
             </w:r>
             <w:r>
               <w:rPr>
@@ -3055,7 +2891,7 @@
                 <w:color w:val="1A2340"/>
                 <w:sz w:val="22"/>
               </w:rPr>
-              <w:t>課堂指定交換才交換；公開分享要另外同意。</w:t>
+              <w:t>只談句子、來源和理由，不追問、嘲笑或傳播私事。</w:t>
             </w:r>
           </w:p>
         </w:tc>
@@ -3163,66 +2999,6 @@
       <w:tblGrid>
         <w:gridCol w:w="9865"/>
       </w:tblGrid>
-      <w:tr>
-        <w:trPr>
-          <w:trHeight w:val="482" w:hRule="atLeast"/>
-        </w:trPr>
-        <w:tc>
-          <w:tcPr>
-            <w:tcW w:type="dxa" w:w="9865"/>
-            <w:tcMar>
-              <w:top w:w="0" w:type="dxa"/>
-              <w:start w:w="0" w:type="dxa"/>
-              <w:bottom w:w="0" w:type="dxa"/>
-              <w:end w:w="0" w:type="dxa"/>
-            </w:tcMar>
-            <w:tcBorders>
-              <w:top w:val="nil"/>
-              <w:bottom w:val="single" w:sz="5" w:space="0" w:color="CBD5E1"/>
-              <w:start w:val="nil"/>
-              <w:end w:val="nil"/>
-            </w:tcBorders>
-          </w:tcPr>
-          <w:p>
-            <w:pPr>
-              <w:spacing w:before="0" w:after="0" w:line="240" w:lineRule="auto"/>
-            </w:pPr>
-            <w:r>
-              <w:t xml:space="preserve"> </w:t>
-            </w:r>
-          </w:p>
-        </w:tc>
-      </w:tr>
-      <w:tr>
-        <w:trPr>
-          <w:trHeight w:val="482" w:hRule="atLeast"/>
-        </w:trPr>
-        <w:tc>
-          <w:tcPr>
-            <w:tcW w:type="dxa" w:w="9865"/>
-            <w:tcMar>
-              <w:top w:w="0" w:type="dxa"/>
-              <w:start w:w="0" w:type="dxa"/>
-              <w:bottom w:w="0" w:type="dxa"/>
-              <w:end w:w="0" w:type="dxa"/>
-            </w:tcMar>
-            <w:tcBorders>
-              <w:top w:val="nil"/>
-              <w:bottom w:val="single" w:sz="5" w:space="0" w:color="CBD5E1"/>
-              <w:start w:val="nil"/>
-              <w:end w:val="nil"/>
-            </w:tcBorders>
-          </w:tcPr>
-          <w:p>
-            <w:pPr>
-              <w:spacing w:before="0" w:after="0" w:line="240" w:lineRule="auto"/>
-            </w:pPr>
-            <w:r>
-              <w:t xml:space="preserve"> </w:t>
-            </w:r>
-          </w:p>
-        </w:tc>
-      </w:tr>
       <w:tr>
         <w:trPr>
           <w:trHeight w:val="482" w:hRule="atLeast"/>
@@ -3551,36 +3327,6 @@
           </w:tcPr>
           <w:p>
             <w:pPr>
-              <w:spacing w:before="0" w:after="0" w:line="240" w:lineRule="auto"/>
-            </w:pPr>
-            <w:r>
-              <w:t xml:space="preserve"> </w:t>
-            </w:r>
-          </w:p>
-        </w:tc>
-      </w:tr>
-      <w:tr>
-        <w:trPr>
-          <w:trHeight w:val="482" w:hRule="atLeast"/>
-        </w:trPr>
-        <w:tc>
-          <w:tcPr>
-            <w:tcW w:type="dxa" w:w="9865"/>
-            <w:tcMar>
-              <w:top w:w="0" w:type="dxa"/>
-              <w:start w:w="0" w:type="dxa"/>
-              <w:bottom w:w="0" w:type="dxa"/>
-              <w:end w:w="0" w:type="dxa"/>
-            </w:tcMar>
-            <w:tcBorders>
-              <w:top w:val="nil"/>
-              <w:bottom w:val="single" w:sz="5" w:space="0" w:color="CBD5E1"/>
-              <w:start w:val="nil"/>
-              <w:end w:val="nil"/>
-            </w:tcBorders>
-          </w:tcPr>
-          <w:p>
-            <w:pPr>
               <w:spacing w:before="0" w:after="40" w:line="240" w:lineRule="auto"/>
             </w:pPr>
             <w:r>
@@ -3628,7 +3374,7 @@
       <w:pPr>
         <w:keepNext w:val="0"/>
         <w:keepLines w:val="0"/>
-        <w:spacing w:before="40" w:after="0" w:line="293" w:lineRule="auto"/>
+        <w:spacing w:before="20" w:after="0" w:line="293" w:lineRule="auto"/>
         <w:pBdr>
           <w:left w:val="single" w:sz="10" w:space="5" w:color="1D4ED8"/>
         </w:pBdr>
@@ -3641,7 +3387,7 @@
           <w:color w:val="1D4ED8"/>
           <w:sz w:val="22"/>
         </w:rPr>
-        <w:t xml:space="preserve">下課前後　</w:t>
+        <w:t xml:space="preserve">最後兩分鐘　</w:t>
       </w:r>
       <w:r>
         <w:rPr>
@@ -3651,7 +3397,24 @@
           <w:color w:val="5B6573"/>
           <w:sz w:val="22"/>
         </w:rPr>
-        <w:t>歷程本交回老師保管，避免遺失；拍自己的頁面上傳 Classroom，作為學習紀錄。第 17／18 週回看時，保留原始答案並補日期。</w:t>
+        <w:t>① 圈出或畫星號：今天最能看出你怎麼想的一個地方。　② 在旁邊寫：下次遇到類似問題，我會先＿＿＿＿。</w:t>
+      </w:r>
+    </w:p>
+    <w:p>
+      <w:pPr>
+        <w:keepNext w:val="0"/>
+        <w:keepLines w:val="0"/>
+        <w:spacing w:before="40" w:after="0" w:line="293" w:lineRule="auto"/>
+      </w:pPr>
+      <w:r>
+        <w:rPr>
+          <w:rFonts w:ascii="Arial Unicode MS" w:hAnsi="Arial Unicode MS" w:eastAsia="Arial Unicode MS"/>
+          <w:b w:val="0"/>
+          <w:i w:val="0"/>
+          <w:color w:val="5B6573"/>
+          <w:sz w:val="20"/>
+        </w:rPr>
+        <w:t>拍自己的頁面上傳原有的 Classroom 作業；紙本下課前交回，由老師保管。</w:t>
       </w:r>
     </w:p>
     <w:sectPr>

</xml_diff>

<commit_message>
feat: complete 18-week SOIL course revision
</commit_message>
<xml_diff>
--- a/worksheets/W1.docx
+++ b/worksheets/W1.docx
@@ -1180,7 +1180,7 @@
           <w:color w:val="1A2340"/>
           <w:sz w:val="44"/>
         </w:rPr>
-        <w:t>閱讀、理解、表達</w:t>
+        <w:t>同一句話，問三次</w:t>
       </w:r>
     </w:p>
     <w:p>
@@ -1197,559 +1197,9 @@
           <w:color w:val="5B6573"/>
           <w:sz w:val="22"/>
         </w:rPr>
-        <w:t>先看 AI 在這三個學習動作上能做什麼，再決定哪些事仍要由自己判斷與負責。</w:t>
+        <w:t>先用圖書館提案練；課末再回這頁試班群訊息。</w:t>
       </w:r>
     </w:p>
-    <w:p>
-      <w:pPr>
-        <w:keepNext/>
-        <w:keepLines w:val="0"/>
-        <w:spacing w:before="80" w:after="100" w:line="293" w:lineRule="auto"/>
-      </w:pPr>
-      <w:r>
-        <w:rPr>
-          <w:rFonts w:ascii="JetBrains Mono" w:hAnsi="JetBrains Mono" w:eastAsia="Arial Unicode MS"/>
-          <w:b/>
-          <w:i w:val="0"/>
-          <w:color w:val="1D4ED8"/>
-          <w:sz w:val="30"/>
-        </w:rPr>
-        <w:t>02</w:t>
-      </w:r>
-      <w:r>
-        <w:rPr>
-          <w:rFonts w:ascii="Arial Unicode MS" w:hAnsi="Arial Unicode MS" w:eastAsia="Arial Unicode MS"/>
-          <w:b w:val="0"/>
-          <w:i w:val="0"/>
-          <w:color w:val="1D4ED8"/>
-          <w:sz w:val="30"/>
-        </w:rPr>
-        <w:t xml:space="preserve">  </w:t>
-      </w:r>
-      <w:r>
-        <w:rPr>
-          <w:rFonts w:ascii="Arial Unicode MS" w:hAnsi="Arial Unicode MS" w:eastAsia="Arial Unicode MS"/>
-          <w:b/>
-          <w:i w:val="0"/>
-          <w:color w:val="1A2340"/>
-          <w:sz w:val="30"/>
-        </w:rPr>
-        <w:t>三個學習動作</w:t>
-      </w:r>
-    </w:p>
-    <w:p>
-      <w:pPr>
-        <w:keepNext w:val="0"/>
-        <w:keepLines w:val="0"/>
-        <w:spacing w:before="0" w:after="100" w:line="293" w:lineRule="auto"/>
-      </w:pPr>
-      <w:r>
-        <w:rPr>
-          <w:rFonts w:ascii="Arial Unicode MS" w:hAnsi="Arial Unicode MS" w:eastAsia="Arial Unicode MS"/>
-          <w:b w:val="0"/>
-          <w:i w:val="0"/>
-          <w:color w:val="1A2340"/>
-          <w:sz w:val="22"/>
-        </w:rPr>
-        <w:t>閱讀＝接收資訊　｜　理解＝整理、連結與判斷　｜　表達＝重新組織並說清楚</w:t>
-      </w:r>
-    </w:p>
-    <w:p>
-      <w:pPr>
-        <w:keepNext/>
-        <w:keepLines w:val="0"/>
-        <w:spacing w:before="0" w:after="40" w:line="293" w:lineRule="auto"/>
-      </w:pPr>
-      <w:r>
-        <w:rPr>
-          <w:rFonts w:ascii="Arial Unicode MS" w:hAnsi="Arial Unicode MS" w:eastAsia="Arial Unicode MS"/>
-          <w:b/>
-          <w:i w:val="0"/>
-          <w:color w:val="5B6573"/>
-          <w:sz w:val="22"/>
-        </w:rPr>
-        <w:t>小組討論</w:t>
-      </w:r>
-      <w:r>
-        <w:rPr>
-          <w:rFonts w:ascii="Arial Unicode MS" w:hAnsi="Arial Unicode MS" w:eastAsia="Arial Unicode MS"/>
-          <w:b w:val="0"/>
-          <w:i w:val="0"/>
-          <w:color w:val="7B8491"/>
-          <w:sz w:val="22"/>
-        </w:rPr>
-        <w:t xml:space="preserve">  ｜  </w:t>
-      </w:r>
-      <w:r>
-        <w:rPr>
-          <w:rFonts w:ascii="Arial Unicode MS" w:hAnsi="Arial Unicode MS" w:eastAsia="Arial Unicode MS"/>
-          <w:b w:val="0"/>
-          <w:i w:val="0"/>
-          <w:color w:val="1A2340"/>
-          <w:sz w:val="22"/>
-        </w:rPr>
-        <w:t>AI 在這三件事上表現如何？</w:t>
-      </w:r>
-    </w:p>
-    <w:tbl>
-      <w:tblPr>
-        <w:tblW w:type="dxa" w:w="9865"/>
-        <w:jc w:val="left"/>
-        <w:tblLayout w:type="fixed"/>
-        <w:tblLook w:firstColumn="1" w:firstRow="1" w:lastColumn="0" w:lastRow="0" w:noHBand="0" w:noVBand="1" w:val="04A0"/>
-        <w:tblInd w:type="dxa" w:w="0"/>
-      </w:tblPr>
-      <w:tblGrid>
-        <w:gridCol w:w="1950"/>
-        <w:gridCol w:w="7915"/>
-      </w:tblGrid>
-      <w:tr>
-        <w:trPr>
-          <w:trHeight w:val="454" w:hRule="atLeast"/>
-        </w:trPr>
-        <w:tc>
-          <w:tcPr>
-            <w:tcW w:type="dxa" w:w="1950"/>
-            <w:vAlign w:val="center"/>
-            <w:tcMar>
-              <w:top w:w="75" w:type="dxa"/>
-              <w:start w:w="100" w:type="dxa"/>
-              <w:bottom w:w="75" w:type="dxa"/>
-              <w:end w:w="100" w:type="dxa"/>
-            </w:tcMar>
-            <w:tcBorders>
-              <w:top w:val="nil"/>
-              <w:bottom w:val="single" w:sz="6" w:space="0" w:color="CBD5E1"/>
-              <w:start w:val="nil"/>
-              <w:end w:val="single" w:sz="4" w:space="0" w:color="CBD5E1"/>
-            </w:tcBorders>
-          </w:tcPr>
-          <w:p>
-            <w:pPr>
-              <w:spacing w:after="0" w:line="293" w:lineRule="auto"/>
-            </w:pPr>
-            <w:r>
-              <w:rPr>
-                <w:rFonts w:ascii="Arial Unicode MS" w:hAnsi="Arial Unicode MS" w:eastAsia="Arial Unicode MS"/>
-                <w:b/>
-                <w:i w:val="0"/>
-                <w:color w:val="1D4ED8"/>
-                <w:sz w:val="22"/>
-              </w:rPr>
-              <w:t>學習動作</w:t>
-            </w:r>
-          </w:p>
-        </w:tc>
-        <w:tc>
-          <w:tcPr>
-            <w:tcW w:type="dxa" w:w="7915"/>
-            <w:vAlign w:val="center"/>
-            <w:tcMar>
-              <w:top w:w="75" w:type="dxa"/>
-              <w:start w:w="100" w:type="dxa"/>
-              <w:bottom w:w="75" w:type="dxa"/>
-              <w:end w:w="100" w:type="dxa"/>
-            </w:tcMar>
-            <w:tcBorders>
-              <w:top w:val="nil"/>
-              <w:bottom w:val="single" w:sz="6" w:space="0" w:color="CBD5E1"/>
-              <w:start w:val="nil"/>
-              <w:end w:val="nil"/>
-            </w:tcBorders>
-          </w:tcPr>
-          <w:p>
-            <w:pPr>
-              <w:spacing w:after="0" w:line="293" w:lineRule="auto"/>
-            </w:pPr>
-            <w:r>
-              <w:rPr>
-                <w:rFonts w:ascii="Arial Unicode MS" w:hAnsi="Arial Unicode MS" w:eastAsia="Arial Unicode MS"/>
-                <w:b/>
-                <w:i w:val="0"/>
-                <w:color w:val="1D4ED8"/>
-                <w:sz w:val="22"/>
-              </w:rPr>
-              <w:t>我的觀察</w:t>
-            </w:r>
-          </w:p>
-        </w:tc>
-      </w:tr>
-      <w:tr>
-        <w:trPr>
-          <w:trHeight w:val="680" w:hRule="atLeast"/>
-        </w:trPr>
-        <w:tc>
-          <w:tcPr>
-            <w:tcW w:type="dxa" w:w="1950"/>
-            <w:vAlign w:val="center"/>
-            <w:tcMar>
-              <w:top w:w="75" w:type="dxa"/>
-              <w:start w:w="100" w:type="dxa"/>
-              <w:bottom w:w="75" w:type="dxa"/>
-              <w:end w:w="100" w:type="dxa"/>
-            </w:tcMar>
-            <w:tcBorders>
-              <w:top w:val="nil"/>
-              <w:bottom w:val="single" w:sz="6" w:space="0" w:color="CBD5E1"/>
-              <w:start w:val="nil"/>
-              <w:end w:val="single" w:sz="4" w:space="0" w:color="CBD5E1"/>
-            </w:tcBorders>
-          </w:tcPr>
-          <w:p>
-            <w:pPr>
-              <w:spacing w:after="0" w:line="293" w:lineRule="auto"/>
-            </w:pPr>
-            <w:r>
-              <w:rPr>
-                <w:rFonts w:ascii="Arial Unicode MS" w:hAnsi="Arial Unicode MS" w:eastAsia="Arial Unicode MS"/>
-                <w:b/>
-                <w:i w:val="0"/>
-                <w:color w:val="1A2340"/>
-                <w:sz w:val="22"/>
-              </w:rPr>
-              <w:t>閱讀</w:t>
-            </w:r>
-          </w:p>
-        </w:tc>
-        <w:tc>
-          <w:tcPr>
-            <w:tcW w:type="dxa" w:w="7915"/>
-            <w:vAlign w:val="center"/>
-            <w:tcMar>
-              <w:top w:w="75" w:type="dxa"/>
-              <w:start w:w="100" w:type="dxa"/>
-              <w:bottom w:w="75" w:type="dxa"/>
-              <w:end w:w="100" w:type="dxa"/>
-            </w:tcMar>
-            <w:tcBorders>
-              <w:top w:val="nil"/>
-              <w:bottom w:val="single" w:sz="6" w:space="0" w:color="CBD5E1"/>
-              <w:start w:val="nil"/>
-              <w:end w:val="nil"/>
-            </w:tcBorders>
-          </w:tcPr>
-          <w:p>
-            <w:pPr>
-              <w:spacing w:after="0" w:line="293" w:lineRule="auto"/>
-            </w:pPr>
-          </w:p>
-        </w:tc>
-      </w:tr>
-      <w:tr>
-        <w:trPr>
-          <w:trHeight w:val="680" w:hRule="atLeast"/>
-        </w:trPr>
-        <w:tc>
-          <w:tcPr>
-            <w:tcW w:type="dxa" w:w="1950"/>
-            <w:vAlign w:val="center"/>
-            <w:tcMar>
-              <w:top w:w="75" w:type="dxa"/>
-              <w:start w:w="100" w:type="dxa"/>
-              <w:bottom w:w="75" w:type="dxa"/>
-              <w:end w:w="100" w:type="dxa"/>
-            </w:tcMar>
-            <w:tcBorders>
-              <w:top w:val="nil"/>
-              <w:bottom w:val="single" w:sz="6" w:space="0" w:color="CBD5E1"/>
-              <w:start w:val="nil"/>
-              <w:end w:val="single" w:sz="4" w:space="0" w:color="CBD5E1"/>
-            </w:tcBorders>
-          </w:tcPr>
-          <w:p>
-            <w:pPr>
-              <w:spacing w:after="0" w:line="293" w:lineRule="auto"/>
-            </w:pPr>
-            <w:r>
-              <w:rPr>
-                <w:rFonts w:ascii="Arial Unicode MS" w:hAnsi="Arial Unicode MS" w:eastAsia="Arial Unicode MS"/>
-                <w:b/>
-                <w:i w:val="0"/>
-                <w:color w:val="1A2340"/>
-                <w:sz w:val="22"/>
-              </w:rPr>
-              <w:t>理解</w:t>
-            </w:r>
-          </w:p>
-        </w:tc>
-        <w:tc>
-          <w:tcPr>
-            <w:tcW w:type="dxa" w:w="7915"/>
-            <w:vAlign w:val="center"/>
-            <w:tcMar>
-              <w:top w:w="75" w:type="dxa"/>
-              <w:start w:w="100" w:type="dxa"/>
-              <w:bottom w:w="75" w:type="dxa"/>
-              <w:end w:w="100" w:type="dxa"/>
-            </w:tcMar>
-            <w:tcBorders>
-              <w:top w:val="nil"/>
-              <w:bottom w:val="single" w:sz="6" w:space="0" w:color="CBD5E1"/>
-              <w:start w:val="nil"/>
-              <w:end w:val="nil"/>
-            </w:tcBorders>
-          </w:tcPr>
-          <w:p>
-            <w:pPr>
-              <w:spacing w:after="0" w:line="293" w:lineRule="auto"/>
-            </w:pPr>
-          </w:p>
-        </w:tc>
-      </w:tr>
-      <w:tr>
-        <w:trPr>
-          <w:trHeight w:val="680" w:hRule="atLeast"/>
-        </w:trPr>
-        <w:tc>
-          <w:tcPr>
-            <w:tcW w:type="dxa" w:w="1950"/>
-            <w:vAlign w:val="center"/>
-            <w:tcMar>
-              <w:top w:w="75" w:type="dxa"/>
-              <w:start w:w="100" w:type="dxa"/>
-              <w:bottom w:w="75" w:type="dxa"/>
-              <w:end w:w="100" w:type="dxa"/>
-            </w:tcMar>
-            <w:tcBorders>
-              <w:top w:val="nil"/>
-              <w:bottom w:val="single" w:sz="6" w:space="0" w:color="CBD5E1"/>
-              <w:start w:val="nil"/>
-              <w:end w:val="single" w:sz="4" w:space="0" w:color="CBD5E1"/>
-            </w:tcBorders>
-          </w:tcPr>
-          <w:p>
-            <w:pPr>
-              <w:spacing w:after="0" w:line="293" w:lineRule="auto"/>
-            </w:pPr>
-            <w:r>
-              <w:rPr>
-                <w:rFonts w:ascii="Arial Unicode MS" w:hAnsi="Arial Unicode MS" w:eastAsia="Arial Unicode MS"/>
-                <w:b/>
-                <w:i w:val="0"/>
-                <w:color w:val="1A2340"/>
-                <w:sz w:val="22"/>
-              </w:rPr>
-              <w:t>表達</w:t>
-            </w:r>
-          </w:p>
-        </w:tc>
-        <w:tc>
-          <w:tcPr>
-            <w:tcW w:type="dxa" w:w="7915"/>
-            <w:vAlign w:val="center"/>
-            <w:tcMar>
-              <w:top w:w="75" w:type="dxa"/>
-              <w:start w:w="100" w:type="dxa"/>
-              <w:bottom w:w="75" w:type="dxa"/>
-              <w:end w:w="100" w:type="dxa"/>
-            </w:tcMar>
-            <w:tcBorders>
-              <w:top w:val="nil"/>
-              <w:bottom w:val="single" w:sz="6" w:space="0" w:color="CBD5E1"/>
-              <w:start w:val="nil"/>
-              <w:end w:val="nil"/>
-            </w:tcBorders>
-          </w:tcPr>
-          <w:p>
-            <w:pPr>
-              <w:spacing w:after="0" w:line="293" w:lineRule="auto"/>
-            </w:pPr>
-          </w:p>
-        </w:tc>
-      </w:tr>
-    </w:tbl>
-    <w:p>
-      <w:pPr>
-        <w:keepNext/>
-        <w:keepLines w:val="0"/>
-        <w:spacing w:before="0" w:after="0" w:line="293" w:lineRule="auto"/>
-      </w:pPr>
-      <w:r>
-        <w:rPr>
-          <w:rFonts w:ascii="Arial Unicode MS" w:hAnsi="Arial Unicode MS" w:eastAsia="Arial Unicode MS"/>
-          <w:b w:val="0"/>
-          <w:i w:val="0"/>
-          <w:color w:val="5B6573"/>
-          <w:sz w:val="22"/>
-        </w:rPr>
-        <w:t>整體來看，AI 哪些地方比我快或強？哪些地方仍需要我判斷？</w:t>
-      </w:r>
-    </w:p>
-    <w:tbl>
-      <w:tblPr>
-        <w:tblW w:type="dxa" w:w="9865"/>
-        <w:jc w:val="left"/>
-        <w:tblLayout w:type="fixed"/>
-        <w:tblLook w:firstColumn="1" w:firstRow="1" w:lastColumn="0" w:lastRow="0" w:noHBand="0" w:noVBand="1" w:val="04A0"/>
-        <w:tblInd w:type="dxa" w:w="0"/>
-      </w:tblPr>
-      <w:tblGrid>
-        <w:gridCol w:w="9865"/>
-      </w:tblGrid>
-      <w:tr>
-        <w:trPr>
-          <w:trHeight w:val="482" w:hRule="atLeast"/>
-        </w:trPr>
-        <w:tc>
-          <w:tcPr>
-            <w:tcW w:type="dxa" w:w="9865"/>
-            <w:tcMar>
-              <w:top w:w="0" w:type="dxa"/>
-              <w:start w:w="0" w:type="dxa"/>
-              <w:bottom w:w="0" w:type="dxa"/>
-              <w:end w:w="0" w:type="dxa"/>
-            </w:tcMar>
-            <w:tcBorders>
-              <w:top w:val="nil"/>
-              <w:bottom w:val="single" w:sz="5" w:space="0" w:color="CBD5E1"/>
-              <w:start w:val="nil"/>
-              <w:end w:val="nil"/>
-            </w:tcBorders>
-          </w:tcPr>
-          <w:p>
-            <w:pPr>
-              <w:spacing w:before="0" w:after="60" w:line="240" w:lineRule="auto"/>
-            </w:pPr>
-            <w:r>
-              <w:t xml:space="preserve"> </w:t>
-            </w:r>
-          </w:p>
-        </w:tc>
-      </w:tr>
-    </w:tbl>
-    <w:p>
-      <w:pPr>
-        <w:keepNext w:val="0"/>
-        <w:keepLines w:val="0"/>
-        <w:spacing w:before="60" w:after="0" w:line="293" w:lineRule="auto"/>
-      </w:pPr>
-      <w:r>
-        <w:rPr>
-          <w:rFonts w:ascii="Arial Unicode MS" w:hAnsi="Arial Unicode MS" w:eastAsia="Arial Unicode MS"/>
-          <w:b w:val="0"/>
-          <w:i w:val="0"/>
-          <w:color w:val="5B6573"/>
-          <w:sz w:val="22"/>
-        </w:rPr>
-        <w:t>負責＝說得出內容怎麼來、重要說法查過根據、發現問題願意修正；交出去前由自己確認。</w:t>
-      </w:r>
-    </w:p>
-    <w:p>
-      <w:pPr>
-        <w:keepNext/>
-        <w:keepLines w:val="0"/>
-        <w:spacing w:before="140" w:after="100" w:line="293" w:lineRule="auto"/>
-      </w:pPr>
-      <w:r>
-        <w:rPr>
-          <w:rFonts w:ascii="JetBrains Mono" w:hAnsi="JetBrains Mono" w:eastAsia="Arial Unicode MS"/>
-          <w:b/>
-          <w:i w:val="0"/>
-          <w:color w:val="1D4ED8"/>
-          <w:sz w:val="30"/>
-        </w:rPr>
-        <w:t>03</w:t>
-      </w:r>
-      <w:r>
-        <w:rPr>
-          <w:rFonts w:ascii="Arial Unicode MS" w:hAnsi="Arial Unicode MS" w:eastAsia="Arial Unicode MS"/>
-          <w:b w:val="0"/>
-          <w:i w:val="0"/>
-          <w:color w:val="1D4ED8"/>
-          <w:sz w:val="30"/>
-        </w:rPr>
-        <w:t xml:space="preserve">  </w:t>
-      </w:r>
-      <w:r>
-        <w:rPr>
-          <w:rFonts w:ascii="Arial Unicode MS" w:hAnsi="Arial Unicode MS" w:eastAsia="Arial Unicode MS"/>
-          <w:b/>
-          <w:i w:val="0"/>
-          <w:color w:val="1A2340"/>
-          <w:sz w:val="30"/>
-        </w:rPr>
-        <w:t>課程使命</w:t>
-      </w:r>
-    </w:p>
-    <w:p>
-      <w:pPr>
-        <w:keepNext/>
-        <w:keepLines w:val="0"/>
-        <w:spacing w:before="20" w:after="40" w:line="293" w:lineRule="auto"/>
-      </w:pPr>
-      <w:r>
-        <w:rPr>
-          <w:rFonts w:ascii="Arial Unicode MS" w:hAnsi="Arial Unicode MS" w:eastAsia="Arial Unicode MS"/>
-          <w:b/>
-          <w:i w:val="0"/>
-          <w:color w:val="5B6573"/>
-          <w:sz w:val="22"/>
-        </w:rPr>
-        <w:t>小組一句話</w:t>
-      </w:r>
-      <w:r>
-        <w:rPr>
-          <w:rFonts w:ascii="Arial Unicode MS" w:hAnsi="Arial Unicode MS" w:eastAsia="Arial Unicode MS"/>
-          <w:b w:val="0"/>
-          <w:i w:val="0"/>
-          <w:color w:val="7B8491"/>
-          <w:sz w:val="22"/>
-        </w:rPr>
-        <w:t xml:space="preserve">  ｜  </w:t>
-      </w:r>
-      <w:r>
-        <w:rPr>
-          <w:rFonts w:ascii="Arial Unicode MS" w:hAnsi="Arial Unicode MS" w:eastAsia="Arial Unicode MS"/>
-          <w:b w:val="0"/>
-          <w:i w:val="0"/>
-          <w:color w:val="1A2340"/>
-          <w:sz w:val="22"/>
-        </w:rPr>
-        <w:t>AI 已經能讀、能寫，這門課還要教什麼？</w:t>
-      </w:r>
-    </w:p>
-    <w:tbl>
-      <w:tblPr>
-        <w:tblW w:type="dxa" w:w="9865"/>
-        <w:jc w:val="left"/>
-        <w:tblLayout w:type="fixed"/>
-        <w:tblLook w:firstColumn="1" w:firstRow="1" w:lastColumn="0" w:lastRow="0" w:noHBand="0" w:noVBand="1" w:val="04A0"/>
-        <w:tblInd w:type="dxa" w:w="0"/>
-      </w:tblPr>
-      <w:tblGrid>
-        <w:gridCol w:w="9865"/>
-      </w:tblGrid>
-      <w:tr>
-        <w:trPr>
-          <w:trHeight w:val="510" w:hRule="atLeast"/>
-        </w:trPr>
-        <w:tc>
-          <w:tcPr>
-            <w:tcW w:type="dxa" w:w="9865"/>
-            <w:tcMar>
-              <w:top w:w="0" w:type="dxa"/>
-              <w:start w:w="0" w:type="dxa"/>
-              <w:bottom w:w="0" w:type="dxa"/>
-              <w:end w:w="0" w:type="dxa"/>
-            </w:tcMar>
-            <w:tcBorders>
-              <w:top w:val="nil"/>
-              <w:bottom w:val="single" w:sz="5" w:space="0" w:color="CBD5E1"/>
-              <w:start w:val="nil"/>
-              <w:end w:val="nil"/>
-            </w:tcBorders>
-          </w:tcPr>
-          <w:p>
-            <w:pPr>
-              <w:spacing w:before="0" w:after="40" w:line="240" w:lineRule="auto"/>
-            </w:pPr>
-            <w:r>
-              <w:t xml:space="preserve"> </w:t>
-            </w:r>
-          </w:p>
-        </w:tc>
-      </w:tr>
-    </w:tbl>
     <w:tbl>
       <w:tblPr>
         <w:tblW w:type="dxa" w:w="9865"/>
@@ -1791,10 +1241,10 @@
                 <w:rFonts w:ascii="Arial Unicode MS" w:hAnsi="Arial Unicode MS" w:eastAsia="Arial Unicode MS"/>
                 <w:b/>
                 <w:i w:val="0"/>
-                <w:color w:val="1D4ED8"/>
+                <w:color w:val="1A2340"/>
                 <w:sz w:val="22"/>
               </w:rPr>
-              <w:t>1　它怎麼來？</w:t>
+              <w:t>它怎麼來？</w:t>
             </w:r>
             <w:r>
               <w:rPr>
@@ -1804,7 +1254,7 @@
                 <w:color w:val="1A2340"/>
                 <w:sz w:val="22"/>
               </w:rPr>
-              <w:t xml:space="preserve">　找來源，看這段內容怎麼做出來</w:t>
+              <w:t xml:space="preserve"> 找來源。</w:t>
             </w:r>
           </w:p>
           <w:p>
@@ -1818,10 +1268,10 @@
                 <w:rFonts w:ascii="Arial Unicode MS" w:hAnsi="Arial Unicode MS" w:eastAsia="Arial Unicode MS"/>
                 <w:b/>
                 <w:i w:val="0"/>
-                <w:color w:val="1D4ED8"/>
+                <w:color w:val="1A2340"/>
                 <w:sz w:val="22"/>
               </w:rPr>
-              <w:t>2　我憑什麼接受？</w:t>
+              <w:t>憑什麼接受？</w:t>
             </w:r>
             <w:r>
               <w:rPr>
@@ -1831,7 +1281,7 @@
                 <w:color w:val="1A2340"/>
                 <w:sz w:val="22"/>
               </w:rPr>
-              <w:t xml:space="preserve">　找證據，看理由有沒有跳太快</w:t>
+              <w:t xml:space="preserve"> 看根據有沒有支持。</w:t>
             </w:r>
           </w:p>
           <w:p>
@@ -1845,10 +1295,10 @@
                 <w:rFonts w:ascii="Arial Unicode MS" w:hAnsi="Arial Unicode MS" w:eastAsia="Arial Unicode MS"/>
                 <w:b/>
                 <w:i w:val="0"/>
-                <w:color w:val="1D4ED8"/>
+                <w:color w:val="1A2340"/>
                 <w:sz w:val="22"/>
               </w:rPr>
-              <w:t>3　誰願意負責？</w:t>
+              <w:t>誰願意負責？</w:t>
             </w:r>
             <w:r>
               <w:rPr>
@@ -1858,7 +1308,7 @@
                 <w:color w:val="1A2340"/>
                 <w:sz w:val="22"/>
               </w:rPr>
-              <w:t xml:space="preserve">　找出最後交出去的人與可能影響</w:t>
+              <w:t xml:space="preserve"> 誰最後確認、說錯怎麼改。</w:t>
             </w:r>
           </w:p>
         </w:tc>
@@ -1868,7 +1318,170 @@
       <w:pPr>
         <w:keepNext w:val="0"/>
         <w:keepLines w:val="0"/>
-        <w:spacing w:before="60" w:after="0" w:line="293" w:lineRule="auto"/>
+        <w:spacing w:before="60" w:after="40" w:line="293" w:lineRule="auto"/>
+      </w:pPr>
+      <w:r>
+        <w:rPr>
+          <w:rFonts w:ascii="Arial Unicode MS" w:hAnsi="Arial Unicode MS" w:eastAsia="Arial Unicode MS"/>
+          <w:b w:val="0"/>
+          <w:i w:val="0"/>
+          <w:color w:val="1A2340"/>
+          <w:sz w:val="22"/>
+        </w:rPr>
+        <w:t>提案：延長圖書館開放，能讓大家成績變好。現在只有進出人次，沒有成績資料。</w:t>
+      </w:r>
+    </w:p>
+    <w:p>
+      <w:pPr>
+        <w:keepNext/>
+        <w:keepLines w:val="0"/>
+        <w:spacing w:before="40" w:after="20" w:line="293" w:lineRule="auto"/>
+      </w:pPr>
+      <w:r>
+        <w:rPr>
+          <w:rFonts w:ascii="Arial Unicode MS" w:hAnsi="Arial Unicode MS" w:eastAsia="Arial Unicode MS"/>
+          <w:b/>
+          <w:i w:val="0"/>
+          <w:color w:val="5B6573"/>
+          <w:sz w:val="22"/>
+        </w:rPr>
+        <w:t>先寫一問</w:t>
+      </w:r>
+      <w:r>
+        <w:rPr>
+          <w:rFonts w:ascii="Arial Unicode MS" w:hAnsi="Arial Unicode MS" w:eastAsia="Arial Unicode MS"/>
+          <w:b w:val="0"/>
+          <w:i w:val="0"/>
+          <w:color w:val="7B8491"/>
+          <w:sz w:val="22"/>
+        </w:rPr>
+        <w:t xml:space="preserve">  ｜  </w:t>
+      </w:r>
+      <w:r>
+        <w:rPr>
+          <w:rFonts w:ascii="Arial Unicode MS" w:hAnsi="Arial Unicode MS" w:eastAsia="Arial Unicode MS"/>
+          <w:b w:val="0"/>
+          <w:i w:val="0"/>
+          <w:color w:val="1A2340"/>
+          <w:sz w:val="22"/>
+        </w:rPr>
+        <w:t>我還要知道＿＿；答案會影響我是否＿＿。</w:t>
+      </w:r>
+    </w:p>
+    <w:tbl>
+      <w:tblPr>
+        <w:tblW w:type="dxa" w:w="9865"/>
+        <w:jc w:val="left"/>
+        <w:tblLayout w:type="fixed"/>
+        <w:tblLook w:firstColumn="1" w:firstRow="1" w:lastColumn="0" w:lastRow="0" w:noHBand="0" w:noVBand="1" w:val="04A0"/>
+        <w:tblInd w:type="dxa" w:w="0"/>
+      </w:tblPr>
+      <w:tblGrid>
+        <w:gridCol w:w="9865"/>
+      </w:tblGrid>
+      <w:tr>
+        <w:trPr>
+          <w:trHeight w:val="510" w:hRule="atLeast"/>
+        </w:trPr>
+        <w:tc>
+          <w:tcPr>
+            <w:tcW w:type="dxa" w:w="9865"/>
+            <w:tcMar>
+              <w:top w:w="0" w:type="dxa"/>
+              <w:start w:w="0" w:type="dxa"/>
+              <w:bottom w:w="0" w:type="dxa"/>
+              <w:end w:w="0" w:type="dxa"/>
+            </w:tcMar>
+            <w:tcBorders>
+              <w:top w:val="nil"/>
+              <w:bottom w:val="single" w:sz="5" w:space="0" w:color="CBD5E1"/>
+              <w:start w:val="nil"/>
+              <w:end w:val="nil"/>
+            </w:tcBorders>
+          </w:tcPr>
+          <w:p>
+            <w:pPr>
+              <w:spacing w:before="0" w:after="0" w:line="240" w:lineRule="auto"/>
+            </w:pPr>
+            <w:r>
+              <w:t xml:space="preserve"> </w:t>
+            </w:r>
+          </w:p>
+        </w:tc>
+      </w:tr>
+      <w:tr>
+        <w:trPr>
+          <w:trHeight w:val="510" w:hRule="atLeast"/>
+        </w:trPr>
+        <w:tc>
+          <w:tcPr>
+            <w:tcW w:type="dxa" w:w="9865"/>
+            <w:tcMar>
+              <w:top w:w="0" w:type="dxa"/>
+              <w:start w:w="0" w:type="dxa"/>
+              <w:bottom w:w="0" w:type="dxa"/>
+              <w:end w:w="0" w:type="dxa"/>
+            </w:tcMar>
+            <w:tcBorders>
+              <w:top w:val="nil"/>
+              <w:bottom w:val="single" w:sz="5" w:space="0" w:color="CBD5E1"/>
+              <w:start w:val="nil"/>
+              <w:end w:val="nil"/>
+            </w:tcBorders>
+          </w:tcPr>
+          <w:p>
+            <w:pPr>
+              <w:spacing w:before="0" w:after="0" w:line="240" w:lineRule="auto"/>
+            </w:pPr>
+            <w:r>
+              <w:t xml:space="preserve"> </w:t>
+            </w:r>
+          </w:p>
+        </w:tc>
+      </w:tr>
+    </w:tbl>
+    <w:p>
+      <w:pPr>
+        <w:keepNext/>
+        <w:keepLines w:val="0"/>
+        <w:spacing w:before="100" w:after="40" w:line="293" w:lineRule="auto"/>
+      </w:pPr>
+      <w:r>
+        <w:rPr>
+          <w:rFonts w:ascii="JetBrains Mono" w:hAnsi="JetBrains Mono" w:eastAsia="Arial Unicode MS"/>
+          <w:b/>
+          <w:i w:val="0"/>
+          <w:color w:val="1D4ED8"/>
+          <w:sz w:val="30"/>
+        </w:rPr>
+        <w:t>生活</w:t>
+      </w:r>
+      <w:r>
+        <w:rPr>
+          <w:rFonts w:ascii="Arial Unicode MS" w:hAnsi="Arial Unicode MS" w:eastAsia="Arial Unicode MS"/>
+          <w:b w:val="0"/>
+          <w:i w:val="0"/>
+          <w:color w:val="1D4ED8"/>
+          <w:sz w:val="30"/>
+        </w:rPr>
+        <w:t xml:space="preserve">  </w:t>
+      </w:r>
+      <w:r>
+        <w:rPr>
+          <w:rFonts w:ascii="Arial Unicode MS" w:hAnsi="Arial Unicode MS" w:eastAsia="Arial Unicode MS"/>
+          <w:b/>
+          <w:i w:val="0"/>
+          <w:color w:val="1A2340"/>
+          <w:sz w:val="30"/>
+        </w:rPr>
+        <w:t>班群說明天不用到校？</w:t>
+      </w:r>
+    </w:p>
+    <w:p>
+      <w:pPr>
+        <w:keepNext w:val="0"/>
+        <w:keepLines w:val="0"/>
+        <w:spacing w:before="0" w:after="40" w:line="293" w:lineRule="auto"/>
       </w:pPr>
       <w:r>
         <w:rPr>
@@ -1876,11 +1489,297 @@
           <w:b w:val="0"/>
           <w:i w:val="0"/>
           <w:color w:val="5B6573"/>
-          <w:sz w:val="20"/>
+          <w:sz w:val="22"/>
         </w:rPr>
-        <w:t>例：『延長圖書館開放能提高學習成效。』若只有使用人數，還不能證明學習成效；應補查資料，或把說法縮小。</w:t>
+        <w:t>課堂練習｜不計分、不列學習關卡；整本照常收回。</w:t>
       </w:r>
     </w:p>
+    <w:p>
+      <w:pPr>
+        <w:keepNext w:val="0"/>
+        <w:keepLines w:val="0"/>
+        <w:spacing w:before="0" w:after="40" w:line="293" w:lineRule="auto"/>
+      </w:pPr>
+      <w:r>
+        <w:rPr>
+          <w:rFonts w:ascii="Arial Unicode MS" w:hAnsi="Arial Unicode MS" w:eastAsia="Arial Unicode MS"/>
+          <w:b w:val="0"/>
+          <w:i w:val="0"/>
+          <w:color w:val="1A2340"/>
+          <w:sz w:val="22"/>
+        </w:rPr>
+        <w:t>班群有人貼：『明天不用到校，幫忙傳！』沒有附公告，也沒寫原因。</w:t>
+      </w:r>
+    </w:p>
+    <w:p>
+      <w:pPr>
+        <w:keepNext w:val="0"/>
+        <w:keepLines w:val="0"/>
+        <w:spacing w:before="0" w:after="40" w:line="293" w:lineRule="auto"/>
+      </w:pPr>
+      <w:r>
+        <w:rPr>
+          <w:rFonts w:ascii="Arial Unicode MS" w:hAnsi="Arial Unicode MS" w:eastAsia="Arial Unicode MS"/>
+          <w:b w:val="0"/>
+          <w:i w:val="0"/>
+          <w:color w:val="1A2340"/>
+          <w:sz w:val="22"/>
+        </w:rPr>
+        <w:t>你會先回哪一句，才好決定要不要轉傳？直接寫出那句話。</w:t>
+      </w:r>
+    </w:p>
+    <w:p>
+      <w:pPr>
+        <w:keepNext/>
+        <w:keepLines w:val="0"/>
+        <w:spacing w:before="20" w:after="20" w:line="293" w:lineRule="auto"/>
+      </w:pPr>
+      <w:r>
+        <w:rPr>
+          <w:rFonts w:ascii="Arial Unicode MS" w:hAnsi="Arial Unicode MS" w:eastAsia="Arial Unicode MS"/>
+          <w:b/>
+          <w:i w:val="0"/>
+          <w:color w:val="5B6573"/>
+          <w:sz w:val="22"/>
+        </w:rPr>
+        <w:t>先做一次</w:t>
+      </w:r>
+      <w:r>
+        <w:rPr>
+          <w:rFonts w:ascii="Arial Unicode MS" w:hAnsi="Arial Unicode MS" w:eastAsia="Arial Unicode MS"/>
+          <w:b w:val="0"/>
+          <w:i w:val="0"/>
+          <w:color w:val="7B8491"/>
+          <w:sz w:val="22"/>
+        </w:rPr>
+        <w:t xml:space="preserve">  ｜  </w:t>
+      </w:r>
+      <w:r>
+        <w:rPr>
+          <w:rFonts w:ascii="Arial Unicode MS" w:hAnsi="Arial Unicode MS" w:eastAsia="Arial Unicode MS"/>
+          <w:b w:val="0"/>
+          <w:i w:val="0"/>
+          <w:color w:val="1A2340"/>
+          <w:sz w:val="22"/>
+        </w:rPr>
+        <w:t>我先回</w:t>
+      </w:r>
+    </w:p>
+    <w:tbl>
+      <w:tblPr>
+        <w:tblW w:type="dxa" w:w="9865"/>
+        <w:jc w:val="left"/>
+        <w:tblLayout w:type="fixed"/>
+        <w:tblLook w:firstColumn="1" w:firstRow="1" w:lastColumn="0" w:lastRow="0" w:noHBand="0" w:noVBand="1" w:val="04A0"/>
+        <w:tblInd w:type="dxa" w:w="0"/>
+      </w:tblPr>
+      <w:tblGrid>
+        <w:gridCol w:w="9865"/>
+      </w:tblGrid>
+      <w:tr>
+        <w:trPr>
+          <w:trHeight w:val="510" w:hRule="atLeast"/>
+        </w:trPr>
+        <w:tc>
+          <w:tcPr>
+            <w:tcW w:type="dxa" w:w="9865"/>
+            <w:tcMar>
+              <w:top w:w="0" w:type="dxa"/>
+              <w:start w:w="0" w:type="dxa"/>
+              <w:bottom w:w="0" w:type="dxa"/>
+              <w:end w:w="0" w:type="dxa"/>
+            </w:tcMar>
+            <w:tcBorders>
+              <w:top w:val="nil"/>
+              <w:bottom w:val="single" w:sz="5" w:space="0" w:color="CBD5E1"/>
+              <w:start w:val="nil"/>
+              <w:end w:val="nil"/>
+            </w:tcBorders>
+          </w:tcPr>
+          <w:p>
+            <w:pPr>
+              <w:spacing w:before="0" w:after="0" w:line="240" w:lineRule="auto"/>
+            </w:pPr>
+            <w:r>
+              <w:t xml:space="preserve"> </w:t>
+            </w:r>
+          </w:p>
+        </w:tc>
+      </w:tr>
+      <w:tr>
+        <w:trPr>
+          <w:trHeight w:val="510" w:hRule="atLeast"/>
+        </w:trPr>
+        <w:tc>
+          <w:tcPr>
+            <w:tcW w:type="dxa" w:w="9865"/>
+            <w:tcMar>
+              <w:top w:w="0" w:type="dxa"/>
+              <w:start w:w="0" w:type="dxa"/>
+              <w:bottom w:w="0" w:type="dxa"/>
+              <w:end w:w="0" w:type="dxa"/>
+            </w:tcMar>
+            <w:tcBorders>
+              <w:top w:val="nil"/>
+              <w:bottom w:val="single" w:sz="5" w:space="0" w:color="CBD5E1"/>
+              <w:start w:val="nil"/>
+              <w:end w:val="nil"/>
+            </w:tcBorders>
+          </w:tcPr>
+          <w:p>
+            <w:pPr>
+              <w:spacing w:before="0" w:after="20" w:line="240" w:lineRule="auto"/>
+            </w:pPr>
+            <w:r>
+              <w:t xml:space="preserve"> </w:t>
+            </w:r>
+          </w:p>
+        </w:tc>
+      </w:tr>
+    </w:tbl>
+    <w:p>
+      <w:pPr>
+        <w:keepNext w:val="0"/>
+        <w:keepLines w:val="0"/>
+        <w:spacing w:before="60" w:after="40" w:line="293" w:lineRule="auto"/>
+      </w:pPr>
+      <w:r>
+        <w:rPr>
+          <w:rFonts w:ascii="Arial Unicode MS" w:hAnsi="Arial Unicode MS" w:eastAsia="Arial Unicode MS"/>
+          <w:b/>
+          <w:i w:val="0"/>
+          <w:color w:val="1A2340"/>
+          <w:sz w:val="22"/>
+        </w:rPr>
+        <w:t>先寫完，再看：對方回：『我是聽另一班同學說的。』</w:t>
+      </w:r>
+    </w:p>
+    <w:p>
+      <w:pPr>
+        <w:keepNext w:val="0"/>
+        <w:keepLines w:val="0"/>
+        <w:spacing w:before="0" w:after="40" w:line="293" w:lineRule="auto"/>
+      </w:pPr>
+      <w:r>
+        <w:rPr>
+          <w:rFonts w:ascii="Arial Unicode MS" w:hAnsi="Arial Unicode MS" w:eastAsia="Arial Unicode MS"/>
+          <w:b w:val="0"/>
+          <w:i w:val="0"/>
+          <w:color w:val="1A2340"/>
+          <w:sz w:val="22"/>
+        </w:rPr>
+        <w:t>你現在會轉傳、先不傳，還是再問？寫出你的回覆和一個理由。</w:t>
+      </w:r>
+    </w:p>
+    <w:p>
+      <w:pPr>
+        <w:keepNext/>
+        <w:keepLines w:val="0"/>
+        <w:spacing w:before="20" w:after="20" w:line="293" w:lineRule="auto"/>
+      </w:pPr>
+      <w:r>
+        <w:rPr>
+          <w:rFonts w:ascii="Arial Unicode MS" w:hAnsi="Arial Unicode MS" w:eastAsia="Arial Unicode MS"/>
+          <w:b/>
+          <w:i w:val="0"/>
+          <w:color w:val="5B6573"/>
+          <w:sz w:val="22"/>
+        </w:rPr>
+        <w:t>再決定</w:t>
+      </w:r>
+      <w:r>
+        <w:rPr>
+          <w:rFonts w:ascii="Arial Unicode MS" w:hAnsi="Arial Unicode MS" w:eastAsia="Arial Unicode MS"/>
+          <w:b w:val="0"/>
+          <w:i w:val="0"/>
+          <w:color w:val="7B8491"/>
+          <w:sz w:val="22"/>
+        </w:rPr>
+        <w:t xml:space="preserve">  ｜  </w:t>
+      </w:r>
+      <w:r>
+        <w:rPr>
+          <w:rFonts w:ascii="Arial Unicode MS" w:hAnsi="Arial Unicode MS" w:eastAsia="Arial Unicode MS"/>
+          <w:b w:val="0"/>
+          <w:i w:val="0"/>
+          <w:color w:val="1A2340"/>
+          <w:sz w:val="22"/>
+        </w:rPr>
+        <w:t>看到新回覆後，我會</w:t>
+      </w:r>
+    </w:p>
+    <w:tbl>
+      <w:tblPr>
+        <w:tblW w:type="dxa" w:w="9865"/>
+        <w:jc w:val="left"/>
+        <w:tblLayout w:type="fixed"/>
+        <w:tblLook w:firstColumn="1" w:firstRow="1" w:lastColumn="0" w:lastRow="0" w:noHBand="0" w:noVBand="1" w:val="04A0"/>
+        <w:tblInd w:type="dxa" w:w="0"/>
+      </w:tblPr>
+      <w:tblGrid>
+        <w:gridCol w:w="9865"/>
+      </w:tblGrid>
+      <w:tr>
+        <w:trPr>
+          <w:trHeight w:val="510" w:hRule="atLeast"/>
+        </w:trPr>
+        <w:tc>
+          <w:tcPr>
+            <w:tcW w:type="dxa" w:w="9865"/>
+            <w:tcMar>
+              <w:top w:w="0" w:type="dxa"/>
+              <w:start w:w="0" w:type="dxa"/>
+              <w:bottom w:w="0" w:type="dxa"/>
+              <w:end w:w="0" w:type="dxa"/>
+            </w:tcMar>
+            <w:tcBorders>
+              <w:top w:val="nil"/>
+              <w:bottom w:val="single" w:sz="5" w:space="0" w:color="CBD5E1"/>
+              <w:start w:val="nil"/>
+              <w:end w:val="nil"/>
+            </w:tcBorders>
+          </w:tcPr>
+          <w:p>
+            <w:pPr>
+              <w:spacing w:before="0" w:after="0" w:line="240" w:lineRule="auto"/>
+            </w:pPr>
+            <w:r>
+              <w:t xml:space="preserve"> </w:t>
+            </w:r>
+          </w:p>
+        </w:tc>
+      </w:tr>
+      <w:tr>
+        <w:trPr>
+          <w:trHeight w:val="510" w:hRule="atLeast"/>
+        </w:trPr>
+        <w:tc>
+          <w:tcPr>
+            <w:tcW w:type="dxa" w:w="9865"/>
+            <w:tcMar>
+              <w:top w:w="0" w:type="dxa"/>
+              <w:start w:w="0" w:type="dxa"/>
+              <w:bottom w:w="0" w:type="dxa"/>
+              <w:end w:w="0" w:type="dxa"/>
+            </w:tcMar>
+            <w:tcBorders>
+              <w:top w:val="nil"/>
+              <w:bottom w:val="single" w:sz="5" w:space="0" w:color="CBD5E1"/>
+              <w:start w:val="nil"/>
+              <w:end w:val="nil"/>
+            </w:tcBorders>
+          </w:tcPr>
+          <w:p>
+            <w:pPr>
+              <w:spacing w:before="0" w:after="20" w:line="240" w:lineRule="auto"/>
+            </w:pPr>
+            <w:r>
+              <w:t xml:space="preserve"> </w:t>
+            </w:r>
+          </w:p>
+        </w:tc>
+      </w:tr>
+    </w:tbl>
     <w:p>
       <w:pPr>
         <w:keepNext/>
@@ -1913,7 +1812,7 @@
           <w:color w:val="1A2340"/>
           <w:sz w:val="44"/>
         </w:rPr>
-        <w:t>完成課程任務的三個原則</w:t>
+        <w:t>把原則改成做得到的事</w:t>
       </w:r>
     </w:p>
     <w:p>
@@ -1930,7 +1829,7 @@
           <w:color w:val="5B6573"/>
           <w:sz w:val="22"/>
         </w:rPr>
-        <w:t>尤其使用 AI 時，先修改老師的版本，再一起設計這門課怎麼練。</w:t>
+        <w:t>不用背新的名詞；寫出一個你真的做得到的動作。</w:t>
       </w:r>
     </w:p>
     <w:p>
@@ -1967,25 +1866,32 @@
           <w:color w:val="1A2340"/>
           <w:sz w:val="30"/>
         </w:rPr>
-        <w:t>三個原則</w:t>
+        <w:t>把原則改成動作</w:t>
       </w:r>
     </w:p>
     <w:p>
       <w:pPr>
         <w:keepNext w:val="0"/>
-        <w:keepLines/>
-        <w:spacing w:before="20" w:after="100" w:line="293" w:lineRule="auto"/>
+        <w:keepLines w:val="0"/>
+        <w:spacing w:before="0" w:after="40" w:line="293" w:lineRule="auto"/>
       </w:pPr>
       <w:r>
         <w:rPr>
-          <w:rFonts w:ascii="JetBrains Mono" w:hAnsi="JetBrains Mono" w:eastAsia="Arial Unicode MS"/>
+          <w:rFonts w:ascii="Arial Unicode MS" w:hAnsi="Arial Unicode MS" w:eastAsia="Arial Unicode MS"/>
           <w:b/>
           <w:i w:val="0"/>
-          <w:color w:val="1D4ED8"/>
+          <w:color w:val="1A2340"/>
           <w:sz w:val="22"/>
         </w:rPr>
-        <w:t>原則 1</w:t>
+        <w:t>原則：重要的話，要有根據。</w:t>
       </w:r>
+    </w:p>
+    <w:p>
+      <w:pPr>
+        <w:keepNext w:val="0"/>
+        <w:keepLines w:val="0"/>
+        <w:spacing w:before="0" w:after="60" w:line="293" w:lineRule="auto"/>
+      </w:pPr>
       <w:r>
         <w:rPr>
           <w:rFonts w:ascii="Arial Unicode MS" w:hAnsi="Arial Unicode MS" w:eastAsia="Arial Unicode MS"/>
@@ -1994,91 +1900,7 @@
           <w:color w:val="1A2340"/>
           <w:sz w:val="22"/>
         </w:rPr>
-        <w:t xml:space="preserve">　</w:t>
-      </w:r>
-      <w:r>
-        <w:rPr>
-          <w:rFonts w:ascii="Arial Unicode MS" w:hAnsi="Arial Unicode MS" w:eastAsia="Arial Unicode MS"/>
-          <w:b w:val="0"/>
-          <w:i w:val="0"/>
-          <w:color w:val="1A2340"/>
-          <w:sz w:val="22"/>
-        </w:rPr>
-        <w:t>AI 可以給建議；你要看懂、選擇、查證，最後由你負責。</w:t>
-      </w:r>
-    </w:p>
-    <w:p>
-      <w:pPr>
-        <w:keepNext w:val="0"/>
-        <w:keepLines/>
-        <w:spacing w:before="20" w:after="100" w:line="293" w:lineRule="auto"/>
-      </w:pPr>
-      <w:r>
-        <w:rPr>
-          <w:rFonts w:ascii="JetBrains Mono" w:hAnsi="JetBrains Mono" w:eastAsia="Arial Unicode MS"/>
-          <w:b/>
-          <w:i w:val="0"/>
-          <w:color w:val="1D4ED8"/>
-          <w:sz w:val="22"/>
-        </w:rPr>
-        <w:t>原則 2</w:t>
-      </w:r>
-      <w:r>
-        <w:rPr>
-          <w:rFonts w:ascii="Arial Unicode MS" w:hAnsi="Arial Unicode MS" w:eastAsia="Arial Unicode MS"/>
-          <w:b w:val="0"/>
-          <w:i w:val="0"/>
-          <w:color w:val="1A2340"/>
-          <w:sz w:val="22"/>
-        </w:rPr>
-        <w:t xml:space="preserve">　</w:t>
-      </w:r>
-      <w:r>
-        <w:rPr>
-          <w:rFonts w:ascii="Arial Unicode MS" w:hAnsi="Arial Unicode MS" w:eastAsia="Arial Unicode MS"/>
-          <w:b w:val="0"/>
-          <w:i w:val="0"/>
-          <w:color w:val="1A2340"/>
-          <w:sz w:val="22"/>
-        </w:rPr>
-        <w:t>寫得順不一定是真的；重要說法要找得到來源和證據。</w:t>
-      </w:r>
-    </w:p>
-    <w:p>
-      <w:pPr>
-        <w:keepNext w:val="0"/>
-        <w:keepLines/>
-        <w:spacing w:before="20" w:after="100" w:line="293" w:lineRule="auto"/>
-      </w:pPr>
-      <w:r>
-        <w:rPr>
-          <w:rFonts w:ascii="JetBrains Mono" w:hAnsi="JetBrains Mono" w:eastAsia="Arial Unicode MS"/>
-          <w:b/>
-          <w:i w:val="0"/>
-          <w:color w:val="1D4ED8"/>
-          <w:sz w:val="22"/>
-        </w:rPr>
-        <w:t>原則 3</w:t>
-      </w:r>
-      <w:r>
-        <w:rPr>
-          <w:rFonts w:ascii="Arial Unicode MS" w:hAnsi="Arial Unicode MS" w:eastAsia="Arial Unicode MS"/>
-          <w:b w:val="0"/>
-          <w:i w:val="0"/>
-          <w:color w:val="1A2340"/>
-          <w:sz w:val="22"/>
-        </w:rPr>
-        <w:t xml:space="preserve">　</w:t>
-      </w:r>
-      <w:r>
-        <w:rPr>
-          <w:rFonts w:ascii="Arial Unicode MS" w:hAnsi="Arial Unicode MS" w:eastAsia="Arial Unicode MS"/>
-          <w:b w:val="0"/>
-          <w:i w:val="0"/>
-          <w:color w:val="1A2340"/>
-          <w:sz w:val="22"/>
-        </w:rPr>
-        <w:t>把作品交給別人看，就要能回答追問，也願意修改。</w:t>
+        <w:t>例如：轉傳前，先打開原公告，對一下日期和內容。現在寫你的版本。</w:t>
       </w:r>
     </w:p>
     <w:p>
@@ -2115,7 +1937,7 @@
           <w:color w:val="1A2340"/>
           <w:sz w:val="22"/>
         </w:rPr>
-        <w:t>選一句，改成更像你的版本</w:t>
+        <w:t>把這個原則改成你會做的動作</w:t>
       </w:r>
     </w:p>
     <w:p>
@@ -2132,27 +1954,7 @@
           <w:color w:val="5B6573"/>
           <w:sz w:val="22"/>
         </w:rPr>
-        <w:t xml:space="preserve">我最想改第 </w:t>
-      </w:r>
-      <w:r>
-        <w:rPr>
-          <w:rFonts w:ascii="JetBrains Mono" w:hAnsi="JetBrains Mono" w:eastAsia="Arial Unicode MS"/>
-          <w:b w:val="0"/>
-          <w:i w:val="0"/>
-          <w:color w:val="1A2340"/>
-          <w:sz w:val="22"/>
-        </w:rPr>
-        <w:t>____</w:t>
-      </w:r>
-      <w:r>
-        <w:rPr>
-          <w:rFonts w:ascii="Arial Unicode MS" w:hAnsi="Arial Unicode MS" w:eastAsia="Arial Unicode MS"/>
-          <w:b w:val="0"/>
-          <w:i w:val="0"/>
-          <w:color w:val="5B6573"/>
-          <w:sz w:val="22"/>
-        </w:rPr>
-        <w:t xml:space="preserve"> 句，因為：</w:t>
+        <w:t>我會先做什麼？這樣做可以確認什麼？</w:t>
       </w:r>
     </w:p>
     <w:tbl>
@@ -2367,7 +2169,7 @@
           <w:color w:val="5B6573"/>
           <w:sz w:val="22"/>
         </w:rPr>
-        <w:t>每組提出 1–2 個活動，勾選它在練哪個問題，並寫出要留下的作品或紀錄。</w:t>
+        <w:t>每組提出 1 個活動，勾選它在練哪個問題，並寫出要留下的作品或紀錄。</w:t>
       </w:r>
     </w:p>
     <w:p>
@@ -2405,146 +2207,6 @@
           <w:sz w:val="22"/>
         </w:rPr>
         <w:t>活動 1</w:t>
-      </w:r>
-    </w:p>
-    <w:p>
-      <w:pPr>
-        <w:keepNext w:val="0"/>
-        <w:keepLines w:val="0"/>
-        <w:spacing w:before="0" w:after="20" w:line="293" w:lineRule="auto"/>
-      </w:pPr>
-      <w:r>
-        <w:rPr>
-          <w:rFonts w:ascii="Arial Unicode MS" w:hAnsi="Arial Unicode MS" w:eastAsia="Arial Unicode MS"/>
-          <w:b/>
-          <w:i w:val="0"/>
-          <w:color w:val="1A2340"/>
-          <w:sz w:val="22"/>
-        </w:rPr>
-        <w:t>活動：</w:t>
-      </w:r>
-      <w:r>
-        <w:rPr>
-          <w:rFonts w:ascii="JetBrains Mono" w:hAnsi="JetBrains Mono" w:eastAsia="Arial Unicode MS"/>
-          <w:b w:val="0"/>
-          <w:i w:val="0"/>
-          <w:color w:val="5B6573"/>
-          <w:sz w:val="22"/>
-        </w:rPr>
-        <w:t>____________________________________________________________</w:t>
-      </w:r>
-    </w:p>
-    <w:p>
-      <w:pPr>
-        <w:keepNext w:val="0"/>
-        <w:keepLines w:val="0"/>
-        <w:spacing w:before="0" w:after="0" w:line="293" w:lineRule="auto"/>
-      </w:pPr>
-      <w:r>
-        <w:rPr>
-          <w:rFonts w:ascii="Arial Unicode MS" w:hAnsi="Arial Unicode MS" w:eastAsia="Arial Unicode MS"/>
-          <w:b w:val="0"/>
-          <w:i w:val="0"/>
-          <w:color w:val="5B6573"/>
-          <w:sz w:val="22"/>
-        </w:rPr>
-        <w:t>它在練：□ 文字怎麼來　□ 根據什麼　□ 誰願意負責</w:t>
-      </w:r>
-    </w:p>
-    <w:p>
-      <w:pPr>
-        <w:keepNext/>
-        <w:keepLines w:val="0"/>
-        <w:spacing w:before="0" w:after="0" w:line="293" w:lineRule="auto"/>
-      </w:pPr>
-      <w:r>
-        <w:rPr>
-          <w:rFonts w:ascii="Arial Unicode MS" w:hAnsi="Arial Unicode MS" w:eastAsia="Arial Unicode MS"/>
-          <w:b w:val="0"/>
-          <w:i w:val="0"/>
-          <w:color w:val="5B6573"/>
-          <w:sz w:val="22"/>
-        </w:rPr>
-        <w:t>做完要留下的作品或紀錄：</w:t>
-      </w:r>
-    </w:p>
-    <w:tbl>
-      <w:tblPr>
-        <w:tblW w:type="dxa" w:w="9865"/>
-        <w:jc w:val="left"/>
-        <w:tblLayout w:type="fixed"/>
-        <w:tblLook w:firstColumn="1" w:firstRow="1" w:lastColumn="0" w:lastRow="0" w:noHBand="0" w:noVBand="1" w:val="04A0"/>
-        <w:tblInd w:type="dxa" w:w="0"/>
-      </w:tblPr>
-      <w:tblGrid>
-        <w:gridCol w:w="9865"/>
-      </w:tblGrid>
-      <w:tr>
-        <w:trPr>
-          <w:trHeight w:val="510" w:hRule="atLeast"/>
-        </w:trPr>
-        <w:tc>
-          <w:tcPr>
-            <w:tcW w:type="dxa" w:w="9865"/>
-            <w:tcMar>
-              <w:top w:w="0" w:type="dxa"/>
-              <w:start w:w="0" w:type="dxa"/>
-              <w:bottom w:w="0" w:type="dxa"/>
-              <w:end w:w="0" w:type="dxa"/>
-            </w:tcMar>
-            <w:tcBorders>
-              <w:top w:val="nil"/>
-              <w:bottom w:val="single" w:sz="5" w:space="0" w:color="CBD5E1"/>
-              <w:start w:val="nil"/>
-              <w:end w:val="nil"/>
-            </w:tcBorders>
-          </w:tcPr>
-          <w:p>
-            <w:pPr>
-              <w:spacing w:before="0" w:after="20" w:line="240" w:lineRule="auto"/>
-            </w:pPr>
-            <w:r>
-              <w:t xml:space="preserve"> </w:t>
-            </w:r>
-          </w:p>
-        </w:tc>
-      </w:tr>
-    </w:tbl>
-    <w:p>
-      <w:pPr>
-        <w:keepNext/>
-        <w:keepLines w:val="0"/>
-        <w:spacing w:before="120" w:after="40" w:line="293" w:lineRule="auto"/>
-      </w:pPr>
-      <w:r>
-        <w:rPr>
-          <w:rFonts w:ascii="Arial Unicode MS" w:hAnsi="Arial Unicode MS" w:eastAsia="Arial Unicode MS"/>
-          <w:b/>
-          <w:i w:val="0"/>
-          <w:color w:val="1D4ED8"/>
-          <w:sz w:val="22"/>
-        </w:rPr>
-        <w:t>課堂必寫</w:t>
-      </w:r>
-      <w:r>
-        <w:rPr>
-          <w:rFonts w:ascii="Arial Unicode MS" w:hAnsi="Arial Unicode MS" w:eastAsia="Arial Unicode MS"/>
-          <w:b w:val="0"/>
-          <w:i w:val="0"/>
-          <w:color w:val="7B8491"/>
-          <w:sz w:val="22"/>
-        </w:rPr>
-        <w:t xml:space="preserve">  ｜  </w:t>
-      </w:r>
-      <w:r>
-        <w:rPr>
-          <w:rFonts w:ascii="Arial Unicode MS" w:hAnsi="Arial Unicode MS" w:eastAsia="Arial Unicode MS"/>
-          <w:b w:val="0"/>
-          <w:i w:val="0"/>
-          <w:color w:val="1A2340"/>
-          <w:sz w:val="22"/>
-        </w:rPr>
-        <w:t>活動 2</w:t>
       </w:r>
     </w:p>
     <w:p>
@@ -2965,7 +2627,7 @@
           <w:color w:val="5B6573"/>
           <w:sz w:val="22"/>
         </w:rPr>
-        <w:t>個人反思</w:t>
+        <w:t>個人反思（可留白、不計分）</w:t>
       </w:r>
       <w:r>
         <w:rPr>
@@ -2986,6 +2648,23 @@
           <w:sz w:val="22"/>
         </w:rPr>
         <w:t>AI 可以幫你做，但你還是想自己做的事是什麼？為什麼？</w:t>
+      </w:r>
+    </w:p>
+    <w:p>
+      <w:pPr>
+        <w:keepNext w:val="0"/>
+        <w:keepLines w:val="0"/>
+        <w:spacing w:before="0" w:after="20" w:line="293" w:lineRule="auto"/>
+      </w:pPr>
+      <w:r>
+        <w:rPr>
+          <w:rFonts w:ascii="Arial Unicode MS" w:hAnsi="Arial Unicode MS" w:eastAsia="Arial Unicode MS"/>
+          <w:b w:val="0"/>
+          <w:i w:val="0"/>
+          <w:color w:val="5B6573"/>
+          <w:sz w:val="20"/>
+        </w:rPr>
+        <w:t>這一格可以留白，不計分；不要寫不能交出的私人內容。</w:t>
       </w:r>
     </w:p>
     <w:tbl>
@@ -3188,7 +2867,7 @@
                 <w:color w:val="1A2340"/>
                 <w:sz w:val="22"/>
               </w:rPr>
-              <w:t xml:space="preserve">「今天整理出的三個原則，最有感或最想挑戰的是 </w:t>
+              <w:t xml:space="preserve">「今天的三個問題，最想先用的是 </w:t>
             </w:r>
             <w:r>
               <w:rPr>
@@ -3374,7 +3053,7 @@
       <w:pPr>
         <w:keepNext w:val="0"/>
         <w:keepLines w:val="0"/>
-        <w:spacing w:before="20" w:after="0" w:line="293" w:lineRule="auto"/>
+        <w:spacing w:before="20" w:after="40" w:line="293" w:lineRule="auto"/>
         <w:pBdr>
           <w:left w:val="single" w:sz="10" w:space="5" w:color="1D4ED8"/>
         </w:pBdr>
@@ -3387,17 +3066,58 @@
           <w:color w:val="1D4ED8"/>
           <w:sz w:val="22"/>
         </w:rPr>
-        <w:t xml:space="preserve">最後兩分鐘　</w:t>
+        <w:t>最後兩分鐘｜先確認今天留下的版本</w:t>
       </w:r>
+    </w:p>
+    <w:p>
+      <w:pPr>
+        <w:keepNext w:val="0"/>
+        <w:keepLines w:val="0"/>
+        <w:spacing w:before="0" w:after="20" w:line="293" w:lineRule="auto"/>
+      </w:pPr>
       <w:r>
         <w:rPr>
           <w:rFonts w:ascii="Arial Unicode MS" w:hAnsi="Arial Unicode MS" w:eastAsia="Arial Unicode MS"/>
           <w:b w:val="0"/>
           <w:i w:val="0"/>
           <w:color w:val="5B6573"/>
-          <w:sz w:val="22"/>
+          <w:sz w:val="20"/>
         </w:rPr>
-        <w:t>① 圈出或畫星號：今天最能看出你怎麼想的一個地方。　② 在旁邊寫：下次遇到類似問題，我會先＿＿＿＿。</w:t>
+        <w:t>□ 第 1 頁：一句目前不能確定的文字＋一個可能改變判斷的問題</w:t>
+      </w:r>
+    </w:p>
+    <w:p>
+      <w:pPr>
+        <w:keepNext w:val="0"/>
+        <w:keepLines w:val="0"/>
+        <w:spacing w:before="0" w:after="20" w:line="293" w:lineRule="auto"/>
+      </w:pPr>
+      <w:r>
+        <w:rPr>
+          <w:rFonts w:ascii="Arial Unicode MS" w:hAnsi="Arial Unicode MS" w:eastAsia="Arial Unicode MS"/>
+          <w:b w:val="0"/>
+          <w:i w:val="0"/>
+          <w:color w:val="5B6573"/>
+          <w:sz w:val="20"/>
+        </w:rPr>
+        <w:t>□ 第 3 頁：一個改寫後的原則，看得出你實際要做哪些動作</w:t>
+      </w:r>
+    </w:p>
+    <w:p>
+      <w:pPr>
+        <w:keepNext w:val="0"/>
+        <w:keepLines w:val="0"/>
+        <w:spacing w:before="0" w:after="20" w:line="293" w:lineRule="auto"/>
+      </w:pPr>
+      <w:r>
+        <w:rPr>
+          <w:rFonts w:ascii="Arial Unicode MS" w:hAnsi="Arial Unicode MS" w:eastAsia="Arial Unicode MS"/>
+          <w:b w:val="0"/>
+          <w:i w:val="0"/>
+          <w:color w:val="5B6573"/>
+          <w:sz w:val="20"/>
+        </w:rPr>
+        <w:t>完成後，選一處畫星號，旁邊寫：下次遇到類似問題，我會先＿＿＿＿。</w:t>
       </w:r>
     </w:p>
     <w:p>

</xml_diff>

<commit_message>
Publish W1-W7 revisions and disciplinary practice downloads
</commit_message>
<xml_diff>
--- a/worksheets/W1.docx
+++ b/worksheets/W1.docx
@@ -293,7 +293,7 @@
           <w:color w:val="5B6573"/>
           <w:sz w:val="22"/>
         </w:rPr>
-        <w:t>投票前先押把握％（50＝像丟硬幣／90＝高度確定），揭曉後回填 ✓／✗。第 17 週你會回來看這些數字。</w:t>
+        <w:t>每組先選 A 是人／B 是人／都是人／都是 AI，再填把握 0–100％。50＝約一半把握；揭曉後填 ✓＝猜對、✗＝猜錯，保留原猜。</w:t>
       </w:r>
     </w:p>
     <w:tbl>
@@ -1043,6 +1043,36 @@
           </w:tcPr>
           <w:p>
             <w:pPr>
+              <w:spacing w:before="0" w:after="0" w:line="240" w:lineRule="auto"/>
+            </w:pPr>
+            <w:r>
+              <w:t xml:space="preserve"> </w:t>
+            </w:r>
+          </w:p>
+        </w:tc>
+      </w:tr>
+      <w:tr>
+        <w:trPr>
+          <w:trHeight w:val="510" w:hRule="atLeast"/>
+        </w:trPr>
+        <w:tc>
+          <w:tcPr>
+            <w:tcW w:type="dxa" w:w="9865"/>
+            <w:tcMar>
+              <w:top w:w="0" w:type="dxa"/>
+              <w:start w:w="0" w:type="dxa"/>
+              <w:bottom w:w="0" w:type="dxa"/>
+              <w:end w:w="0" w:type="dxa"/>
+            </w:tcMar>
+            <w:tcBorders>
+              <w:top w:val="nil"/>
+              <w:bottom w:val="single" w:sz="5" w:space="0" w:color="CBD5E1"/>
+              <w:start w:val="nil"/>
+              <w:end w:val="nil"/>
+            </w:tcBorders>
+          </w:tcPr>
+          <w:p>
+            <w:pPr>
               <w:spacing w:before="0" w:after="60" w:line="240" w:lineRule="auto"/>
             </w:pPr>
             <w:r>
@@ -1086,7 +1116,7 @@
           <w:color w:val="1A2340"/>
           <w:sz w:val="22"/>
         </w:rPr>
-        <w:t>你還想知道或查證什麼？</w:t>
+        <w:t>你還想查證什麼？答案可能改變哪個判斷？</w:t>
       </w:r>
     </w:p>
     <w:p>
@@ -1117,6 +1147,36 @@
       <w:tblGrid>
         <w:gridCol w:w="9865"/>
       </w:tblGrid>
+      <w:tr>
+        <w:trPr>
+          <w:trHeight w:val="510" w:hRule="atLeast"/>
+        </w:trPr>
+        <w:tc>
+          <w:tcPr>
+            <w:tcW w:type="dxa" w:w="9865"/>
+            <w:tcMar>
+              <w:top w:w="0" w:type="dxa"/>
+              <w:start w:w="0" w:type="dxa"/>
+              <w:bottom w:w="0" w:type="dxa"/>
+              <w:end w:w="0" w:type="dxa"/>
+            </w:tcMar>
+            <w:tcBorders>
+              <w:top w:val="nil"/>
+              <w:bottom w:val="single" w:sz="5" w:space="0" w:color="CBD5E1"/>
+              <w:start w:val="nil"/>
+              <w:end w:val="nil"/>
+            </w:tcBorders>
+          </w:tcPr>
+          <w:p>
+            <w:pPr>
+              <w:spacing w:before="0" w:after="0" w:line="240" w:lineRule="auto"/>
+            </w:pPr>
+            <w:r>
+              <w:t xml:space="preserve"> </w:t>
+            </w:r>
+          </w:p>
+        </w:tc>
+      </w:tr>
       <w:tr>
         <w:trPr>
           <w:trHeight w:val="510" w:hRule="atLeast"/>
@@ -1442,9 +1502,68 @@
     </w:tbl>
     <w:p>
       <w:pPr>
+        <w:keepNext w:val="0"/>
+        <w:keepLines w:val="0"/>
+        <w:spacing w:before="60" w:after="0" w:line="293" w:lineRule="auto"/>
+      </w:pPr>
+      <w:r>
+        <w:rPr>
+          <w:rFonts w:ascii="Arial Unicode MS" w:hAnsi="Arial Unicode MS" w:eastAsia="Arial Unicode MS"/>
+          <w:b w:val="0"/>
+          <w:i w:val="0"/>
+          <w:color w:val="1A2340"/>
+          <w:sz w:val="22"/>
+        </w:rPr>
+        <w:t>同桌追問後，我的問題改了／保留，因為：</w:t>
+      </w:r>
+    </w:p>
+    <w:tbl>
+      <w:tblPr>
+        <w:tblW w:type="dxa" w:w="9865"/>
+        <w:jc w:val="left"/>
+        <w:tblLayout w:type="fixed"/>
+        <w:tblLook w:firstColumn="1" w:firstRow="1" w:lastColumn="0" w:lastRow="0" w:noHBand="0" w:noVBand="1" w:val="04A0"/>
+        <w:tblInd w:type="dxa" w:w="0"/>
+      </w:tblPr>
+      <w:tblGrid>
+        <w:gridCol w:w="9865"/>
+      </w:tblGrid>
+      <w:tr>
+        <w:trPr>
+          <w:trHeight w:val="510" w:hRule="atLeast"/>
+        </w:trPr>
+        <w:tc>
+          <w:tcPr>
+            <w:tcW w:type="dxa" w:w="9865"/>
+            <w:tcMar>
+              <w:top w:w="0" w:type="dxa"/>
+              <w:start w:w="0" w:type="dxa"/>
+              <w:bottom w:w="0" w:type="dxa"/>
+              <w:end w:w="0" w:type="dxa"/>
+            </w:tcMar>
+            <w:tcBorders>
+              <w:top w:val="nil"/>
+              <w:bottom w:val="single" w:sz="5" w:space="0" w:color="CBD5E1"/>
+              <w:start w:val="nil"/>
+              <w:end w:val="nil"/>
+            </w:tcBorders>
+          </w:tcPr>
+          <w:p>
+            <w:pPr>
+              <w:spacing w:before="0" w:after="0" w:line="240" w:lineRule="auto"/>
+            </w:pPr>
+            <w:r>
+              <w:t xml:space="preserve"> </w:t>
+            </w:r>
+          </w:p>
+        </w:tc>
+      </w:tr>
+    </w:tbl>
+    <w:p>
+      <w:pPr>
         <w:keepNext/>
         <w:keepLines w:val="0"/>
-        <w:spacing w:before="100" w:after="40" w:line="293" w:lineRule="auto"/>
+        <w:spacing w:before="120" w:after="100" w:line="293" w:lineRule="auto"/>
       </w:pPr>
       <w:r>
         <w:rPr>
@@ -1491,7 +1610,7 @@
           <w:color w:val="5B6573"/>
           <w:sz w:val="22"/>
         </w:rPr>
-        <w:t>課堂練習｜不計分、不列學習關卡；整本照常收回。</w:t>
+        <w:t>課堂練習，不計分；用虛構情境，不必真的傳送。</w:t>
       </w:r>
     </w:p>
     <w:p>
@@ -1513,26 +1632,9 @@
     </w:p>
     <w:p>
       <w:pPr>
-        <w:keepNext w:val="0"/>
-        <w:keepLines w:val="0"/>
-        <w:spacing w:before="0" w:after="40" w:line="293" w:lineRule="auto"/>
-      </w:pPr>
-      <w:r>
-        <w:rPr>
-          <w:rFonts w:ascii="Arial Unicode MS" w:hAnsi="Arial Unicode MS" w:eastAsia="Arial Unicode MS"/>
-          <w:b w:val="0"/>
-          <w:i w:val="0"/>
-          <w:color w:val="1A2340"/>
-          <w:sz w:val="22"/>
-        </w:rPr>
-        <w:t>你會先回哪一句，才好決定要不要轉傳？直接寫出那句話。</w:t>
-      </w:r>
-    </w:p>
-    <w:p>
-      <w:pPr>
         <w:keepNext/>
         <w:keepLines w:val="0"/>
-        <w:spacing w:before="20" w:after="20" w:line="293" w:lineRule="auto"/>
+        <w:spacing w:before="40" w:after="20" w:line="293" w:lineRule="auto"/>
       </w:pPr>
       <w:r>
         <w:rPr>
@@ -1562,7 +1664,7 @@
           <w:color w:val="1A2340"/>
           <w:sz w:val="22"/>
         </w:rPr>
-        <w:t>我先回</w:t>
+        <w:t>我會先回哪一句，才好決定要不要轉傳？</w:t>
       </w:r>
     </w:p>
     <w:tbl>
@@ -1628,7 +1730,7 @@
           </w:tcPr>
           <w:p>
             <w:pPr>
-              <w:spacing w:before="0" w:after="20" w:line="240" w:lineRule="auto"/>
+              <w:spacing w:before="0" w:after="0" w:line="240" w:lineRule="auto"/>
             </w:pPr>
             <w:r>
               <w:t xml:space="preserve"> </w:t>
@@ -1646,36 +1748,19 @@
       <w:r>
         <w:rPr>
           <w:rFonts w:ascii="Arial Unicode MS" w:hAnsi="Arial Unicode MS" w:eastAsia="Arial Unicode MS"/>
-          <w:b/>
+          <w:b w:val="0"/>
           <w:i w:val="0"/>
-          <w:color w:val="1A2340"/>
+          <w:color w:val="5B6573"/>
           <w:sz w:val="22"/>
         </w:rPr>
-        <w:t>先寫完，再看：對方回：『我是聽另一班同學說的。』</w:t>
-      </w:r>
-    </w:p>
-    <w:p>
-      <w:pPr>
-        <w:keepNext w:val="0"/>
-        <w:keepLines w:val="0"/>
-        <w:spacing w:before="0" w:after="40" w:line="293" w:lineRule="auto"/>
-      </w:pPr>
-      <w:r>
-        <w:rPr>
-          <w:rFonts w:ascii="Arial Unicode MS" w:hAnsi="Arial Unicode MS" w:eastAsia="Arial Unicode MS"/>
-          <w:b w:val="0"/>
-          <w:i w:val="0"/>
-          <w:color w:val="1A2340"/>
-          <w:sz w:val="22"/>
-        </w:rPr>
-        <w:t>你現在會轉傳、先不傳，還是再問？寫出你的回覆和一個理由。</w:t>
+        <w:t>先保留上面的第一版；老師切到第 42 頁，再看新回覆。</w:t>
       </w:r>
     </w:p>
     <w:p>
       <w:pPr>
         <w:keepNext/>
         <w:keepLines w:val="0"/>
-        <w:spacing w:before="20" w:after="20" w:line="293" w:lineRule="auto"/>
+        <w:spacing w:before="40" w:after="20" w:line="293" w:lineRule="auto"/>
       </w:pPr>
       <w:r>
         <w:rPr>
@@ -1705,7 +1790,7 @@
           <w:color w:val="1A2340"/>
           <w:sz w:val="22"/>
         </w:rPr>
-        <w:t>看到新回覆後，我會</w:t>
+        <w:t>我的回覆與理由（修改或保留都可以）</w:t>
       </w:r>
     </w:p>
     <w:tbl>
@@ -1771,7 +1856,7 @@
           </w:tcPr>
           <w:p>
             <w:pPr>
-              <w:spacing w:before="0" w:after="20" w:line="240" w:lineRule="auto"/>
+              <w:spacing w:before="0" w:after="0" w:line="240" w:lineRule="auto"/>
             </w:pPr>
             <w:r>
               <w:t xml:space="preserve"> </w:t>
@@ -1812,7 +1897,7 @@
           <w:color w:val="1A2340"/>
           <w:sz w:val="44"/>
         </w:rPr>
-        <w:t>把原則改成做得到的事</w:t>
+        <w:t>一起設計 AI 時代的課</w:t>
       </w:r>
     </w:p>
     <w:p>
@@ -1829,14 +1914,125 @@
           <w:color w:val="5B6573"/>
           <w:sz w:val="22"/>
         </w:rPr>
-        <w:t>不用背新的名詞；寫出一個你真的做得到的動作。</w:t>
+        <w:t>今天先提案，不使用 AI；活動由老師後續安排實作。</w:t>
+      </w:r>
+    </w:p>
+    <w:p>
+      <w:pPr>
+        <w:keepNext w:val="0"/>
+        <w:keepLines/>
+        <w:spacing w:before="20" w:after="100" w:line="293" w:lineRule="auto"/>
+      </w:pPr>
+      <w:r>
+        <w:rPr>
+          <w:rFonts w:ascii="JetBrains Mono" w:hAnsi="JetBrains Mono" w:eastAsia="Arial Unicode MS"/>
+          <w:b/>
+          <w:i w:val="0"/>
+          <w:color w:val="1D4ED8"/>
+          <w:sz w:val="22"/>
+        </w:rPr>
+        <w:t>原則 1</w:t>
+      </w:r>
+      <w:r>
+        <w:rPr>
+          <w:rFonts w:ascii="Arial Unicode MS" w:hAnsi="Arial Unicode MS" w:eastAsia="Arial Unicode MS"/>
+          <w:b w:val="0"/>
+          <w:i w:val="0"/>
+          <w:color w:val="1A2340"/>
+          <w:sz w:val="22"/>
+        </w:rPr>
+        <w:t xml:space="preserve">　</w:t>
+      </w:r>
+      <w:r>
+        <w:rPr>
+          <w:rFonts w:ascii="Arial Unicode MS" w:hAnsi="Arial Unicode MS" w:eastAsia="Arial Unicode MS"/>
+          <w:b w:val="0"/>
+          <w:i w:val="0"/>
+          <w:color w:val="1A2340"/>
+          <w:sz w:val="22"/>
+        </w:rPr>
+        <w:t>AI 可以協助；人要看懂、選擇、查核，並為交出的內容負責。</w:t>
+      </w:r>
+    </w:p>
+    <w:p>
+      <w:pPr>
+        <w:keepNext w:val="0"/>
+        <w:keepLines/>
+        <w:spacing w:before="20" w:after="100" w:line="293" w:lineRule="auto"/>
+      </w:pPr>
+      <w:r>
+        <w:rPr>
+          <w:rFonts w:ascii="JetBrains Mono" w:hAnsi="JetBrains Mono" w:eastAsia="Arial Unicode MS"/>
+          <w:b/>
+          <w:i w:val="0"/>
+          <w:color w:val="1D4ED8"/>
+          <w:sz w:val="22"/>
+        </w:rPr>
+        <w:t>原則 2</w:t>
+      </w:r>
+      <w:r>
+        <w:rPr>
+          <w:rFonts w:ascii="Arial Unicode MS" w:hAnsi="Arial Unicode MS" w:eastAsia="Arial Unicode MS"/>
+          <w:b w:val="0"/>
+          <w:i w:val="0"/>
+          <w:color w:val="1A2340"/>
+          <w:sz w:val="22"/>
+        </w:rPr>
+        <w:t xml:space="preserve">　</w:t>
+      </w:r>
+      <w:r>
+        <w:rPr>
+          <w:rFonts w:ascii="Arial Unicode MS" w:hAnsi="Arial Unicode MS" w:eastAsia="Arial Unicode MS"/>
+          <w:b w:val="0"/>
+          <w:i w:val="0"/>
+          <w:color w:val="1A2340"/>
+          <w:sz w:val="22"/>
+        </w:rPr>
+        <w:t>文字流暢不等於真實；重要說法要找得到來源與證據。</w:t>
+      </w:r>
+    </w:p>
+    <w:p>
+      <w:pPr>
+        <w:keepNext w:val="0"/>
+        <w:keepLines/>
+        <w:spacing w:before="20" w:after="100" w:line="293" w:lineRule="auto"/>
+      </w:pPr>
+      <w:r>
+        <w:rPr>
+          <w:rFonts w:ascii="JetBrains Mono" w:hAnsi="JetBrains Mono" w:eastAsia="Arial Unicode MS"/>
+          <w:b/>
+          <w:i w:val="0"/>
+          <w:color w:val="1D4ED8"/>
+          <w:sz w:val="22"/>
+        </w:rPr>
+        <w:t>原則 3</w:t>
+      </w:r>
+      <w:r>
+        <w:rPr>
+          <w:rFonts w:ascii="Arial Unicode MS" w:hAnsi="Arial Unicode MS" w:eastAsia="Arial Unicode MS"/>
+          <w:b w:val="0"/>
+          <w:i w:val="0"/>
+          <w:color w:val="1A2340"/>
+          <w:sz w:val="22"/>
+        </w:rPr>
+        <w:t xml:space="preserve">　</w:t>
+      </w:r>
+      <w:r>
+        <w:rPr>
+          <w:rFonts w:ascii="Arial Unicode MS" w:hAnsi="Arial Unicode MS" w:eastAsia="Arial Unicode MS"/>
+          <w:b w:val="0"/>
+          <w:i w:val="0"/>
+          <w:color w:val="1A2340"/>
+          <w:sz w:val="22"/>
+        </w:rPr>
+        <w:t>作品要交給真實讀者，能接受追問與修改。</w:t>
       </w:r>
     </w:p>
     <w:p>
       <w:pPr>
         <w:keepNext/>
         <w:keepLines w:val="0"/>
-        <w:spacing w:before="80" w:after="100" w:line="293" w:lineRule="auto"/>
+        <w:spacing w:before="60" w:after="100" w:line="293" w:lineRule="auto"/>
       </w:pPr>
       <w:r>
         <w:rPr>
@@ -1866,48 +2062,14 @@
           <w:color w:val="1A2340"/>
           <w:sz w:val="30"/>
         </w:rPr>
-        <w:t>把原則改成動作</w:t>
-      </w:r>
-    </w:p>
-    <w:p>
-      <w:pPr>
-        <w:keepNext w:val="0"/>
-        <w:keepLines w:val="0"/>
-        <w:spacing w:before="0" w:after="40" w:line="293" w:lineRule="auto"/>
-      </w:pPr>
-      <w:r>
-        <w:rPr>
-          <w:rFonts w:ascii="Arial Unicode MS" w:hAnsi="Arial Unicode MS" w:eastAsia="Arial Unicode MS"/>
-          <w:b/>
-          <w:i w:val="0"/>
-          <w:color w:val="1A2340"/>
-          <w:sz w:val="22"/>
-        </w:rPr>
-        <w:t>原則：重要的話，要有根據。</w:t>
-      </w:r>
-    </w:p>
-    <w:p>
-      <w:pPr>
-        <w:keepNext w:val="0"/>
-        <w:keepLines w:val="0"/>
-        <w:spacing w:before="0" w:after="60" w:line="293" w:lineRule="auto"/>
-      </w:pPr>
-      <w:r>
-        <w:rPr>
-          <w:rFonts w:ascii="Arial Unicode MS" w:hAnsi="Arial Unicode MS" w:eastAsia="Arial Unicode MS"/>
-          <w:b w:val="0"/>
-          <w:i w:val="0"/>
-          <w:color w:val="1A2340"/>
-          <w:sz w:val="22"/>
-        </w:rPr>
-        <w:t>例如：轉傳前，先打開原公告，對一下日期和內容。現在寫你的版本。</w:t>
+        <w:t>先說出我的理解</w:t>
       </w:r>
     </w:p>
     <w:p>
       <w:pPr>
         <w:keepNext/>
         <w:keepLines w:val="0"/>
-        <w:spacing w:before="80" w:after="40" w:line="293" w:lineRule="auto"/>
+        <w:spacing w:before="40" w:after="0" w:line="293" w:lineRule="auto"/>
       </w:pPr>
       <w:r>
         <w:rPr>
@@ -1937,24 +2099,7 @@
           <w:color w:val="1A2340"/>
           <w:sz w:val="22"/>
         </w:rPr>
-        <w:t>把這個原則改成你會做的動作</w:t>
-      </w:r>
-    </w:p>
-    <w:p>
-      <w:pPr>
-        <w:keepNext w:val="0"/>
-        <w:keepLines w:val="0"/>
-        <w:spacing w:before="0" w:after="0" w:line="293" w:lineRule="auto"/>
-      </w:pPr>
-      <w:r>
-        <w:rPr>
-          <w:rFonts w:ascii="Arial Unicode MS" w:hAnsi="Arial Unicode MS" w:eastAsia="Arial Unicode MS"/>
-          <w:b w:val="0"/>
-          <w:i w:val="0"/>
-          <w:color w:val="5B6573"/>
-          <w:sz w:val="22"/>
-        </w:rPr>
-        <w:t>我會先做什麼？這樣做可以確認什麼？</w:t>
+        <w:t>我選原則＿＿；我的說法是＿＿。可以補充或挑戰，請說理由。</w:t>
       </w:r>
     </w:p>
     <w:tbl>
@@ -2020,7 +2165,7 @@
           </w:tcPr>
           <w:p>
             <w:pPr>
-              <w:spacing w:before="0" w:after="20" w:line="240" w:lineRule="auto"/>
+              <w:spacing w:before="0" w:after="0" w:line="240" w:lineRule="auto"/>
             </w:pPr>
             <w:r>
               <w:t xml:space="preserve"> </w:t>
@@ -2033,7 +2178,7 @@
       <w:pPr>
         <w:keepNext/>
         <w:keepLines w:val="0"/>
-        <w:spacing w:before="0" w:after="0" w:line="293" w:lineRule="auto"/>
+        <w:spacing w:before="40" w:after="0" w:line="293" w:lineRule="auto"/>
       </w:pPr>
       <w:r>
         <w:rPr>
@@ -2043,7 +2188,7 @@
           <w:color w:val="5B6573"/>
           <w:sz w:val="22"/>
         </w:rPr>
-        <w:t>我的版本：</w:t>
+        <w:t>比較後，我修改／保留，因為（初答不要擦掉）：</w:t>
       </w:r>
     </w:p>
     <w:tbl>
@@ -2087,42 +2232,12 @@
           </w:p>
         </w:tc>
       </w:tr>
-      <w:tr>
-        <w:trPr>
-          <w:trHeight w:val="482" w:hRule="atLeast"/>
-        </w:trPr>
-        <w:tc>
-          <w:tcPr>
-            <w:tcW w:type="dxa" w:w="9865"/>
-            <w:tcMar>
-              <w:top w:w="0" w:type="dxa"/>
-              <w:start w:w="0" w:type="dxa"/>
-              <w:bottom w:w="0" w:type="dxa"/>
-              <w:end w:w="0" w:type="dxa"/>
-            </w:tcMar>
-            <w:tcBorders>
-              <w:top w:val="nil"/>
-              <w:bottom w:val="single" w:sz="5" w:space="0" w:color="CBD5E1"/>
-              <w:start w:val="nil"/>
-              <w:end w:val="nil"/>
-            </w:tcBorders>
-          </w:tcPr>
-          <w:p>
-            <w:pPr>
-              <w:spacing w:before="0" w:after="40" w:line="240" w:lineRule="auto"/>
-            </w:pPr>
-            <w:r>
-              <w:t xml:space="preserve"> </w:t>
-            </w:r>
-          </w:p>
-        </w:tc>
-      </w:tr>
     </w:tbl>
     <w:p>
       <w:pPr>
         <w:keepNext/>
         <w:keepLines w:val="0"/>
-        <w:spacing w:before="120" w:after="100" w:line="293" w:lineRule="auto"/>
+        <w:spacing w:before="80" w:after="100" w:line="293" w:lineRule="auto"/>
       </w:pPr>
       <w:r>
         <w:rPr>
@@ -2152,7 +2267,7 @@
           <w:color w:val="1A2340"/>
           <w:sz w:val="30"/>
         </w:rPr>
-        <w:t>一起設計課程活動</w:t>
+        <w:t>依三個原則，共創一個活動</w:t>
       </w:r>
     </w:p>
     <w:p>
@@ -2169,14 +2284,14 @@
           <w:color w:val="5B6573"/>
           <w:sz w:val="22"/>
         </w:rPr>
-        <w:t>每組提出 1 個活動，勾選它在練哪個問題，並寫出要留下的作品或紀錄。</w:t>
+        <w:t>每人先提想法，再共選一案；各自在下面簡記本組提案，不抄投影範例。</w:t>
       </w:r>
     </w:p>
     <w:p>
       <w:pPr>
         <w:keepNext/>
         <w:keepLines w:val="0"/>
-        <w:spacing w:before="120" w:after="40" w:line="293" w:lineRule="auto"/>
+        <w:spacing w:before="40" w:after="0" w:line="293" w:lineRule="auto"/>
       </w:pPr>
       <w:r>
         <w:rPr>
@@ -2206,68 +2321,7 @@
           <w:color w:val="1A2340"/>
           <w:sz w:val="22"/>
         </w:rPr>
-        <w:t>活動 1</w:t>
-      </w:r>
-    </w:p>
-    <w:p>
-      <w:pPr>
-        <w:keepNext w:val="0"/>
-        <w:keepLines w:val="0"/>
-        <w:spacing w:before="0" w:after="20" w:line="293" w:lineRule="auto"/>
-      </w:pPr>
-      <w:r>
-        <w:rPr>
-          <w:rFonts w:ascii="Arial Unicode MS" w:hAnsi="Arial Unicode MS" w:eastAsia="Arial Unicode MS"/>
-          <w:b/>
-          <w:i w:val="0"/>
-          <w:color w:val="1A2340"/>
-          <w:sz w:val="22"/>
-        </w:rPr>
-        <w:t>活動：</w:t>
-      </w:r>
-      <w:r>
-        <w:rPr>
-          <w:rFonts w:ascii="JetBrains Mono" w:hAnsi="JetBrains Mono" w:eastAsia="Arial Unicode MS"/>
-          <w:b w:val="0"/>
-          <w:i w:val="0"/>
-          <w:color w:val="5B6573"/>
-          <w:sz w:val="22"/>
-        </w:rPr>
-        <w:t>____________________________________________________________</w:t>
-      </w:r>
-    </w:p>
-    <w:p>
-      <w:pPr>
-        <w:keepNext w:val="0"/>
-        <w:keepLines w:val="0"/>
-        <w:spacing w:before="0" w:after="0" w:line="293" w:lineRule="auto"/>
-      </w:pPr>
-      <w:r>
-        <w:rPr>
-          <w:rFonts w:ascii="Arial Unicode MS" w:hAnsi="Arial Unicode MS" w:eastAsia="Arial Unicode MS"/>
-          <w:b w:val="0"/>
-          <w:i w:val="0"/>
-          <w:color w:val="5B6573"/>
-          <w:sz w:val="22"/>
-        </w:rPr>
-        <w:t>它在練：□ 文字怎麼來　□ 根據什麼　□ 誰願意負責</w:t>
-      </w:r>
-    </w:p>
-    <w:p>
-      <w:pPr>
-        <w:keepNext/>
-        <w:keepLines w:val="0"/>
-        <w:spacing w:before="0" w:after="0" w:line="293" w:lineRule="auto"/>
-      </w:pPr>
-      <w:r>
-        <w:rPr>
-          <w:rFonts w:ascii="Arial Unicode MS" w:hAnsi="Arial Unicode MS" w:eastAsia="Arial Unicode MS"/>
-          <w:b w:val="0"/>
-          <w:i w:val="0"/>
-          <w:color w:val="5B6573"/>
-          <w:sz w:val="22"/>
-        </w:rPr>
-        <w:t>做完要留下的作品或紀錄：</w:t>
+        <w:t>本組想做的活動：</w:t>
       </w:r>
     </w:p>
     <w:tbl>
@@ -2283,7 +2337,7 @@
       </w:tblGrid>
       <w:tr>
         <w:trPr>
-          <w:trHeight w:val="510" w:hRule="atLeast"/>
+          <w:trHeight w:val="482" w:hRule="atLeast"/>
         </w:trPr>
         <w:tc>
           <w:tcPr>
@@ -2303,7 +2357,243 @@
           </w:tcPr>
           <w:p>
             <w:pPr>
-              <w:spacing w:before="0" w:after="20" w:line="240" w:lineRule="auto"/>
+              <w:spacing w:before="0" w:after="0" w:line="240" w:lineRule="auto"/>
+            </w:pPr>
+            <w:r>
+              <w:t xml:space="preserve"> </w:t>
+            </w:r>
+          </w:p>
+        </w:tc>
+      </w:tr>
+    </w:tbl>
+    <w:p>
+      <w:pPr>
+        <w:keepNext/>
+        <w:keepLines w:val="0"/>
+        <w:spacing w:before="40" w:after="0" w:line="293" w:lineRule="auto"/>
+      </w:pPr>
+      <w:r>
+        <w:rPr>
+          <w:rFonts w:ascii="Arial Unicode MS" w:hAnsi="Arial Unicode MS" w:eastAsia="Arial Unicode MS"/>
+          <w:b w:val="0"/>
+          <w:i w:val="0"/>
+          <w:color w:val="5B6573"/>
+          <w:sz w:val="22"/>
+        </w:rPr>
+        <w:t>原則 1｜學生會做什麼判斷或選擇？</w:t>
+      </w:r>
+    </w:p>
+    <w:tbl>
+      <w:tblPr>
+        <w:tblW w:type="dxa" w:w="9865"/>
+        <w:jc w:val="left"/>
+        <w:tblLayout w:type="fixed"/>
+        <w:tblLook w:firstColumn="1" w:firstRow="1" w:lastColumn="0" w:lastRow="0" w:noHBand="0" w:noVBand="1" w:val="04A0"/>
+        <w:tblInd w:type="dxa" w:w="0"/>
+      </w:tblPr>
+      <w:tblGrid>
+        <w:gridCol w:w="9865"/>
+      </w:tblGrid>
+      <w:tr>
+        <w:trPr>
+          <w:trHeight w:val="482" w:hRule="atLeast"/>
+        </w:trPr>
+        <w:tc>
+          <w:tcPr>
+            <w:tcW w:type="dxa" w:w="9865"/>
+            <w:tcMar>
+              <w:top w:w="0" w:type="dxa"/>
+              <w:start w:w="0" w:type="dxa"/>
+              <w:bottom w:w="0" w:type="dxa"/>
+              <w:end w:w="0" w:type="dxa"/>
+            </w:tcMar>
+            <w:tcBorders>
+              <w:top w:val="nil"/>
+              <w:bottom w:val="single" w:sz="5" w:space="0" w:color="CBD5E1"/>
+              <w:start w:val="nil"/>
+              <w:end w:val="nil"/>
+            </w:tcBorders>
+          </w:tcPr>
+          <w:p>
+            <w:pPr>
+              <w:spacing w:before="0" w:after="0" w:line="240" w:lineRule="auto"/>
+            </w:pPr>
+            <w:r>
+              <w:t xml:space="preserve"> </w:t>
+            </w:r>
+          </w:p>
+        </w:tc>
+      </w:tr>
+    </w:tbl>
+    <w:p>
+      <w:pPr>
+        <w:keepNext/>
+        <w:keepLines w:val="0"/>
+        <w:spacing w:before="40" w:after="0" w:line="293" w:lineRule="auto"/>
+      </w:pPr>
+      <w:r>
+        <w:rPr>
+          <w:rFonts w:ascii="Arial Unicode MS" w:hAnsi="Arial Unicode MS" w:eastAsia="Arial Unicode MS"/>
+          <w:b w:val="0"/>
+          <w:i w:val="0"/>
+          <w:color w:val="5B6573"/>
+          <w:sz w:val="22"/>
+        </w:rPr>
+        <w:t>原則 2｜哪些說法要查？去哪裡找根據？</w:t>
+      </w:r>
+    </w:p>
+    <w:tbl>
+      <w:tblPr>
+        <w:tblW w:type="dxa" w:w="9865"/>
+        <w:jc w:val="left"/>
+        <w:tblLayout w:type="fixed"/>
+        <w:tblLook w:firstColumn="1" w:firstRow="1" w:lastColumn="0" w:lastRow="0" w:noHBand="0" w:noVBand="1" w:val="04A0"/>
+        <w:tblInd w:type="dxa" w:w="0"/>
+      </w:tblPr>
+      <w:tblGrid>
+        <w:gridCol w:w="9865"/>
+      </w:tblGrid>
+      <w:tr>
+        <w:trPr>
+          <w:trHeight w:val="482" w:hRule="atLeast"/>
+        </w:trPr>
+        <w:tc>
+          <w:tcPr>
+            <w:tcW w:type="dxa" w:w="9865"/>
+            <w:tcMar>
+              <w:top w:w="0" w:type="dxa"/>
+              <w:start w:w="0" w:type="dxa"/>
+              <w:bottom w:w="0" w:type="dxa"/>
+              <w:end w:w="0" w:type="dxa"/>
+            </w:tcMar>
+            <w:tcBorders>
+              <w:top w:val="nil"/>
+              <w:bottom w:val="single" w:sz="5" w:space="0" w:color="CBD5E1"/>
+              <w:start w:val="nil"/>
+              <w:end w:val="nil"/>
+            </w:tcBorders>
+          </w:tcPr>
+          <w:p>
+            <w:pPr>
+              <w:spacing w:before="0" w:after="0" w:line="240" w:lineRule="auto"/>
+            </w:pPr>
+            <w:r>
+              <w:t xml:space="preserve"> </w:t>
+            </w:r>
+          </w:p>
+        </w:tc>
+      </w:tr>
+    </w:tbl>
+    <w:p>
+      <w:pPr>
+        <w:keepNext/>
+        <w:keepLines w:val="0"/>
+        <w:spacing w:before="40" w:after="0" w:line="293" w:lineRule="auto"/>
+      </w:pPr>
+      <w:r>
+        <w:rPr>
+          <w:rFonts w:ascii="Arial Unicode MS" w:hAnsi="Arial Unicode MS" w:eastAsia="Arial Unicode MS"/>
+          <w:b w:val="0"/>
+          <w:i w:val="0"/>
+          <w:color w:val="5B6573"/>
+          <w:sz w:val="22"/>
+        </w:rPr>
+        <w:t>原則 3｜誰來閱讀？作者怎麼回應或修改？</w:t>
+      </w:r>
+    </w:p>
+    <w:tbl>
+      <w:tblPr>
+        <w:tblW w:type="dxa" w:w="9865"/>
+        <w:jc w:val="left"/>
+        <w:tblLayout w:type="fixed"/>
+        <w:tblLook w:firstColumn="1" w:firstRow="1" w:lastColumn="0" w:lastRow="0" w:noHBand="0" w:noVBand="1" w:val="04A0"/>
+        <w:tblInd w:type="dxa" w:w="0"/>
+      </w:tblPr>
+      <w:tblGrid>
+        <w:gridCol w:w="9865"/>
+      </w:tblGrid>
+      <w:tr>
+        <w:trPr>
+          <w:trHeight w:val="482" w:hRule="atLeast"/>
+        </w:trPr>
+        <w:tc>
+          <w:tcPr>
+            <w:tcW w:type="dxa" w:w="9865"/>
+            <w:tcMar>
+              <w:top w:w="0" w:type="dxa"/>
+              <w:start w:w="0" w:type="dxa"/>
+              <w:bottom w:w="0" w:type="dxa"/>
+              <w:end w:w="0" w:type="dxa"/>
+            </w:tcMar>
+            <w:tcBorders>
+              <w:top w:val="nil"/>
+              <w:bottom w:val="single" w:sz="5" w:space="0" w:color="CBD5E1"/>
+              <w:start w:val="nil"/>
+              <w:end w:val="nil"/>
+            </w:tcBorders>
+          </w:tcPr>
+          <w:p>
+            <w:pPr>
+              <w:spacing w:before="0" w:after="0" w:line="240" w:lineRule="auto"/>
+            </w:pPr>
+            <w:r>
+              <w:t xml:space="preserve"> </w:t>
+            </w:r>
+          </w:p>
+        </w:tc>
+      </w:tr>
+    </w:tbl>
+    <w:p>
+      <w:pPr>
+        <w:keepNext/>
+        <w:keepLines w:val="0"/>
+        <w:spacing w:before="40" w:after="0" w:line="293" w:lineRule="auto"/>
+      </w:pPr>
+      <w:r>
+        <w:rPr>
+          <w:rFonts w:ascii="Arial Unicode MS" w:hAnsi="Arial Unicode MS" w:eastAsia="Arial Unicode MS"/>
+          <w:b w:val="0"/>
+          <w:i w:val="0"/>
+          <w:color w:val="5B6573"/>
+          <w:sz w:val="22"/>
+        </w:rPr>
+        <w:t>做完會留下什麼作品或紀錄？</w:t>
+      </w:r>
+    </w:p>
+    <w:tbl>
+      <w:tblPr>
+        <w:tblW w:type="dxa" w:w="9865"/>
+        <w:jc w:val="left"/>
+        <w:tblLayout w:type="fixed"/>
+        <w:tblLook w:firstColumn="1" w:firstRow="1" w:lastColumn="0" w:lastRow="0" w:noHBand="0" w:noVBand="1" w:val="04A0"/>
+        <w:tblInd w:type="dxa" w:w="0"/>
+      </w:tblPr>
+      <w:tblGrid>
+        <w:gridCol w:w="9865"/>
+      </w:tblGrid>
+      <w:tr>
+        <w:trPr>
+          <w:trHeight w:val="482" w:hRule="atLeast"/>
+        </w:trPr>
+        <w:tc>
+          <w:tcPr>
+            <w:tcW w:type="dxa" w:w="9865"/>
+            <w:tcMar>
+              <w:top w:w="0" w:type="dxa"/>
+              <w:start w:w="0" w:type="dxa"/>
+              <w:bottom w:w="0" w:type="dxa"/>
+              <w:end w:w="0" w:type="dxa"/>
+            </w:tcMar>
+            <w:tcBorders>
+              <w:top w:val="nil"/>
+              <w:bottom w:val="single" w:sz="5" w:space="0" w:color="CBD5E1"/>
+              <w:start w:val="nil"/>
+              <w:end w:val="nil"/>
+            </w:tcBorders>
+          </w:tcPr>
+          <w:p>
+            <w:pPr>
+              <w:spacing w:before="0" w:after="0" w:line="240" w:lineRule="auto"/>
             </w:pPr>
             <w:r>
               <w:t xml:space="preserve"> </w:t>
@@ -2820,7 +3110,7 @@
           <w:color w:val="5B6573"/>
           <w:sz w:val="22"/>
         </w:rPr>
-        <w:t>請寫 50–100 字：</w:t>
+        <w:t>課後另紙寫 50–100 字，下週夾回這一頁，不必重抄：</w:t>
       </w:r>
     </w:p>
     <w:tbl>
@@ -2913,108 +3203,6 @@
         </w:tc>
       </w:tr>
     </w:tbl>
-    <w:tbl>
-      <w:tblPr>
-        <w:tblW w:type="dxa" w:w="9865"/>
-        <w:jc w:val="left"/>
-        <w:tblLayout w:type="fixed"/>
-        <w:tblLook w:firstColumn="1" w:firstRow="1" w:lastColumn="0" w:lastRow="0" w:noHBand="0" w:noVBand="1" w:val="04A0"/>
-        <w:tblInd w:type="dxa" w:w="0"/>
-      </w:tblPr>
-      <w:tblGrid>
-        <w:gridCol w:w="9865"/>
-      </w:tblGrid>
-      <w:tr>
-        <w:trPr>
-          <w:trHeight w:val="482" w:hRule="atLeast"/>
-        </w:trPr>
-        <w:tc>
-          <w:tcPr>
-            <w:tcW w:type="dxa" w:w="9865"/>
-            <w:tcMar>
-              <w:top w:w="0" w:type="dxa"/>
-              <w:start w:w="0" w:type="dxa"/>
-              <w:bottom w:w="0" w:type="dxa"/>
-              <w:end w:w="0" w:type="dxa"/>
-            </w:tcMar>
-            <w:tcBorders>
-              <w:top w:val="nil"/>
-              <w:bottom w:val="single" w:sz="5" w:space="0" w:color="CBD5E1"/>
-              <w:start w:val="nil"/>
-              <w:end w:val="nil"/>
-            </w:tcBorders>
-          </w:tcPr>
-          <w:p>
-            <w:pPr>
-              <w:spacing w:before="0" w:after="0" w:line="240" w:lineRule="auto"/>
-            </w:pPr>
-            <w:r>
-              <w:t xml:space="preserve"> </w:t>
-            </w:r>
-          </w:p>
-        </w:tc>
-      </w:tr>
-      <w:tr>
-        <w:trPr>
-          <w:trHeight w:val="482" w:hRule="atLeast"/>
-        </w:trPr>
-        <w:tc>
-          <w:tcPr>
-            <w:tcW w:type="dxa" w:w="9865"/>
-            <w:tcMar>
-              <w:top w:w="0" w:type="dxa"/>
-              <w:start w:w="0" w:type="dxa"/>
-              <w:bottom w:w="0" w:type="dxa"/>
-              <w:end w:w="0" w:type="dxa"/>
-            </w:tcMar>
-            <w:tcBorders>
-              <w:top w:val="nil"/>
-              <w:bottom w:val="single" w:sz="5" w:space="0" w:color="CBD5E1"/>
-              <w:start w:val="nil"/>
-              <w:end w:val="nil"/>
-            </w:tcBorders>
-          </w:tcPr>
-          <w:p>
-            <w:pPr>
-              <w:spacing w:before="0" w:after="0" w:line="240" w:lineRule="auto"/>
-            </w:pPr>
-            <w:r>
-              <w:t xml:space="preserve"> </w:t>
-            </w:r>
-          </w:p>
-        </w:tc>
-      </w:tr>
-      <w:tr>
-        <w:trPr>
-          <w:trHeight w:val="482" w:hRule="atLeast"/>
-        </w:trPr>
-        <w:tc>
-          <w:tcPr>
-            <w:tcW w:type="dxa" w:w="9865"/>
-            <w:tcMar>
-              <w:top w:w="0" w:type="dxa"/>
-              <w:start w:w="0" w:type="dxa"/>
-              <w:bottom w:w="0" w:type="dxa"/>
-              <w:end w:w="0" w:type="dxa"/>
-            </w:tcMar>
-            <w:tcBorders>
-              <w:top w:val="nil"/>
-              <w:bottom w:val="single" w:sz="5" w:space="0" w:color="CBD5E1"/>
-              <w:start w:val="nil"/>
-              <w:end w:val="nil"/>
-            </w:tcBorders>
-          </w:tcPr>
-          <w:p>
-            <w:pPr>
-              <w:spacing w:before="0" w:after="40" w:line="240" w:lineRule="auto"/>
-            </w:pPr>
-            <w:r>
-              <w:t xml:space="preserve"> </w:t>
-            </w:r>
-          </w:p>
-        </w:tc>
-      </w:tr>
-    </w:tbl>
     <w:p>
       <w:pPr>
         <w:keepNext w:val="0"/>
@@ -3100,7 +3288,7 @@
           <w:color w:val="5B6573"/>
           <w:sz w:val="20"/>
         </w:rPr>
-        <w:t>□ 第 3 頁：一個改寫後的原則，看得出你實際要做哪些動作</w:t>
+        <w:t>□ 第 3 頁：自己的原則理解＋本組提案，說清楚三個原則怎麼用上</w:t>
       </w:r>
     </w:p>
     <w:p>
@@ -3134,7 +3322,7 @@
           <w:color w:val="5B6573"/>
           <w:sz w:val="20"/>
         </w:rPr>
-        <w:t>拍自己的頁面上傳原有的 Classroom 作業；紙本下課前交回，由老師保管。</w:t>
+        <w:t>拍自己的頁面，上傳原有 Classroom 作業並確認已繳交，再交回紙本由老師保管。</w:t>
       </w:r>
     </w:p>
     <w:sectPr>

</xml_diff>

<commit_message>
Unify academic diagrams and merge exercises into weekly workbooks
</commit_message>
<xml_diff>
--- a/worksheets/W1.docx
+++ b/worksheets/W1.docx
@@ -3322,7 +3322,463 @@
           <w:color w:val="5B6573"/>
           <w:sz w:val="20"/>
         </w:rPr>
-        <w:t>拍自己的頁面，上傳原有 Classroom 作業並確認已繳交，再交回紙本由老師保管。</w:t>
+        <w:t>拍自己的第 1–4 頁，上傳原有 Classroom 作業並確認已繳交，再交回紙本由老師保管。</w:t>
+      </w:r>
+    </w:p>
+    <w:p>
+      <w:r>
+        <w:br w:type="page"/>
+      </w:r>
+    </w:p>
+    <w:p>
+      <w:pPr>
+        <w:spacing w:after="100" w:line="312" w:lineRule="auto"/>
+      </w:pPr>
+      <w:r>
+        <w:rPr>
+          <w:rFonts w:ascii="Arial Unicode MS" w:hAnsi="Arial Unicode MS" w:eastAsia="Arial Unicode MS"/>
+          <w:b/>
+          <w:sz w:val="44"/>
+        </w:rPr>
+        <w:t>W1 / 05 · 學科遷移｜原題材料</w:t>
+      </w:r>
+    </w:p>
+    <w:p>
+      <w:pPr>
+        <w:spacing w:after="100" w:line="312" w:lineRule="auto"/>
+      </w:pPr>
+      <w:r>
+        <w:rPr>
+          <w:rFonts w:ascii="Arial Unicode MS" w:hAnsi="Arial Unicode MS" w:eastAsia="Arial Unicode MS"/>
+          <w:b/>
+          <w:sz w:val="22"/>
+        </w:rPr>
+        <w:t>課堂必寫｜83–95 分。原題在本頁，自己的解題留第 6 頁。</w:t>
+      </w:r>
+    </w:p>
+    <w:p>
+      <w:pPr>
+        <w:spacing w:after="100" w:line="312" w:lineRule="auto"/>
+      </w:pPr>
+      <w:r>
+        <w:rPr>
+          <w:rFonts w:ascii="Arial Unicode MS" w:hAnsi="Arial Unicode MS" w:eastAsia="Arial Unicode MS"/>
+          <w:b w:val="0"/>
+          <w:sz w:val="21"/>
+        </w:rPr>
+        <w:t>115 學測國綜第 6–8 題材料・印刷第 2 頁。原材料節錄；查核問題由本課設計，非第 7 題原題。</w:t>
+      </w:r>
+    </w:p>
+    <w:p>
+      <w:r>
+        <w:drawing>
+          <wp:inline xmlns:a="http://schemas.openxmlformats.org/drawingml/2006/main" xmlns:pic="http://schemas.openxmlformats.org/drawingml/2006/picture">
+            <wp:extent cx="6264000" cy="4264022"/>
+            <wp:docPr id="1" name="Picture 1"/>
+            <wp:cNvGraphicFramePr>
+              <a:graphicFrameLocks noChangeAspect="1"/>
+            </wp:cNvGraphicFramePr>
+            <a:graphic>
+              <a:graphicData uri="http://schemas.openxmlformats.org/drawingml/2006/picture">
+                <pic:pic>
+                  <pic:nvPicPr>
+                    <pic:cNvPr id="0" name="w1.png"/>
+                    <pic:cNvPicPr/>
+                  </pic:nvPicPr>
+                  <pic:blipFill>
+                    <a:blip r:embed="rId11"/>
+                    <a:stretch>
+                      <a:fillRect/>
+                    </a:stretch>
+                  </pic:blipFill>
+                  <pic:spPr>
+                    <a:xfrm>
+                      <a:off x="0" y="0"/>
+                      <a:ext cx="6264000" cy="4264022"/>
+                    </a:xfrm>
+                    <a:prstGeom prst="rect"/>
+                  </pic:spPr>
+                </pic:pic>
+              </a:graphicData>
+            </a:graphic>
+          </wp:inline>
+        </w:drawing>
+      </w:r>
+    </w:p>
+    <w:p>
+      <w:pPr>
+        <w:spacing w:after="100" w:line="312" w:lineRule="auto"/>
+      </w:pPr>
+      <w:r>
+        <w:rPr>
+          <w:rFonts w:ascii="Arial Unicode MS" w:hAnsi="Arial Unicode MS" w:eastAsia="Arial Unicode MS"/>
+          <w:b/>
+          <w:sz w:val="22"/>
+        </w:rPr>
+        <w:t>任務｜這句話，原文支持嗎？「臺灣杉只存在臺灣。」先讀原文，留下初判與依據位置，再決定保留或改寫，並說明理由；資料不足可暫不判定。</w:t>
+      </w:r>
+    </w:p>
+    <w:p>
+      <w:pPr>
+        <w:spacing w:after="100" w:line="312" w:lineRule="auto"/>
+      </w:pPr>
+      <w:r>
+        <w:rPr>
+          <w:rFonts w:ascii="Arial Unicode MS" w:hAnsi="Arial Unicode MS" w:eastAsia="Arial Unicode MS"/>
+          <w:b w:val="0"/>
+          <w:sz w:val="22"/>
+        </w:rPr>
+        <w:t>需要時回查｜特有：只分布在某個限定地區。詞注幫助讀懂用語，這句話是否成立仍要回原文判斷。</w:t>
+      </w:r>
+    </w:p>
+    <w:p>
+      <w:pPr>
+        <w:spacing w:after="100" w:line="312" w:lineRule="auto"/>
+      </w:pPr>
+      <w:r>
+        <w:rPr>
+          <w:rFonts w:ascii="Arial Unicode MS" w:hAnsi="Arial Unicode MS" w:eastAsia="Arial Unicode MS"/>
+          <w:b w:val="0"/>
+          <w:sz w:val="22"/>
+        </w:rPr>
+        <w:t>原圖可直接圈線索；不必抄原文。完整原卷與最後詳解見本週投影。</w:t>
+      </w:r>
+    </w:p>
+    <w:p>
+      <w:r>
+        <w:br w:type="page"/>
+      </w:r>
+    </w:p>
+    <w:p>
+      <w:pPr>
+        <w:spacing w:after="100" w:line="312" w:lineRule="auto"/>
+      </w:pPr>
+      <w:r>
+        <w:rPr>
+          <w:rFonts w:ascii="Arial Unicode MS" w:hAnsi="Arial Unicode MS" w:eastAsia="Arial Unicode MS"/>
+          <w:b/>
+          <w:sz w:val="44"/>
+        </w:rPr>
+        <w:t>W1 / 06 · 自己的解題來路</w:t>
+      </w:r>
+    </w:p>
+    <w:p>
+      <w:pPr>
+        <w:spacing w:after="100" w:line="312" w:lineRule="auto"/>
+      </w:pPr>
+      <w:r>
+        <w:rPr>
+          <w:rFonts w:ascii="Arial Unicode MS" w:hAnsi="Arial Unicode MS" w:eastAsia="Arial Unicode MS"/>
+          <w:b/>
+          <w:sz w:val="22"/>
+        </w:rPr>
+        <w:t>課堂必寫｜保留初答，學科練習不計分、不另上傳。</w:t>
+      </w:r>
+    </w:p>
+    <w:p>
+      <w:pPr>
+        <w:spacing w:after="100" w:line="312" w:lineRule="auto"/>
+      </w:pPr>
+      <w:r>
+        <w:rPr>
+          <w:rFonts w:ascii="Arial Unicode MS" w:hAnsi="Arial Unicode MS" w:eastAsia="Arial Unicode MS"/>
+          <w:b/>
+          <w:sz w:val="30"/>
+        </w:rPr>
+        <w:t>01｜初答與依據／草圖／算式</w:t>
+      </w:r>
+    </w:p>
+    <w:p>
+      <w:pPr>
+        <w:spacing w:after="100" w:line="312" w:lineRule="auto"/>
+      </w:pPr>
+      <w:r>
+        <w:rPr>
+          <w:rFonts w:ascii="Arial Unicode MS" w:hAnsi="Arial Unicode MS" w:eastAsia="Arial Unicode MS"/>
+          <w:b w:val="0"/>
+          <w:sz w:val="22"/>
+        </w:rPr>
+        <w:t>🔒 不使用 AI｜第 5 頁可直接圈線索；未解完，記已走到的步驟或卡點。</w:t>
+      </w:r>
+    </w:p>
+    <w:p>
+      <w:pPr>
+        <w:spacing w:after="0" w:line="510" w:lineRule="exact"/>
+        <w:pBdr>
+          <w:bottom w:val="single" w:sz="4" w:color="CBD5E1"/>
+        </w:pBdr>
+      </w:pPr>
+      <w:r>
+        <w:rPr>
+          <w:rFonts w:ascii="Arial Unicode MS" w:hAnsi="Arial Unicode MS" w:eastAsia="Arial Unicode MS"/>
+          <w:b w:val="0"/>
+          <w:sz w:val="22"/>
+        </w:rPr>
+        <w:t xml:space="preserve">　</w:t>
+      </w:r>
+    </w:p>
+    <w:p>
+      <w:pPr>
+        <w:spacing w:after="0" w:line="510" w:lineRule="exact"/>
+        <w:pBdr>
+          <w:bottom w:val="single" w:sz="4" w:color="CBD5E1"/>
+        </w:pBdr>
+      </w:pPr>
+      <w:r>
+        <w:rPr>
+          <w:rFonts w:ascii="Arial Unicode MS" w:hAnsi="Arial Unicode MS" w:eastAsia="Arial Unicode MS"/>
+          <w:b w:val="0"/>
+          <w:sz w:val="22"/>
+        </w:rPr>
+        <w:t xml:space="preserve">　</w:t>
+      </w:r>
+    </w:p>
+    <w:p>
+      <w:pPr>
+        <w:spacing w:after="0" w:line="510" w:lineRule="exact"/>
+        <w:pBdr>
+          <w:bottom w:val="single" w:sz="4" w:color="CBD5E1"/>
+        </w:pBdr>
+      </w:pPr>
+      <w:r>
+        <w:rPr>
+          <w:rFonts w:ascii="Arial Unicode MS" w:hAnsi="Arial Unicode MS" w:eastAsia="Arial Unicode MS"/>
+          <w:b w:val="0"/>
+          <w:sz w:val="22"/>
+        </w:rPr>
+        <w:t xml:space="preserve">　</w:t>
+      </w:r>
+    </w:p>
+    <w:p>
+      <w:pPr>
+        <w:spacing w:after="0" w:line="510" w:lineRule="exact"/>
+        <w:pBdr>
+          <w:bottom w:val="single" w:sz="4" w:color="CBD5E1"/>
+        </w:pBdr>
+      </w:pPr>
+      <w:r>
+        <w:rPr>
+          <w:rFonts w:ascii="Arial Unicode MS" w:hAnsi="Arial Unicode MS" w:eastAsia="Arial Unicode MS"/>
+          <w:b w:val="0"/>
+          <w:sz w:val="22"/>
+        </w:rPr>
+        <w:t xml:space="preserve">　</w:t>
+      </w:r>
+    </w:p>
+    <w:p>
+      <w:pPr>
+        <w:spacing w:after="100" w:line="312" w:lineRule="auto"/>
+      </w:pPr>
+      <w:r>
+        <w:rPr>
+          <w:rFonts w:ascii="Arial Unicode MS" w:hAnsi="Arial Unicode MS" w:eastAsia="Arial Unicode MS"/>
+          <w:b/>
+          <w:sz w:val="30"/>
+        </w:rPr>
+        <w:t>02｜提示與搭檔實際回應</w:t>
+      </w:r>
+    </w:p>
+    <w:p>
+      <w:pPr>
+        <w:spacing w:after="100" w:line="312" w:lineRule="auto"/>
+      </w:pPr>
+      <w:r>
+        <w:rPr>
+          <w:rFonts w:ascii="Arial Unicode MS" w:hAnsi="Arial Unicode MS" w:eastAsia="Arial Unicode MS"/>
+          <w:b w:val="0"/>
+          <w:sz w:val="22"/>
+        </w:rPr>
+        <w:t>提示 □未用 □1 □2 □3　搭檔座號＿＿＿</w:t>
+      </w:r>
+    </w:p>
+    <w:p>
+      <w:pPr>
+        <w:spacing w:after="0" w:line="510" w:lineRule="exact"/>
+        <w:pBdr>
+          <w:bottom w:val="single" w:sz="4" w:color="CBD5E1"/>
+        </w:pBdr>
+      </w:pPr>
+      <w:r>
+        <w:rPr>
+          <w:rFonts w:ascii="Arial Unicode MS" w:hAnsi="Arial Unicode MS" w:eastAsia="Arial Unicode MS"/>
+          <w:b w:val="0"/>
+          <w:sz w:val="22"/>
+        </w:rPr>
+        <w:t xml:space="preserve">　</w:t>
+      </w:r>
+    </w:p>
+    <w:p>
+      <w:pPr>
+        <w:spacing w:after="0" w:line="510" w:lineRule="exact"/>
+        <w:pBdr>
+          <w:bottom w:val="single" w:sz="4" w:color="CBD5E1"/>
+        </w:pBdr>
+      </w:pPr>
+      <w:r>
+        <w:rPr>
+          <w:rFonts w:ascii="Arial Unicode MS" w:hAnsi="Arial Unicode MS" w:eastAsia="Arial Unicode MS"/>
+          <w:b w:val="0"/>
+          <w:sz w:val="22"/>
+        </w:rPr>
+        <w:t xml:space="preserve">　</w:t>
+      </w:r>
+    </w:p>
+    <w:p>
+      <w:pPr>
+        <w:spacing w:after="100" w:line="312" w:lineRule="auto"/>
+      </w:pPr>
+      <w:r>
+        <w:rPr>
+          <w:rFonts w:ascii="Arial Unicode MS" w:hAnsi="Arial Unicode MS" w:eastAsia="Arial Unicode MS"/>
+          <w:b/>
+          <w:sz w:val="30"/>
+        </w:rPr>
+        <w:t>03｜本人改／留與理由</w:t>
+      </w:r>
+    </w:p>
+    <w:p>
+      <w:pPr>
+        <w:spacing w:after="100" w:line="312" w:lineRule="auto"/>
+      </w:pPr>
+      <w:r>
+        <w:rPr>
+          <w:rFonts w:ascii="Arial Unicode MS" w:hAnsi="Arial Unicode MS" w:eastAsia="Arial Unicode MS"/>
+          <w:b w:val="0"/>
+          <w:sz w:val="22"/>
+        </w:rPr>
+        <w:t>寫下你決定保留或改寫的句子；旁記原文位置與理由。</w:t>
+      </w:r>
+    </w:p>
+    <w:p>
+      <w:pPr>
+        <w:spacing w:after="0" w:line="510" w:lineRule="exact"/>
+        <w:pBdr>
+          <w:bottom w:val="single" w:sz="4" w:color="CBD5E1"/>
+        </w:pBdr>
+      </w:pPr>
+      <w:r>
+        <w:rPr>
+          <w:rFonts w:ascii="Arial Unicode MS" w:hAnsi="Arial Unicode MS" w:eastAsia="Arial Unicode MS"/>
+          <w:b w:val="0"/>
+          <w:sz w:val="22"/>
+        </w:rPr>
+        <w:t xml:space="preserve">　</w:t>
+      </w:r>
+    </w:p>
+    <w:p>
+      <w:pPr>
+        <w:spacing w:after="0" w:line="510" w:lineRule="exact"/>
+        <w:pBdr>
+          <w:bottom w:val="single" w:sz="4" w:color="CBD5E1"/>
+        </w:pBdr>
+      </w:pPr>
+      <w:r>
+        <w:rPr>
+          <w:rFonts w:ascii="Arial Unicode MS" w:hAnsi="Arial Unicode MS" w:eastAsia="Arial Unicode MS"/>
+          <w:b w:val="0"/>
+          <w:sz w:val="22"/>
+        </w:rPr>
+        <w:t xml:space="preserve">　</w:t>
+      </w:r>
+    </w:p>
+    <w:p>
+      <w:pPr>
+        <w:spacing w:after="0" w:line="510" w:lineRule="exact"/>
+        <w:pBdr>
+          <w:bottom w:val="single" w:sz="4" w:color="CBD5E1"/>
+        </w:pBdr>
+      </w:pPr>
+      <w:r>
+        <w:rPr>
+          <w:rFonts w:ascii="Arial Unicode MS" w:hAnsi="Arial Unicode MS" w:eastAsia="Arial Unicode MS"/>
+          <w:b w:val="0"/>
+          <w:sz w:val="22"/>
+        </w:rPr>
+        <w:t xml:space="preserve">　</w:t>
+      </w:r>
+    </w:p>
+    <w:p>
+      <w:pPr>
+        <w:spacing w:after="100" w:line="312" w:lineRule="auto"/>
+      </w:pPr>
+      <w:r>
+        <w:rPr>
+          <w:rFonts w:ascii="Arial Unicode MS" w:hAnsi="Arial Unicode MS" w:eastAsia="Arial Unicode MS"/>
+          <w:b/>
+          <w:sz w:val="30"/>
+        </w:rPr>
+        <w:t>04｜看詳解，只核對一步</w:t>
+      </w:r>
+    </w:p>
+    <w:p>
+      <w:pPr>
+        <w:spacing w:after="100" w:line="312" w:lineRule="auto"/>
+      </w:pPr>
+      <w:r>
+        <w:rPr>
+          <w:rFonts w:ascii="Arial Unicode MS" w:hAnsi="Arial Unicode MS" w:eastAsia="Arial Unicode MS"/>
+          <w:b w:val="0"/>
+          <w:sz w:val="22"/>
+        </w:rPr>
+        <w:t>□相符 □發現差異 □仍有疑問；位置／下一步要查：</w:t>
+      </w:r>
+    </w:p>
+    <w:p>
+      <w:pPr>
+        <w:spacing w:after="0" w:line="510" w:lineRule="exact"/>
+        <w:pBdr>
+          <w:bottom w:val="single" w:sz="4" w:color="CBD5E1"/>
+        </w:pBdr>
+      </w:pPr>
+      <w:r>
+        <w:rPr>
+          <w:rFonts w:ascii="Arial Unicode MS" w:hAnsi="Arial Unicode MS" w:eastAsia="Arial Unicode MS"/>
+          <w:b w:val="0"/>
+          <w:sz w:val="22"/>
+        </w:rPr>
+        <w:t xml:space="preserve">　</w:t>
+      </w:r>
+    </w:p>
+    <w:p>
+      <w:pPr>
+        <w:spacing w:after="0" w:line="510" w:lineRule="exact"/>
+        <w:pBdr>
+          <w:bottom w:val="single" w:sz="4" w:color="CBD5E1"/>
+        </w:pBdr>
+      </w:pPr>
+      <w:r>
+        <w:rPr>
+          <w:rFonts w:ascii="Arial Unicode MS" w:hAnsi="Arial Unicode MS" w:eastAsia="Arial Unicode MS"/>
+          <w:b w:val="0"/>
+          <w:sz w:val="22"/>
+        </w:rPr>
+        <w:t xml:space="preserve">　</w:t>
+      </w:r>
+    </w:p>
+    <w:p>
+      <w:pPr>
+        <w:spacing w:after="100" w:line="312" w:lineRule="auto"/>
+      </w:pPr>
+      <w:r>
+        <w:rPr>
+          <w:rFonts w:ascii="Arial Unicode MS" w:hAnsi="Arial Unicode MS" w:eastAsia="Arial Unicode MS"/>
+          <w:b w:val="0"/>
+          <w:sz w:val="20"/>
+        </w:rPr>
+        <w:t>只備份本冊第 1–4 頁及原指定作品；學科原答可拍自用，不另上傳。</w:t>
+      </w:r>
+    </w:p>
+    <w:p>
+      <w:pPr>
+        <w:spacing w:after="100" w:line="312" w:lineRule="auto"/>
+      </w:pPr>
+      <w:r>
+        <w:rPr>
+          <w:rFonts w:ascii="Arial Unicode MS" w:hAnsi="Arial Unicode MS" w:eastAsia="Arial Unicode MS"/>
+          <w:b w:val="0"/>
+          <w:sz w:val="20"/>
+        </w:rPr>
+        <w:t>課內未完成就記卡點，不自動變必交作業；延伸不列缺件。</w:t>
       </w:r>
     </w:p>
     <w:sectPr>

</xml_diff>

<commit_message>
Revise all 18 weeks with SOIL visuals and unified student workbooks
</commit_message>
<xml_diff>
--- a/worksheets/W1.docx
+++ b/worksheets/W1.docx
@@ -3254,7 +3254,7 @@
           <w:color w:val="1D4ED8"/>
           <w:sz w:val="22"/>
         </w:rPr>
-        <w:t>95–100 分｜先確認今天留下的版本</w:t>
+        <w:t>94–100 分｜先確認今天留下的版本</w:t>
       </w:r>
     </w:p>
     <w:p>
@@ -3340,7 +3340,7 @@
           <w:b/>
           <w:sz w:val="44"/>
         </w:rPr>
-        <w:t>W1 / 05 · 學科遷移｜原題材料</w:t>
+        <w:t>W1 / 05 · 學科遷移｜可選增幅</w:t>
       </w:r>
     </w:p>
     <w:p>
@@ -3353,7 +3353,7 @@
           <w:b/>
           <w:sz w:val="22"/>
         </w:rPr>
-        <w:t>課堂必寫｜83–95 分。原題在本頁，自己的解題留第 6 頁。</w:t>
+        <w:t>有餘裕或課餘選做；可留白，不計分、不追交、不列缺件。</w:t>
       </w:r>
     </w:p>
     <w:p>
@@ -3472,7 +3472,7 @@
           <w:b/>
           <w:sz w:val="22"/>
         </w:rPr>
-        <w:t>課堂必寫｜保留初答，學科練習不計分、不另上傳。</w:t>
+        <w:t>可選增幅｜可留白，隨整本保存，不另上傳。</w:t>
       </w:r>
     </w:p>
     <w:p>
@@ -3575,7 +3575,7 @@
           <w:b/>
           <w:sz w:val="30"/>
         </w:rPr>
-        <w:t>02｜提示與搭檔實際回應</w:t>
+        <w:t>02｜提示／自己回查／真實搭檔回應</w:t>
       </w:r>
     </w:p>
     <w:p>
@@ -3588,7 +3588,7 @@
           <w:b w:val="0"/>
           <w:sz w:val="22"/>
         </w:rPr>
-        <w:t>提示 □未用 □1 □2 □3　搭檔座號＿＿＿</w:t>
+        <w:t>提示 □未用 □1 □2 □3　搭檔座號＿＿＿（自己練就記回查發現，不填假回報）</w:t>
       </w:r>
     </w:p>
     <w:p>
@@ -3621,6 +3621,19 @@
           <w:sz w:val="22"/>
         </w:rPr>
         <w:t xml:space="preserve">　</w:t>
+      </w:r>
+    </w:p>
+    <w:p>
+      <w:pPr>
+        <w:spacing w:after="100" w:line="312" w:lineRule="auto"/>
+      </w:pPr>
+      <w:r>
+        <w:rPr>
+          <w:rFonts w:ascii="Arial Unicode MS" w:hAnsi="Arial Unicode MS" w:eastAsia="Arial Unicode MS"/>
+          <w:b w:val="0"/>
+          <w:sz w:val="22"/>
+        </w:rPr>
+        <w:t>自己練：回原材料與提示比對一處，留下發現。</w:t>
       </w:r>
     </w:p>
     <w:p>
@@ -3765,7 +3778,7 @@
           <w:b w:val="0"/>
           <w:sz w:val="20"/>
         </w:rPr>
-        <w:t>只備份本冊第 1–4 頁及原指定作品；學科原答可拍自用，不另上傳。</w:t>
+        <w:t>這兩頁隨整本保存、不追交；詳解在 W1 最後，可自行核對。</w:t>
       </w:r>
     </w:p>
     <w:p>

</xml_diff>

<commit_message>
Refine all weekly wording and visuals; introduce W2 color rules before examples
</commit_message>
<xml_diff>
--- a/worksheets/W1.docx
+++ b/worksheets/W1.docx
@@ -3340,7 +3340,7 @@
           <w:b/>
           <w:sz w:val="44"/>
         </w:rPr>
-        <w:t>W1 / 05 · 學科遷移｜可選增幅</w:t>
+        <w:t>W1 / 05 · 學科遷移｜課後選做</w:t>
       </w:r>
     </w:p>
     <w:p>
@@ -3472,7 +3472,7 @@
           <w:b/>
           <w:sz w:val="22"/>
         </w:rPr>
-        <w:t>可選增幅｜可留白，隨整本保存，不另上傳。</w:t>
+        <w:t>課後選做｜可留白，隨整本保存，不另上傳。</w:t>
       </w:r>
     </w:p>
     <w:p>

</xml_diff>